<commit_message>
Corregir prediccion ML independiente del caudal
</commit_message>
<xml_diff>
--- a/docs/memoria_proyecto_intermodular.docx
+++ b/docs/memoria_proyecto_intermodular.docx
@@ -969,7 +969,6 @@
     <w:p>
       <w:pPr>
         <w:pStyle w:val="CodeBlock"/>
-        <w:spacing w:after="120"/>
       </w:pPr>
       <w:r>
         <w:rPr>
@@ -992,7 +991,6 @@
     <w:p>
       <w:pPr>
         <w:pStyle w:val="CodeBlock"/>
-        <w:spacing w:after="120"/>
       </w:pPr>
       <w:r>
         <w:rPr>
@@ -1400,7 +1398,6 @@
     <w:p>
       <w:pPr>
         <w:pStyle w:val="CodeBlock"/>
-        <w:spacing w:after="120"/>
       </w:pPr>
       <w:r>
         <w:rPr>
@@ -1910,7 +1907,6 @@
     <w:p>
       <w:pPr>
         <w:pStyle w:val="CodeBlock"/>
-        <w:spacing w:after="120"/>
       </w:pPr>
       <w:r>
         <w:rPr>
@@ -3045,7 +3041,6 @@
     <w:p>
       <w:pPr>
         <w:pStyle w:val="CodeBlock"/>
-        <w:spacing w:after="120"/>
       </w:pPr>
       <w:r>
         <w:rPr>
@@ -3169,7 +3164,6 @@
     <w:p>
       <w:pPr>
         <w:pStyle w:val="CodeBlock"/>
-        <w:spacing w:after="120"/>
       </w:pPr>
       <w:r>
         <w:rPr>
@@ -3284,6 +3278,11 @@
     <w:p>
       <w:r>
         <w:t>El modelo utiliza como entrada variables numéricas y categóricas. Las variables categóricas se codifican internamente y las numéricas se normalizan. La salida es la lámina de riego bruto en milímetros.</w:t>
+      </w:r>
+    </w:p>
+    <w:p>
+      <w:r>
+        <w:t>Los goteros y el caudal se mantienen fuera de las variables predictoras de la lámina de riego. Su función es operativa: una vez estimados los milímetros y litros necesarios, sirven para calcular el tiempo de riego. De esta forma, cambiar el número de goteros no altera la necesidad hídrica del cultivo, sino únicamente la duración del riego.</w:t>
       </w:r>
     </w:p>
     <w:p>
@@ -6276,7 +6275,7 @@
     </w:p>
     <w:p>
       <w:r>
-        <w:t>El modelo Keras se entrenó con un dataset de 168 filas y 27 variables de entrada. La validación interna obtuvo:</w:t>
+        <w:t>El modelo Keras se entrenó con un dataset de 168 filas y 24 variables de entrada. La validación interna obtuvo:</w:t>
       </w:r>
     </w:p>
     <w:tbl>
@@ -6411,7 +6410,7 @@
               <w:rPr>
                 <w:sz w:val="18"/>
               </w:rPr>
-              <w:t>0,0358 mm</w:t>
+              <w:t>0,0381 mm</w:t>
             </w:r>
           </w:p>
         </w:tc>
@@ -6451,7 +6450,7 @@
               <w:rPr>
                 <w:sz w:val="18"/>
               </w:rPr>
-              <w:t>0,9978</w:t>
+              <w:t>0,9975</w:t>
             </w:r>
           </w:p>
         </w:tc>
@@ -6914,7 +6913,6 @@
     <w:p>
       <w:pPr>
         <w:pStyle w:val="CodeBlock"/>
-        <w:spacing w:after="120"/>
       </w:pPr>
       <w:r>
         <w:rPr>
@@ -8082,7 +8080,6 @@
     <w:p>
       <w:pPr>
         <w:pStyle w:val="CodeBlock"/>
-        <w:spacing w:after="120"/>
       </w:pPr>
       <w:r>
         <w:rPr>
@@ -8100,7 +8097,6 @@
     <w:p>
       <w:pPr>
         <w:pStyle w:val="CodeBlock"/>
-        <w:spacing w:after="120"/>
       </w:pPr>
       <w:r>
         <w:rPr>
@@ -8118,7 +8114,6 @@
     <w:p>
       <w:pPr>
         <w:pStyle w:val="CodeBlock"/>
-        <w:spacing w:after="120"/>
       </w:pPr>
       <w:r>
         <w:rPr>
@@ -8136,7 +8131,6 @@
     <w:p>
       <w:pPr>
         <w:pStyle w:val="CodeBlock"/>
-        <w:spacing w:after="120"/>
       </w:pPr>
       <w:r>
         <w:rPr>
@@ -8162,7 +8156,6 @@
     <w:p>
       <w:pPr>
         <w:pStyle w:val="CodeBlock"/>
-        <w:spacing w:after="120"/>
       </w:pPr>
       <w:r>
         <w:rPr>

</xml_diff>

<commit_message>
Reforzar memoria academica del proyecto
</commit_message>
<xml_diff>
--- a/docs/memoria_proyecto_intermodular.docx
+++ b/docs/memoria_proyecto_intermodular.docx
@@ -1457,6 +1457,60 @@
     <w:p/>
     <w:p>
       <w:pPr>
+        <w:pStyle w:val="Heading2"/>
+      </w:pPr>
+      <w:r>
+        <w:t>2.10 Ética, datos y uso responsable de IA</w:t>
+      </w:r>
+    </w:p>
+    <w:p/>
+    <w:p>
+      <w:r>
+        <w:t>El uso de IA en un sistema de recomendación agrícola debe tratarse como una herramienta de apoyo a la decisión, no como una autoridad absoluta. Las recomendaciones internacionales sobre ética de la IA destacan la necesidad de transparencia, supervisión humana, prevención de daños y responsabilidad en el uso de los datos [10]. En la Unión Europea, el Reglamento (UE) 2024/1689 establece un marco orientado a promover sistemas de IA fiables y centrados en la persona, con atención a la seguridad, los derechos fundamentales y la trazabilidad [11].</w:t>
+      </w:r>
+    </w:p>
+    <w:p/>
+    <w:p>
+      <w:r>
+        <w:t>Aplicado a este proyecto, esto implica cuatro criterios:</w:t>
+      </w:r>
+    </w:p>
+    <w:p/>
+    <w:p>
+      <w:pPr>
+        <w:pStyle w:val="ListBullet"/>
+      </w:pPr>
+      <w:r>
+        <w:t>Explicar de forma clara cómo se calcula la recomendación de riego.</w:t>
+      </w:r>
+    </w:p>
+    <w:p>
+      <w:pPr>
+        <w:pStyle w:val="ListBullet"/>
+      </w:pPr>
+      <w:r>
+        <w:t>No presentar la predicción ML como verdad de campo si no está calibrada con sensores reales.</w:t>
+      </w:r>
+    </w:p>
+    <w:p>
+      <w:pPr>
+        <w:pStyle w:val="ListBullet"/>
+      </w:pPr>
+      <w:r>
+        <w:t>No publicar claves API ni datos privados de parcelas o usuarios.</w:t>
+      </w:r>
+    </w:p>
+    <w:p>
+      <w:pPr>
+        <w:pStyle w:val="ListBullet"/>
+      </w:pPr>
+      <w:r>
+        <w:t>Mantener intervención humana en la decisión final de riego.</w:t>
+      </w:r>
+    </w:p>
+    <w:p/>
+    <w:p>
+      <w:pPr>
         <w:pStyle w:val="Heading1"/>
       </w:pPr>
       <w:r>
@@ -2285,11 +2339,1269 @@
     </w:p>
     <w:p/>
     <w:p>
+      <w:r>
+        <w:t>El dataset utilizado en el prototipo puede considerarse semisintético: los datos meteorológicos proceden de AEMET, pero la etiqueta `riego_bruto_mm` se genera mediante el cálculo agronómico implementado. Esta decisión permite entrenar y validar la capa ML de forma reproducible. La limitación es que el modelo aprende a aproximar el motor agronómico, no una respuesta medida directamente en campo.</w:t>
+      </w:r>
+    </w:p>
+    <w:p/>
+    <w:p>
       <w:pPr>
         <w:pStyle w:val="Heading2"/>
       </w:pPr>
       <w:r>
-        <w:t>3.8 Cronograma</w:t>
+        <w:t>3.8 Trazabilidad entre objetivos, metodología y validación</w:t>
+      </w:r>
+    </w:p>
+    <w:p/>
+    <w:p>
+      <w:r>
+        <w:t>Para mantener coherencia entre lo planteado en la introducción y lo entregado en resultados, cada objetivo específico se vincula con una herramienta, un desarrollo y una forma de validación.</w:t>
+      </w:r>
+    </w:p>
+    <w:p/>
+    <w:tbl>
+      <w:tblPr>
+        <w:tblStyle w:val="TableGrid"/>
+        <w:tblW w:type="auto" w:w="0"/>
+        <w:tblLook w:firstColumn="1" w:firstRow="1" w:lastColumn="0" w:lastRow="0" w:noHBand="0" w:noVBand="1" w:val="04A0"/>
+      </w:tblPr>
+      <w:tblGrid>
+        <w:gridCol w:w="1728"/>
+        <w:gridCol w:w="1728"/>
+        <w:gridCol w:w="1728"/>
+        <w:gridCol w:w="1728"/>
+        <w:gridCol w:w="1728"/>
+      </w:tblGrid>
+      <w:tr>
+        <w:tc>
+          <w:tcPr>
+            <w:tcW w:type="dxa" w:w="1728"/>
+          </w:tcPr>
+          <w:p>
+            <w:r>
+              <w:rPr>
+                <w:b/>
+              </w:rPr>
+              <w:t>Escalón</w:t>
+            </w:r>
+          </w:p>
+        </w:tc>
+        <w:tc>
+          <w:tcPr>
+            <w:tcW w:type="dxa" w:w="1728"/>
+          </w:tcPr>
+          <w:p>
+            <w:r>
+              <w:rPr>
+                <w:b/>
+              </w:rPr>
+              <w:t>Objetivo específico</w:t>
+            </w:r>
+          </w:p>
+        </w:tc>
+        <w:tc>
+          <w:tcPr>
+            <w:tcW w:type="dxa" w:w="1728"/>
+          </w:tcPr>
+          <w:p>
+            <w:r>
+              <w:rPr>
+                <w:b/>
+              </w:rPr>
+              <w:t>Herramientas/datos</w:t>
+            </w:r>
+          </w:p>
+        </w:tc>
+        <w:tc>
+          <w:tcPr>
+            <w:tcW w:type="dxa" w:w="1728"/>
+          </w:tcPr>
+          <w:p>
+            <w:r>
+              <w:rPr>
+                <w:b/>
+              </w:rPr>
+              <w:t>Desarrollo realizado</w:t>
+            </w:r>
+          </w:p>
+        </w:tc>
+        <w:tc>
+          <w:tcPr>
+            <w:tcW w:type="dxa" w:w="1728"/>
+          </w:tcPr>
+          <w:p>
+            <w:r>
+              <w:rPr>
+                <w:b/>
+              </w:rPr>
+              <w:t>Validación</w:t>
+            </w:r>
+          </w:p>
+        </w:tc>
+      </w:tr>
+      <w:tr>
+        <w:tc>
+          <w:tcPr>
+            <w:tcW w:type="dxa" w:w="1728"/>
+          </w:tcPr>
+          <w:p>
+            <w:r>
+              <w:t>1</w:t>
+            </w:r>
+          </w:p>
+        </w:tc>
+        <w:tc>
+          <w:tcPr>
+            <w:tcW w:type="dxa" w:w="1728"/>
+          </w:tcPr>
+          <w:p>
+            <w:r>
+              <w:t>Diseñar captación de datos climáticos y agronómicos.</w:t>
+            </w:r>
+          </w:p>
+        </w:tc>
+        <w:tc>
+          <w:tcPr>
+            <w:tcW w:type="dxa" w:w="1728"/>
+          </w:tcPr>
+          <w:p>
+            <w:r>
+              <w:t>Variables AEMET, suelo, cultivo y parcela.</w:t>
+            </w:r>
+          </w:p>
+        </w:tc>
+        <w:tc>
+          <w:tcPr>
+            <w:tcW w:type="dxa" w:w="1728"/>
+          </w:tcPr>
+          <w:p>
+            <w:r>
+              <w:t>Definición de modelos de datos y perfiles de cultivo.</w:t>
+            </w:r>
+          </w:p>
+        </w:tc>
+        <w:tc>
+          <w:tcPr>
+            <w:tcW w:type="dxa" w:w="1728"/>
+          </w:tcPr>
+          <w:p>
+            <w:r>
+              <w:t>Pruebas de perfiles y revisión de variables del dataset.</w:t>
+            </w:r>
+          </w:p>
+        </w:tc>
+      </w:tr>
+      <w:tr>
+        <w:tc>
+          <w:tcPr>
+            <w:tcW w:type="dxa" w:w="1728"/>
+          </w:tcPr>
+          <w:p>
+            <w:r>
+              <w:t>2</w:t>
+            </w:r>
+          </w:p>
+        </w:tc>
+        <w:tc>
+          <w:tcPr>
+            <w:tcW w:type="dxa" w:w="1728"/>
+          </w:tcPr>
+          <w:p>
+            <w:r>
+              <w:t>Conectar con AEMET.</w:t>
+            </w:r>
+          </w:p>
+        </w:tc>
+        <w:tc>
+          <w:tcPr>
+            <w:tcW w:type="dxa" w:w="1728"/>
+          </w:tcPr>
+          <w:p>
+            <w:r>
+              <w:t>AEMET OpenData y cache local SQLite.</w:t>
+            </w:r>
+          </w:p>
+        </w:tc>
+        <w:tc>
+          <w:tcPr>
+            <w:tcW w:type="dxa" w:w="1728"/>
+          </w:tcPr>
+          <w:p>
+            <w:r>
+              <w:t>Cliente API, selector nacional de estaciones y ETL.</w:t>
+            </w:r>
+          </w:p>
+        </w:tc>
+        <w:tc>
+          <w:tcPr>
+            <w:tcW w:type="dxa" w:w="1728"/>
+          </w:tcPr>
+          <w:p>
+            <w:r>
+              <w:t>Descarga por estación/fecha y pruebas con cache.</w:t>
+            </w:r>
+          </w:p>
+        </w:tc>
+      </w:tr>
+      <w:tr>
+        <w:tc>
+          <w:tcPr>
+            <w:tcW w:type="dxa" w:w="1728"/>
+          </w:tcPr>
+          <w:p>
+            <w:r>
+              <w:t>3</w:t>
+            </w:r>
+          </w:p>
+        </w:tc>
+        <w:tc>
+          <w:tcPr>
+            <w:tcW w:type="dxa" w:w="1728"/>
+          </w:tcPr>
+          <w:p>
+            <w:r>
+              <w:t>Implementar cálculo de riego.</w:t>
+            </w:r>
+          </w:p>
+        </w:tc>
+        <w:tc>
+          <w:tcPr>
+            <w:tcW w:type="dxa" w:w="1728"/>
+          </w:tcPr>
+          <w:p>
+            <w:r>
+              <w:t>ET0, Kc, lluvia efectiva, eficiencia y superficie.</w:t>
+            </w:r>
+          </w:p>
+        </w:tc>
+        <w:tc>
+          <w:tcPr>
+            <w:tcW w:type="dxa" w:w="1728"/>
+          </w:tcPr>
+          <w:p>
+            <w:r>
+              <w:t>Motor agronómico en Python.</w:t>
+            </w:r>
+          </w:p>
+        </w:tc>
+        <w:tc>
+          <w:tcPr>
+            <w:tcW w:type="dxa" w:w="1728"/>
+          </w:tcPr>
+          <w:p>
+            <w:r>
+              <w:t>Pruebas unitarias de riego, lluvia y primer riego.</w:t>
+            </w:r>
+          </w:p>
+        </w:tc>
+      </w:tr>
+      <w:tr>
+        <w:tc>
+          <w:tcPr>
+            <w:tcW w:type="dxa" w:w="1728"/>
+          </w:tcPr>
+          <w:p>
+            <w:r>
+              <w:t>4</w:t>
+            </w:r>
+          </w:p>
+        </w:tc>
+        <w:tc>
+          <w:tcPr>
+            <w:tcW w:type="dxa" w:w="1728"/>
+          </w:tcPr>
+          <w:p>
+            <w:r>
+              <w:t>Comparar cultivos.</w:t>
+            </w:r>
+          </w:p>
+        </w:tc>
+        <w:tc>
+          <w:tcPr>
+            <w:tcW w:type="dxa" w:w="1728"/>
+          </w:tcPr>
+          <w:p>
+            <w:r>
+              <w:t>Olivar, cítricos y almendro.</w:t>
+            </w:r>
+          </w:p>
+        </w:tc>
+        <w:tc>
+          <w:tcPr>
+            <w:tcW w:type="dxa" w:w="1728"/>
+          </w:tcPr>
+          <w:p>
+            <w:r>
+              <w:t>Comparativa diaria y resumen por cultivo.</w:t>
+            </w:r>
+          </w:p>
+        </w:tc>
+        <w:tc>
+          <w:tcPr>
+            <w:tcW w:type="dxa" w:w="1728"/>
+          </w:tcPr>
+          <w:p>
+            <w:r>
+              <w:t>Ranking de demanda y exportación CSV/JSON/Markdown.</w:t>
+            </w:r>
+          </w:p>
+        </w:tc>
+      </w:tr>
+      <w:tr>
+        <w:tc>
+          <w:tcPr>
+            <w:tcW w:type="dxa" w:w="1728"/>
+          </w:tcPr>
+          <w:p>
+            <w:r>
+              <w:t>5</w:t>
+            </w:r>
+          </w:p>
+        </w:tc>
+        <w:tc>
+          <w:tcPr>
+            <w:tcW w:type="dxa" w:w="1728"/>
+          </w:tcPr>
+          <w:p>
+            <w:r>
+              <w:t>Crear capa ML.</w:t>
+            </w:r>
+          </w:p>
+        </w:tc>
+        <w:tc>
+          <w:tcPr>
+            <w:tcW w:type="dxa" w:w="1728"/>
+          </w:tcPr>
+          <w:p>
+            <w:r>
+              <w:t>Dataset AEMET + variables de cultivo/parcela.</w:t>
+            </w:r>
+          </w:p>
+        </w:tc>
+        <w:tc>
+          <w:tcPr>
+            <w:tcW w:type="dxa" w:w="1728"/>
+          </w:tcPr>
+          <w:p>
+            <w:r>
+              <w:t>Modelo Keras y alternativa lineal.</w:t>
+            </w:r>
+          </w:p>
+        </w:tc>
+        <w:tc>
+          <w:tcPr>
+            <w:tcW w:type="dxa" w:w="1728"/>
+          </w:tcPr>
+          <w:p>
+            <w:r>
+              <w:t>Métricas MAE, RMSE y R2.</w:t>
+            </w:r>
+          </w:p>
+        </w:tc>
+      </w:tr>
+      <w:tr>
+        <w:tc>
+          <w:tcPr>
+            <w:tcW w:type="dxa" w:w="1728"/>
+          </w:tcPr>
+          <w:p>
+            <w:r>
+              <w:t>6</w:t>
+            </w:r>
+          </w:p>
+        </w:tc>
+        <w:tc>
+          <w:tcPr>
+            <w:tcW w:type="dxa" w:w="1728"/>
+          </w:tcPr>
+          <w:p>
+            <w:r>
+              <w:t>Crear interfaz.</w:t>
+            </w:r>
+          </w:p>
+        </w:tc>
+        <w:tc>
+          <w:tcPr>
+            <w:tcW w:type="dxa" w:w="1728"/>
+          </w:tcPr>
+          <w:p>
+            <w:r>
+              <w:t>Streamlit.</w:t>
+            </w:r>
+          </w:p>
+        </w:tc>
+        <w:tc>
+          <w:tcPr>
+            <w:tcW w:type="dxa" w:w="1728"/>
+          </w:tcPr>
+          <w:p>
+            <w:r>
+              <w:t>Formulario de cliente y visualización de resultados.</w:t>
+            </w:r>
+          </w:p>
+        </w:tc>
+        <w:tc>
+          <w:tcPr>
+            <w:tcW w:type="dxa" w:w="1728"/>
+          </w:tcPr>
+          <w:p>
+            <w:r>
+              <w:t>Prueba funcional en navegador local.</w:t>
+            </w:r>
+          </w:p>
+        </w:tc>
+      </w:tr>
+      <w:tr>
+        <w:tc>
+          <w:tcPr>
+            <w:tcW w:type="dxa" w:w="1728"/>
+          </w:tcPr>
+          <w:p>
+            <w:r>
+              <w:t>7</w:t>
+            </w:r>
+          </w:p>
+        </w:tc>
+        <w:tc>
+          <w:tcPr>
+            <w:tcW w:type="dxa" w:w="1728"/>
+          </w:tcPr>
+          <w:p>
+            <w:r>
+              <w:t>Preparar Big Data.</w:t>
+            </w:r>
+          </w:p>
+        </w:tc>
+        <w:tc>
+          <w:tcPr>
+            <w:tcW w:type="dxa" w:w="1728"/>
+          </w:tcPr>
+          <w:p>
+            <w:r>
+              <w:t>Estructura compatible con BigQuery.</w:t>
+            </w:r>
+          </w:p>
+        </w:tc>
+        <w:tc>
+          <w:tcPr>
+            <w:tcW w:type="dxa" w:w="1728"/>
+          </w:tcPr>
+          <w:p>
+            <w:r>
+              <w:t>Columnas exportables y flujo ETL documentado.</w:t>
+            </w:r>
+          </w:p>
+        </w:tc>
+        <w:tc>
+          <w:tcPr>
+            <w:tcW w:type="dxa" w:w="1728"/>
+          </w:tcPr>
+          <w:p>
+            <w:r>
+              <w:t>Dataset tabular preparado para carga futura.</w:t>
+            </w:r>
+          </w:p>
+        </w:tc>
+      </w:tr>
+    </w:tbl>
+    <w:p/>
+    <w:p>
+      <w:pPr>
+        <w:pStyle w:val="Heading2"/>
+      </w:pPr>
+      <w:r>
+        <w:t>3.9 Diagrama de Gantt</w:t>
+      </w:r>
+    </w:p>
+    <w:p/>
+    <w:p>
+      <w:r>
+        <w:t>El siguiente Gantt resume la planificación por semanas. Se presenta como cronograma académico del desarrollo realizado.</w:t>
+      </w:r>
+    </w:p>
+    <w:p/>
+    <w:tbl>
+      <w:tblPr>
+        <w:tblStyle w:val="TableGrid"/>
+        <w:tblW w:type="auto" w:w="0"/>
+        <w:tblLook w:firstColumn="1" w:firstRow="1" w:lastColumn="0" w:lastRow="0" w:noHBand="0" w:noVBand="1" w:val="04A0"/>
+      </w:tblPr>
+      <w:tblGrid>
+        <w:gridCol w:w="960"/>
+        <w:gridCol w:w="960"/>
+        <w:gridCol w:w="960"/>
+        <w:gridCol w:w="960"/>
+        <w:gridCol w:w="960"/>
+        <w:gridCol w:w="960"/>
+        <w:gridCol w:w="960"/>
+        <w:gridCol w:w="960"/>
+        <w:gridCol w:w="960"/>
+      </w:tblGrid>
+      <w:tr>
+        <w:tc>
+          <w:tcPr>
+            <w:tcW w:type="dxa" w:w="960"/>
+          </w:tcPr>
+          <w:p>
+            <w:r>
+              <w:rPr>
+                <w:b/>
+              </w:rPr>
+              <w:t>Actividad</w:t>
+            </w:r>
+          </w:p>
+        </w:tc>
+        <w:tc>
+          <w:tcPr>
+            <w:tcW w:type="dxa" w:w="960"/>
+          </w:tcPr>
+          <w:p>
+            <w:r>
+              <w:rPr>
+                <w:b/>
+              </w:rPr>
+              <w:t>S1</w:t>
+            </w:r>
+          </w:p>
+        </w:tc>
+        <w:tc>
+          <w:tcPr>
+            <w:tcW w:type="dxa" w:w="960"/>
+          </w:tcPr>
+          <w:p>
+            <w:r>
+              <w:rPr>
+                <w:b/>
+              </w:rPr>
+              <w:t>S2</w:t>
+            </w:r>
+          </w:p>
+        </w:tc>
+        <w:tc>
+          <w:tcPr>
+            <w:tcW w:type="dxa" w:w="960"/>
+          </w:tcPr>
+          <w:p>
+            <w:r>
+              <w:rPr>
+                <w:b/>
+              </w:rPr>
+              <w:t>S3</w:t>
+            </w:r>
+          </w:p>
+        </w:tc>
+        <w:tc>
+          <w:tcPr>
+            <w:tcW w:type="dxa" w:w="960"/>
+          </w:tcPr>
+          <w:p>
+            <w:r>
+              <w:rPr>
+                <w:b/>
+              </w:rPr>
+              <w:t>S4</w:t>
+            </w:r>
+          </w:p>
+        </w:tc>
+        <w:tc>
+          <w:tcPr>
+            <w:tcW w:type="dxa" w:w="960"/>
+          </w:tcPr>
+          <w:p>
+            <w:r>
+              <w:rPr>
+                <w:b/>
+              </w:rPr>
+              <w:t>S5</w:t>
+            </w:r>
+          </w:p>
+        </w:tc>
+        <w:tc>
+          <w:tcPr>
+            <w:tcW w:type="dxa" w:w="960"/>
+          </w:tcPr>
+          <w:p>
+            <w:r>
+              <w:rPr>
+                <w:b/>
+              </w:rPr>
+              <w:t>S6</w:t>
+            </w:r>
+          </w:p>
+        </w:tc>
+        <w:tc>
+          <w:tcPr>
+            <w:tcW w:type="dxa" w:w="960"/>
+          </w:tcPr>
+          <w:p>
+            <w:r>
+              <w:rPr>
+                <w:b/>
+              </w:rPr>
+              <w:t>S7</w:t>
+            </w:r>
+          </w:p>
+        </w:tc>
+        <w:tc>
+          <w:tcPr>
+            <w:tcW w:type="dxa" w:w="960"/>
+          </w:tcPr>
+          <w:p>
+            <w:r>
+              <w:rPr>
+                <w:b/>
+              </w:rPr>
+              <w:t>S8</w:t>
+            </w:r>
+          </w:p>
+        </w:tc>
+      </w:tr>
+      <w:tr>
+        <w:tc>
+          <w:tcPr>
+            <w:tcW w:type="dxa" w:w="960"/>
+          </w:tcPr>
+          <w:p>
+            <w:r>
+              <w:t>Definición del problema y objetivos</w:t>
+            </w:r>
+          </w:p>
+        </w:tc>
+        <w:tc>
+          <w:tcPr>
+            <w:tcW w:type="dxa" w:w="960"/>
+          </w:tcPr>
+          <w:p>
+            <w:r>
+              <w:t>X</w:t>
+            </w:r>
+          </w:p>
+        </w:tc>
+        <w:tc>
+          <w:tcPr>
+            <w:tcW w:type="dxa" w:w="960"/>
+          </w:tcPr>
+          <w:p>
+            <w:r/>
+          </w:p>
+        </w:tc>
+        <w:tc>
+          <w:tcPr>
+            <w:tcW w:type="dxa" w:w="960"/>
+          </w:tcPr>
+          <w:p>
+            <w:r/>
+          </w:p>
+        </w:tc>
+        <w:tc>
+          <w:tcPr>
+            <w:tcW w:type="dxa" w:w="960"/>
+          </w:tcPr>
+          <w:p>
+            <w:r/>
+          </w:p>
+        </w:tc>
+        <w:tc>
+          <w:tcPr>
+            <w:tcW w:type="dxa" w:w="960"/>
+          </w:tcPr>
+          <w:p>
+            <w:r/>
+          </w:p>
+        </w:tc>
+        <w:tc>
+          <w:tcPr>
+            <w:tcW w:type="dxa" w:w="960"/>
+          </w:tcPr>
+          <w:p>
+            <w:r/>
+          </w:p>
+        </w:tc>
+        <w:tc>
+          <w:tcPr>
+            <w:tcW w:type="dxa" w:w="960"/>
+          </w:tcPr>
+          <w:p>
+            <w:r/>
+          </w:p>
+        </w:tc>
+        <w:tc>
+          <w:tcPr>
+            <w:tcW w:type="dxa" w:w="960"/>
+          </w:tcPr>
+          <w:p>
+            <w:r/>
+          </w:p>
+        </w:tc>
+      </w:tr>
+      <w:tr>
+        <w:tc>
+          <w:tcPr>
+            <w:tcW w:type="dxa" w:w="960"/>
+          </w:tcPr>
+          <w:p>
+            <w:r>
+              <w:t>Marco teórico y variables agronómicas</w:t>
+            </w:r>
+          </w:p>
+        </w:tc>
+        <w:tc>
+          <w:tcPr>
+            <w:tcW w:type="dxa" w:w="960"/>
+          </w:tcPr>
+          <w:p>
+            <w:r>
+              <w:t>X</w:t>
+            </w:r>
+          </w:p>
+        </w:tc>
+        <w:tc>
+          <w:tcPr>
+            <w:tcW w:type="dxa" w:w="960"/>
+          </w:tcPr>
+          <w:p>
+            <w:r>
+              <w:t>X</w:t>
+            </w:r>
+          </w:p>
+        </w:tc>
+        <w:tc>
+          <w:tcPr>
+            <w:tcW w:type="dxa" w:w="960"/>
+          </w:tcPr>
+          <w:p>
+            <w:r/>
+          </w:p>
+        </w:tc>
+        <w:tc>
+          <w:tcPr>
+            <w:tcW w:type="dxa" w:w="960"/>
+          </w:tcPr>
+          <w:p>
+            <w:r/>
+          </w:p>
+        </w:tc>
+        <w:tc>
+          <w:tcPr>
+            <w:tcW w:type="dxa" w:w="960"/>
+          </w:tcPr>
+          <w:p>
+            <w:r/>
+          </w:p>
+        </w:tc>
+        <w:tc>
+          <w:tcPr>
+            <w:tcW w:type="dxa" w:w="960"/>
+          </w:tcPr>
+          <w:p>
+            <w:r/>
+          </w:p>
+        </w:tc>
+        <w:tc>
+          <w:tcPr>
+            <w:tcW w:type="dxa" w:w="960"/>
+          </w:tcPr>
+          <w:p>
+            <w:r/>
+          </w:p>
+        </w:tc>
+        <w:tc>
+          <w:tcPr>
+            <w:tcW w:type="dxa" w:w="960"/>
+          </w:tcPr>
+          <w:p>
+            <w:r/>
+          </w:p>
+        </w:tc>
+      </w:tr>
+      <w:tr>
+        <w:tc>
+          <w:tcPr>
+            <w:tcW w:type="dxa" w:w="960"/>
+          </w:tcPr>
+          <w:p>
+            <w:r>
+              <w:t>Motor de cálculo de riego</w:t>
+            </w:r>
+          </w:p>
+        </w:tc>
+        <w:tc>
+          <w:tcPr>
+            <w:tcW w:type="dxa" w:w="960"/>
+          </w:tcPr>
+          <w:p>
+            <w:r/>
+          </w:p>
+        </w:tc>
+        <w:tc>
+          <w:tcPr>
+            <w:tcW w:type="dxa" w:w="960"/>
+          </w:tcPr>
+          <w:p>
+            <w:r>
+              <w:t>X</w:t>
+            </w:r>
+          </w:p>
+        </w:tc>
+        <w:tc>
+          <w:tcPr>
+            <w:tcW w:type="dxa" w:w="960"/>
+          </w:tcPr>
+          <w:p>
+            <w:r>
+              <w:t>X</w:t>
+            </w:r>
+          </w:p>
+        </w:tc>
+        <w:tc>
+          <w:tcPr>
+            <w:tcW w:type="dxa" w:w="960"/>
+          </w:tcPr>
+          <w:p>
+            <w:r/>
+          </w:p>
+        </w:tc>
+        <w:tc>
+          <w:tcPr>
+            <w:tcW w:type="dxa" w:w="960"/>
+          </w:tcPr>
+          <w:p>
+            <w:r/>
+          </w:p>
+        </w:tc>
+        <w:tc>
+          <w:tcPr>
+            <w:tcW w:type="dxa" w:w="960"/>
+          </w:tcPr>
+          <w:p>
+            <w:r/>
+          </w:p>
+        </w:tc>
+        <w:tc>
+          <w:tcPr>
+            <w:tcW w:type="dxa" w:w="960"/>
+          </w:tcPr>
+          <w:p>
+            <w:r/>
+          </w:p>
+        </w:tc>
+        <w:tc>
+          <w:tcPr>
+            <w:tcW w:type="dxa" w:w="960"/>
+          </w:tcPr>
+          <w:p>
+            <w:r/>
+          </w:p>
+        </w:tc>
+      </w:tr>
+      <w:tr>
+        <w:tc>
+          <w:tcPr>
+            <w:tcW w:type="dxa" w:w="960"/>
+          </w:tcPr>
+          <w:p>
+            <w:r>
+              <w:t>Integración AEMET y ETL</w:t>
+            </w:r>
+          </w:p>
+        </w:tc>
+        <w:tc>
+          <w:tcPr>
+            <w:tcW w:type="dxa" w:w="960"/>
+          </w:tcPr>
+          <w:p>
+            <w:r/>
+          </w:p>
+        </w:tc>
+        <w:tc>
+          <w:tcPr>
+            <w:tcW w:type="dxa" w:w="960"/>
+          </w:tcPr>
+          <w:p>
+            <w:r/>
+          </w:p>
+        </w:tc>
+        <w:tc>
+          <w:tcPr>
+            <w:tcW w:type="dxa" w:w="960"/>
+          </w:tcPr>
+          <w:p>
+            <w:r>
+              <w:t>X</w:t>
+            </w:r>
+          </w:p>
+        </w:tc>
+        <w:tc>
+          <w:tcPr>
+            <w:tcW w:type="dxa" w:w="960"/>
+          </w:tcPr>
+          <w:p>
+            <w:r>
+              <w:t>X</w:t>
+            </w:r>
+          </w:p>
+        </w:tc>
+        <w:tc>
+          <w:tcPr>
+            <w:tcW w:type="dxa" w:w="960"/>
+          </w:tcPr>
+          <w:p>
+            <w:r/>
+          </w:p>
+        </w:tc>
+        <w:tc>
+          <w:tcPr>
+            <w:tcW w:type="dxa" w:w="960"/>
+          </w:tcPr>
+          <w:p>
+            <w:r/>
+          </w:p>
+        </w:tc>
+        <w:tc>
+          <w:tcPr>
+            <w:tcW w:type="dxa" w:w="960"/>
+          </w:tcPr>
+          <w:p>
+            <w:r/>
+          </w:p>
+        </w:tc>
+        <w:tc>
+          <w:tcPr>
+            <w:tcW w:type="dxa" w:w="960"/>
+          </w:tcPr>
+          <w:p>
+            <w:r/>
+          </w:p>
+        </w:tc>
+      </w:tr>
+      <w:tr>
+        <w:tc>
+          <w:tcPr>
+            <w:tcW w:type="dxa" w:w="960"/>
+          </w:tcPr>
+          <w:p>
+            <w:r>
+              <w:t>Exportación de datasets y resumen</w:t>
+            </w:r>
+          </w:p>
+        </w:tc>
+        <w:tc>
+          <w:tcPr>
+            <w:tcW w:type="dxa" w:w="960"/>
+          </w:tcPr>
+          <w:p>
+            <w:r/>
+          </w:p>
+        </w:tc>
+        <w:tc>
+          <w:tcPr>
+            <w:tcW w:type="dxa" w:w="960"/>
+          </w:tcPr>
+          <w:p>
+            <w:r/>
+          </w:p>
+        </w:tc>
+        <w:tc>
+          <w:tcPr>
+            <w:tcW w:type="dxa" w:w="960"/>
+          </w:tcPr>
+          <w:p>
+            <w:r/>
+          </w:p>
+        </w:tc>
+        <w:tc>
+          <w:tcPr>
+            <w:tcW w:type="dxa" w:w="960"/>
+          </w:tcPr>
+          <w:p>
+            <w:r>
+              <w:t>X</w:t>
+            </w:r>
+          </w:p>
+        </w:tc>
+        <w:tc>
+          <w:tcPr>
+            <w:tcW w:type="dxa" w:w="960"/>
+          </w:tcPr>
+          <w:p>
+            <w:r>
+              <w:t>X</w:t>
+            </w:r>
+          </w:p>
+        </w:tc>
+        <w:tc>
+          <w:tcPr>
+            <w:tcW w:type="dxa" w:w="960"/>
+          </w:tcPr>
+          <w:p>
+            <w:r/>
+          </w:p>
+        </w:tc>
+        <w:tc>
+          <w:tcPr>
+            <w:tcW w:type="dxa" w:w="960"/>
+          </w:tcPr>
+          <w:p>
+            <w:r/>
+          </w:p>
+        </w:tc>
+        <w:tc>
+          <w:tcPr>
+            <w:tcW w:type="dxa" w:w="960"/>
+          </w:tcPr>
+          <w:p>
+            <w:r/>
+          </w:p>
+        </w:tc>
+      </w:tr>
+      <w:tr>
+        <w:tc>
+          <w:tcPr>
+            <w:tcW w:type="dxa" w:w="960"/>
+          </w:tcPr>
+          <w:p>
+            <w:r>
+              <w:t>Interfaz Streamlit</w:t>
+            </w:r>
+          </w:p>
+        </w:tc>
+        <w:tc>
+          <w:tcPr>
+            <w:tcW w:type="dxa" w:w="960"/>
+          </w:tcPr>
+          <w:p>
+            <w:r/>
+          </w:p>
+        </w:tc>
+        <w:tc>
+          <w:tcPr>
+            <w:tcW w:type="dxa" w:w="960"/>
+          </w:tcPr>
+          <w:p>
+            <w:r/>
+          </w:p>
+        </w:tc>
+        <w:tc>
+          <w:tcPr>
+            <w:tcW w:type="dxa" w:w="960"/>
+          </w:tcPr>
+          <w:p>
+            <w:r/>
+          </w:p>
+        </w:tc>
+        <w:tc>
+          <w:tcPr>
+            <w:tcW w:type="dxa" w:w="960"/>
+          </w:tcPr>
+          <w:p>
+            <w:r/>
+          </w:p>
+        </w:tc>
+        <w:tc>
+          <w:tcPr>
+            <w:tcW w:type="dxa" w:w="960"/>
+          </w:tcPr>
+          <w:p>
+            <w:r>
+              <w:t>X</w:t>
+            </w:r>
+          </w:p>
+        </w:tc>
+        <w:tc>
+          <w:tcPr>
+            <w:tcW w:type="dxa" w:w="960"/>
+          </w:tcPr>
+          <w:p>
+            <w:r>
+              <w:t>X</w:t>
+            </w:r>
+          </w:p>
+        </w:tc>
+        <w:tc>
+          <w:tcPr>
+            <w:tcW w:type="dxa" w:w="960"/>
+          </w:tcPr>
+          <w:p>
+            <w:r/>
+          </w:p>
+        </w:tc>
+        <w:tc>
+          <w:tcPr>
+            <w:tcW w:type="dxa" w:w="960"/>
+          </w:tcPr>
+          <w:p>
+            <w:r/>
+          </w:p>
+        </w:tc>
+      </w:tr>
+      <w:tr>
+        <w:tc>
+          <w:tcPr>
+            <w:tcW w:type="dxa" w:w="960"/>
+          </w:tcPr>
+          <w:p>
+            <w:r>
+              <w:t>Modelo ML/Keras</w:t>
+            </w:r>
+          </w:p>
+        </w:tc>
+        <w:tc>
+          <w:tcPr>
+            <w:tcW w:type="dxa" w:w="960"/>
+          </w:tcPr>
+          <w:p>
+            <w:r/>
+          </w:p>
+        </w:tc>
+        <w:tc>
+          <w:tcPr>
+            <w:tcW w:type="dxa" w:w="960"/>
+          </w:tcPr>
+          <w:p>
+            <w:r/>
+          </w:p>
+        </w:tc>
+        <w:tc>
+          <w:tcPr>
+            <w:tcW w:type="dxa" w:w="960"/>
+          </w:tcPr>
+          <w:p>
+            <w:r/>
+          </w:p>
+        </w:tc>
+        <w:tc>
+          <w:tcPr>
+            <w:tcW w:type="dxa" w:w="960"/>
+          </w:tcPr>
+          <w:p>
+            <w:r/>
+          </w:p>
+        </w:tc>
+        <w:tc>
+          <w:tcPr>
+            <w:tcW w:type="dxa" w:w="960"/>
+          </w:tcPr>
+          <w:p>
+            <w:r/>
+          </w:p>
+        </w:tc>
+        <w:tc>
+          <w:tcPr>
+            <w:tcW w:type="dxa" w:w="960"/>
+          </w:tcPr>
+          <w:p>
+            <w:r>
+              <w:t>X</w:t>
+            </w:r>
+          </w:p>
+        </w:tc>
+        <w:tc>
+          <w:tcPr>
+            <w:tcW w:type="dxa" w:w="960"/>
+          </w:tcPr>
+          <w:p>
+            <w:r>
+              <w:t>X</w:t>
+            </w:r>
+          </w:p>
+        </w:tc>
+        <w:tc>
+          <w:tcPr>
+            <w:tcW w:type="dxa" w:w="960"/>
+          </w:tcPr>
+          <w:p>
+            <w:r/>
+          </w:p>
+        </w:tc>
+      </w:tr>
+      <w:tr>
+        <w:tc>
+          <w:tcPr>
+            <w:tcW w:type="dxa" w:w="960"/>
+          </w:tcPr>
+          <w:p>
+            <w:r>
+              <w:t>Pruebas, memoria y GitHub</w:t>
+            </w:r>
+          </w:p>
+        </w:tc>
+        <w:tc>
+          <w:tcPr>
+            <w:tcW w:type="dxa" w:w="960"/>
+          </w:tcPr>
+          <w:p>
+            <w:r/>
+          </w:p>
+        </w:tc>
+        <w:tc>
+          <w:tcPr>
+            <w:tcW w:type="dxa" w:w="960"/>
+          </w:tcPr>
+          <w:p>
+            <w:r/>
+          </w:p>
+        </w:tc>
+        <w:tc>
+          <w:tcPr>
+            <w:tcW w:type="dxa" w:w="960"/>
+          </w:tcPr>
+          <w:p>
+            <w:r/>
+          </w:p>
+        </w:tc>
+        <w:tc>
+          <w:tcPr>
+            <w:tcW w:type="dxa" w:w="960"/>
+          </w:tcPr>
+          <w:p>
+            <w:r/>
+          </w:p>
+        </w:tc>
+        <w:tc>
+          <w:tcPr>
+            <w:tcW w:type="dxa" w:w="960"/>
+          </w:tcPr>
+          <w:p>
+            <w:r/>
+          </w:p>
+        </w:tc>
+        <w:tc>
+          <w:tcPr>
+            <w:tcW w:type="dxa" w:w="960"/>
+          </w:tcPr>
+          <w:p>
+            <w:r/>
+          </w:p>
+        </w:tc>
+        <w:tc>
+          <w:tcPr>
+            <w:tcW w:type="dxa" w:w="960"/>
+          </w:tcPr>
+          <w:p>
+            <w:r>
+              <w:t>X</w:t>
+            </w:r>
+          </w:p>
+        </w:tc>
+        <w:tc>
+          <w:tcPr>
+            <w:tcW w:type="dxa" w:w="960"/>
+          </w:tcPr>
+          <w:p>
+            <w:r>
+              <w:t>X</w:t>
+            </w:r>
+          </w:p>
+        </w:tc>
+      </w:tr>
+    </w:tbl>
+    <w:p/>
+    <w:p>
+      <w:pPr>
+        <w:pStyle w:val="Heading2"/>
+      </w:pPr>
+      <w:r>
+        <w:t>3.10 Cronograma</w:t>
       </w:r>
     </w:p>
     <w:p/>
@@ -2608,7 +3920,44 @@
         <w:pStyle w:val="Heading2"/>
       </w:pPr>
       <w:r>
-        <w:t>3.9 Presupuesto estimado</w:t>
+        <w:t>3.11 ROI y viabilidad económica</w:t>
+      </w:r>
+    </w:p>
+    <w:p/>
+    <w:p>
+      <w:r>
+        <w:t>No se calcula un ROI monetario cerrado porque faltan datos reales de explotación: consumo histórico de riego tradicional, precio del agua, coste del servicio, coste de sensores y ahorro confirmado en campo. Para evitar estimaciones no justificadas, el proyecto deja definido el método de cálculo:</w:t>
+      </w:r>
+    </w:p>
+    <w:p/>
+    <w:p>
+      <w:r>
+        <w:rPr>
+          <w:rFonts w:ascii="Consolas" w:hAnsi="Consolas"/>
+          <w:sz w:val="18"/>
+        </w:rPr>
+        <w:t>ahorro_agua_L = riego_tradicional_L - riego_recomendado_L</w:t>
+        <w:br/>
+        <w:t>ahorro_agua_m3 = ahorro_agua_L / 1000</w:t>
+        <w:br/>
+        <w:t>ahorro_economico = ahorro_agua_m3 * precio_agua_m3</w:t>
+        <w:br/>
+        <w:t>ROI = ((ahorro_economico - coste_implantacion) / coste_implantacion) * 100</w:t>
+      </w:r>
+    </w:p>
+    <w:p/>
+    <w:p>
+      <w:r>
+        <w:t>La aplicación ya ofrece la variable necesaria para alimentar este análisis: litros recomendados por parcela, cultivo y periodo. Con datos reales de consumo previo, el ROI puede calcularse sin modificar el sistema.</w:t>
+      </w:r>
+    </w:p>
+    <w:p/>
+    <w:p>
+      <w:pPr>
+        <w:pStyle w:val="Heading2"/>
+      </w:pPr>
+      <w:r>
+        <w:t>3.12 Presupuesto estimado</w:t>
       </w:r>
     </w:p>
     <w:p/>
@@ -3057,6 +4406,52 @@
     <w:p>
       <w:r>
         <w:t>El presupuesto distingue entre el prototipo software ya desarrollado y una posible instalación IoT en campo. Las herramientas principales utilizadas son gratuitas o de código abierto.</w:t>
+      </w:r>
+    </w:p>
+    <w:p/>
+    <w:p>
+      <w:pPr>
+        <w:pStyle w:val="Heading2"/>
+      </w:pPr>
+      <w:r>
+        <w:t>3.13 Gestión ética y licencia del proyecto</w:t>
+      </w:r>
+    </w:p>
+    <w:p/>
+    <w:p>
+      <w:r>
+        <w:t>La gestión ética del proyecto se aplica en tres niveles:</w:t>
+      </w:r>
+    </w:p>
+    <w:p/>
+    <w:p>
+      <w:pPr>
+        <w:pStyle w:val="ListBullet"/>
+      </w:pPr>
+      <w:r>
+        <w:t>**Datos:** se usan datos meteorológicos oficiales y no se publican credenciales ni datos privados de clientes.</w:t>
+      </w:r>
+    </w:p>
+    <w:p>
+      <w:pPr>
+        <w:pStyle w:val="ListBullet"/>
+      </w:pPr>
+      <w:r>
+        <w:t>**Modelo ML:** se informa de que la predicción está entrenada sobre datos históricos y etiquetas agronómicas, por lo que requiere calibración antes de operar como recomendación profesional.</w:t>
+      </w:r>
+    </w:p>
+    <w:p>
+      <w:pPr>
+        <w:pStyle w:val="ListBullet"/>
+      </w:pPr>
+      <w:r>
+        <w:t>**Usuario:** la interfaz muestra resultados interpretables y mantiene la decisión final bajo supervisión humana.</w:t>
+      </w:r>
+    </w:p>
+    <w:p/>
+    <w:p>
+      <w:r>
+        <w:t>La memoria, tablas, diagramas y materiales de documentación se proponen bajo licencia Creative Commons Reconocimiento-NoComercial-CompartirIgual 4.0 Internacional (CC BY-NC-SA 4.0) [12]. El código fuente queda vinculado al repositorio académico y, si se libera como software reutilizable, deberá acompañarse de una licencia de software específica.</w:t>
       </w:r>
     </w:p>
     <w:p/>
@@ -4037,7 +5432,7 @@
     <w:p/>
     <w:p>
       <w:r>
-        <w:t>El modelo Keras se entrenó con un dataset de 168 filas y 24 variables de entrada. La validación interna obtuvo:</w:t>
+        <w:t>El modelo Keras se entrenó con un dataset de 168 filas y variables climáticas/agronómicas codificadas. La validación interna obtuvo:</w:t>
       </w:r>
     </w:p>
     <w:p/>
@@ -4399,7 +5794,7 @@
           <w:rFonts w:ascii="Consolas" w:hAnsi="Consolas"/>
           <w:sz w:val="18"/>
         </w:rPr>
-        <w:t>Ran 21 tests</w:t>
+        <w:t>Ran 26 tests</w:t>
         <w:br/>
         <w:t>OK</w:t>
       </w:r>
@@ -4687,14 +6082,28 @@
         <w:tblLook w:firstColumn="1" w:firstRow="1" w:lastColumn="0" w:lastRow="0" w:noHBand="0" w:noVBand="1" w:val="04A0"/>
       </w:tblPr>
       <w:tblGrid>
-        <w:gridCol w:w="2880"/>
-        <w:gridCol w:w="2880"/>
-        <w:gridCol w:w="2880"/>
+        <w:gridCol w:w="2160"/>
+        <w:gridCol w:w="2160"/>
+        <w:gridCol w:w="2160"/>
+        <w:gridCol w:w="2160"/>
       </w:tblGrid>
       <w:tr>
         <w:tc>
           <w:tcPr>
-            <w:tcW w:type="dxa" w:w="2880"/>
+            <w:tcW w:type="dxa" w:w="2160"/>
+          </w:tcPr>
+          <w:p>
+            <w:r>
+              <w:rPr>
+                <w:b/>
+              </w:rPr>
+              <w:t>Escalón</w:t>
+            </w:r>
+          </w:p>
+        </w:tc>
+        <w:tc>
+          <w:tcPr>
+            <w:tcW w:type="dxa" w:w="2160"/>
           </w:tcPr>
           <w:p>
             <w:r>
@@ -4707,7 +6116,7 @@
         </w:tc>
         <w:tc>
           <w:tcPr>
-            <w:tcW w:type="dxa" w:w="2880"/>
+            <w:tcW w:type="dxa" w:w="2160"/>
           </w:tcPr>
           <w:p>
             <w:r>
@@ -4720,7 +6129,7 @@
         </w:tc>
         <w:tc>
           <w:tcPr>
-            <w:tcW w:type="dxa" w:w="2880"/>
+            <w:tcW w:type="dxa" w:w="2160"/>
           </w:tcPr>
           <w:p>
             <w:r>
@@ -4735,31 +6144,41 @@
       <w:tr>
         <w:tc>
           <w:tcPr>
-            <w:tcW w:type="dxa" w:w="2880"/>
-          </w:tcPr>
-          <w:p>
-            <w:r>
-              <w:t>Diseñar red de sensores IoT</w:t>
-            </w:r>
-          </w:p>
-        </w:tc>
-        <w:tc>
-          <w:tcPr>
-            <w:tcW w:type="dxa" w:w="2880"/>
-          </w:tcPr>
-          <w:p>
-            <w:r>
-              <w:t>Parcial</w:t>
-            </w:r>
-          </w:p>
-        </w:tc>
-        <w:tc>
-          <w:tcPr>
-            <w:tcW w:type="dxa" w:w="2880"/>
-          </w:tcPr>
-          <w:p>
-            <w:r>
-              <w:t>Variables edáficas y fisiológicas definidas; sensores pendientes de instalación real.</w:t>
+            <w:tcW w:type="dxa" w:w="2160"/>
+          </w:tcPr>
+          <w:p>
+            <w:r>
+              <w:t>1</w:t>
+            </w:r>
+          </w:p>
+        </w:tc>
+        <w:tc>
+          <w:tcPr>
+            <w:tcW w:type="dxa" w:w="2160"/>
+          </w:tcPr>
+          <w:p>
+            <w:r>
+              <w:t>Diseñar captación de datos climáticos y agronómicos.</w:t>
+            </w:r>
+          </w:p>
+        </w:tc>
+        <w:tc>
+          <w:tcPr>
+            <w:tcW w:type="dxa" w:w="2160"/>
+          </w:tcPr>
+          <w:p>
+            <w:r>
+              <w:t>Cumplido en prototipo</w:t>
+            </w:r>
+          </w:p>
+        </w:tc>
+        <w:tc>
+          <w:tcPr>
+            <w:tcW w:type="dxa" w:w="2160"/>
+          </w:tcPr>
+          <w:p>
+            <w:r>
+              <w:t>Variables AEMET, suelo, cultivo y parcela definidas.</w:t>
             </w:r>
           </w:p>
         </w:tc>
@@ -4767,31 +6186,41 @@
       <w:tr>
         <w:tc>
           <w:tcPr>
-            <w:tcW w:type="dxa" w:w="2880"/>
-          </w:tcPr>
-          <w:p>
-            <w:r>
-              <w:t>Configurar BigQuery</w:t>
-            </w:r>
-          </w:p>
-        </w:tc>
-        <w:tc>
-          <w:tcPr>
-            <w:tcW w:type="dxa" w:w="2880"/>
-          </w:tcPr>
-          <w:p>
-            <w:r>
-              <w:t>Parcial</w:t>
-            </w:r>
-          </w:p>
-        </w:tc>
-        <w:tc>
-          <w:tcPr>
-            <w:tcW w:type="dxa" w:w="2880"/>
-          </w:tcPr>
-          <w:p>
-            <w:r>
-              <w:t>Estructura de dataset preparada; ingesta cloud pendiente.</w:t>
+            <w:tcW w:type="dxa" w:w="2160"/>
+          </w:tcPr>
+          <w:p>
+            <w:r>
+              <w:t>2</w:t>
+            </w:r>
+          </w:p>
+        </w:tc>
+        <w:tc>
+          <w:tcPr>
+            <w:tcW w:type="dxa" w:w="2160"/>
+          </w:tcPr>
+          <w:p>
+            <w:r>
+              <w:t>Conectar el sistema con AEMET.</w:t>
+            </w:r>
+          </w:p>
+        </w:tc>
+        <w:tc>
+          <w:tcPr>
+            <w:tcW w:type="dxa" w:w="2160"/>
+          </w:tcPr>
+          <w:p>
+            <w:r>
+              <w:t>Cumplido</w:t>
+            </w:r>
+          </w:p>
+        </w:tc>
+        <w:tc>
+          <w:tcPr>
+            <w:tcW w:type="dxa" w:w="2160"/>
+          </w:tcPr>
+          <w:p>
+            <w:r>
+              <w:t>Cliente AEMET, inventario nacional, cache local y datos diarios por estación.</w:t>
             </w:r>
           </w:p>
         </w:tc>
@@ -4799,31 +6228,41 @@
       <w:tr>
         <w:tc>
           <w:tcPr>
-            <w:tcW w:type="dxa" w:w="2880"/>
-          </w:tcPr>
-          <w:p>
-            <w:r>
-              <w:t>Entrenar modelo ML &gt;85 %</w:t>
-            </w:r>
-          </w:p>
-        </w:tc>
-        <w:tc>
-          <w:tcPr>
-            <w:tcW w:type="dxa" w:w="2880"/>
-          </w:tcPr>
-          <w:p>
-            <w:r>
-              <w:t>Cumplido en prototipo</w:t>
-            </w:r>
-          </w:p>
-        </w:tc>
-        <w:tc>
-          <w:tcPr>
-            <w:tcW w:type="dxa" w:w="2880"/>
-          </w:tcPr>
-          <w:p>
-            <w:r>
-              <w:t>Keras con R2 = 0,9978 sobre validación interna.</w:t>
+            <w:tcW w:type="dxa" w:w="2160"/>
+          </w:tcPr>
+          <w:p>
+            <w:r>
+              <w:t>3</w:t>
+            </w:r>
+          </w:p>
+        </w:tc>
+        <w:tc>
+          <w:tcPr>
+            <w:tcW w:type="dxa" w:w="2160"/>
+          </w:tcPr>
+          <w:p>
+            <w:r>
+              <w:t>Implementar cálculo agronómico de riego.</w:t>
+            </w:r>
+          </w:p>
+        </w:tc>
+        <w:tc>
+          <w:tcPr>
+            <w:tcW w:type="dxa" w:w="2160"/>
+          </w:tcPr>
+          <w:p>
+            <w:r>
+              <w:t>Cumplido</w:t>
+            </w:r>
+          </w:p>
+        </w:tc>
+        <w:tc>
+          <w:tcPr>
+            <w:tcW w:type="dxa" w:w="2160"/>
+          </w:tcPr>
+          <w:p>
+            <w:r>
+              <w:t>Motor de cálculo con ETc, lluvia efectiva, riego bruto y litros.</w:t>
             </w:r>
           </w:p>
         </w:tc>
@@ -4831,17 +6270,27 @@
       <w:tr>
         <w:tc>
           <w:tcPr>
-            <w:tcW w:type="dxa" w:w="2880"/>
-          </w:tcPr>
-          <w:p>
-            <w:r>
-              <w:t>Crear dashboard interactivo</w:t>
-            </w:r>
-          </w:p>
-        </w:tc>
-        <w:tc>
-          <w:tcPr>
-            <w:tcW w:type="dxa" w:w="2880"/>
+            <w:tcW w:type="dxa" w:w="2160"/>
+          </w:tcPr>
+          <w:p>
+            <w:r>
+              <w:t>4</w:t>
+            </w:r>
+          </w:p>
+        </w:tc>
+        <w:tc>
+          <w:tcPr>
+            <w:tcW w:type="dxa" w:w="2160"/>
+          </w:tcPr>
+          <w:p>
+            <w:r>
+              <w:t>Incorporar cultivos configurables.</w:t>
+            </w:r>
+          </w:p>
+        </w:tc>
+        <w:tc>
+          <w:tcPr>
+            <w:tcW w:type="dxa" w:w="2160"/>
           </w:tcPr>
           <w:p>
             <w:r>
@@ -4851,11 +6300,11 @@
         </w:tc>
         <w:tc>
           <w:tcPr>
-            <w:tcW w:type="dxa" w:w="2880"/>
-          </w:tcPr>
-          <w:p>
-            <w:r>
-              <w:t>Interfaz Streamlit con estación, cultivo, suelo, parcela y ML.</w:t>
+            <w:tcW w:type="dxa" w:w="2160"/>
+          </w:tcPr>
+          <w:p>
+            <w:r>
+              <w:t>Olivar, cítricos y almendro con Kc, raíz, marco y agotamiento propios.</w:t>
             </w:r>
           </w:p>
         </w:tc>
@@ -4863,31 +6312,41 @@
       <w:tr>
         <w:tc>
           <w:tcPr>
-            <w:tcW w:type="dxa" w:w="2880"/>
-          </w:tcPr>
-          <w:p>
-            <w:r>
-              <w:t>Usar AEMET real</w:t>
-            </w:r>
-          </w:p>
-        </w:tc>
-        <w:tc>
-          <w:tcPr>
-            <w:tcW w:type="dxa" w:w="2880"/>
-          </w:tcPr>
-          <w:p>
-            <w:r>
-              <w:t>Cumplido</w:t>
-            </w:r>
-          </w:p>
-        </w:tc>
-        <w:tc>
-          <w:tcPr>
-            <w:tcW w:type="dxa" w:w="2880"/>
-          </w:tcPr>
-          <w:p>
-            <w:r>
-              <w:t>Cliente AEMET, inventario nacional y datos diarios por estación.</w:t>
+            <w:tcW w:type="dxa" w:w="2160"/>
+          </w:tcPr>
+          <w:p>
+            <w:r>
+              <w:t>5</w:t>
+            </w:r>
+          </w:p>
+        </w:tc>
+        <w:tc>
+          <w:tcPr>
+            <w:tcW w:type="dxa" w:w="2160"/>
+          </w:tcPr>
+          <w:p>
+            <w:r>
+              <w:t>Crear capa predictiva ML.</w:t>
+            </w:r>
+          </w:p>
+        </w:tc>
+        <w:tc>
+          <w:tcPr>
+            <w:tcW w:type="dxa" w:w="2160"/>
+          </w:tcPr>
+          <w:p>
+            <w:r>
+              <w:t>Cumplido en prototipo</w:t>
+            </w:r>
+          </w:p>
+        </w:tc>
+        <w:tc>
+          <w:tcPr>
+            <w:tcW w:type="dxa" w:w="2160"/>
+          </w:tcPr>
+          <w:p>
+            <w:r>
+              <w:t>Modelo Keras/TensorFlow con R2 superior a 0,85 sobre validación interna.</w:t>
             </w:r>
           </w:p>
         </w:tc>
@@ -4895,17 +6354,27 @@
       <w:tr>
         <w:tc>
           <w:tcPr>
-            <w:tcW w:type="dxa" w:w="2880"/>
-          </w:tcPr>
-          <w:p>
-            <w:r>
-              <w:t>Comparar cultivos</w:t>
-            </w:r>
-          </w:p>
-        </w:tc>
-        <w:tc>
-          <w:tcPr>
-            <w:tcW w:type="dxa" w:w="2880"/>
+            <w:tcW w:type="dxa" w:w="2160"/>
+          </w:tcPr>
+          <w:p>
+            <w:r>
+              <w:t>6</w:t>
+            </w:r>
+          </w:p>
+        </w:tc>
+        <w:tc>
+          <w:tcPr>
+            <w:tcW w:type="dxa" w:w="2160"/>
+          </w:tcPr>
+          <w:p>
+            <w:r>
+              <w:t>Desarrollar interfaz de usuario.</w:t>
+            </w:r>
+          </w:p>
+        </w:tc>
+        <w:tc>
+          <w:tcPr>
+            <w:tcW w:type="dxa" w:w="2160"/>
           </w:tcPr>
           <w:p>
             <w:r>
@@ -4915,11 +6384,53 @@
         </w:tc>
         <w:tc>
           <w:tcPr>
-            <w:tcW w:type="dxa" w:w="2880"/>
-          </w:tcPr>
-          <w:p>
-            <w:r>
-              <w:t>Olivar, cítricos y almendro con variables propias.</w:t>
+            <w:tcW w:type="dxa" w:w="2160"/>
+          </w:tcPr>
+          <w:p>
+            <w:r>
+              <w:t>App Streamlit con estación, cultivo, suelo, parcela y ML opcional.</w:t>
+            </w:r>
+          </w:p>
+        </w:tc>
+      </w:tr>
+      <w:tr>
+        <w:tc>
+          <w:tcPr>
+            <w:tcW w:type="dxa" w:w="2160"/>
+          </w:tcPr>
+          <w:p>
+            <w:r>
+              <w:t>7</w:t>
+            </w:r>
+          </w:p>
+        </w:tc>
+        <w:tc>
+          <w:tcPr>
+            <w:tcW w:type="dxa" w:w="2160"/>
+          </w:tcPr>
+          <w:p>
+            <w:r>
+              <w:t>Preparar almacenamiento masivo.</w:t>
+            </w:r>
+          </w:p>
+        </w:tc>
+        <w:tc>
+          <w:tcPr>
+            <w:tcW w:type="dxa" w:w="2160"/>
+          </w:tcPr>
+          <w:p>
+            <w:r>
+              <w:t>Parcial</w:t>
+            </w:r>
+          </w:p>
+        </w:tc>
+        <w:tc>
+          <w:tcPr>
+            <w:tcW w:type="dxa" w:w="2160"/>
+          </w:tcPr>
+          <w:p>
+            <w:r>
+              <w:t>Dataset exportable y estructura compatible; despliegue BigQuery pendiente.</w:t>
             </w:r>
           </w:p>
         </w:tc>
@@ -4961,7 +6472,222 @@
         <w:pStyle w:val="Heading2"/>
       </w:pPr>
       <w:r>
-        <w:t>5.2 Aprendizajes significativos</w:t>
+        <w:t>5.2 Conclusiones según los objetivos específicos</w:t>
+      </w:r>
+    </w:p>
+    <w:p/>
+    <w:p>
+      <w:r>
+        <w:t>Las conclusiones se ordenan siguiendo la misma escalera definida en la introducción:</w:t>
+      </w:r>
+    </w:p>
+    <w:p/>
+    <w:tbl>
+      <w:tblPr>
+        <w:tblStyle w:val="TableGrid"/>
+        <w:tblW w:type="auto" w:w="0"/>
+        <w:tblLook w:firstColumn="1" w:firstRow="1" w:lastColumn="0" w:lastRow="0" w:noHBand="0" w:noVBand="1" w:val="04A0"/>
+      </w:tblPr>
+      <w:tblGrid>
+        <w:gridCol w:w="4320"/>
+        <w:gridCol w:w="4320"/>
+      </w:tblGrid>
+      <w:tr>
+        <w:tc>
+          <w:tcPr>
+            <w:tcW w:type="dxa" w:w="4320"/>
+          </w:tcPr>
+          <w:p>
+            <w:r>
+              <w:rPr>
+                <w:b/>
+              </w:rPr>
+              <w:t>Escalón</w:t>
+            </w:r>
+          </w:p>
+        </w:tc>
+        <w:tc>
+          <w:tcPr>
+            <w:tcW w:type="dxa" w:w="4320"/>
+          </w:tcPr>
+          <w:p>
+            <w:r>
+              <w:rPr>
+                <w:b/>
+              </w:rPr>
+              <w:t>Conclusión</w:t>
+            </w:r>
+          </w:p>
+        </w:tc>
+      </w:tr>
+      <w:tr>
+        <w:tc>
+          <w:tcPr>
+            <w:tcW w:type="dxa" w:w="4320"/>
+          </w:tcPr>
+          <w:p>
+            <w:r>
+              <w:t>1</w:t>
+            </w:r>
+          </w:p>
+        </w:tc>
+        <w:tc>
+          <w:tcPr>
+            <w:tcW w:type="dxa" w:w="4320"/>
+          </w:tcPr>
+          <w:p>
+            <w:r>
+              <w:t>La estructura de datos climáticos, edáficos, fisiológicos y de parcela queda definida y preparada para ampliarse con sensores IoT.</w:t>
+            </w:r>
+          </w:p>
+        </w:tc>
+      </w:tr>
+      <w:tr>
+        <w:tc>
+          <w:tcPr>
+            <w:tcW w:type="dxa" w:w="4320"/>
+          </w:tcPr>
+          <w:p>
+            <w:r>
+              <w:t>2</w:t>
+            </w:r>
+          </w:p>
+        </w:tc>
+        <w:tc>
+          <w:tcPr>
+            <w:tcW w:type="dxa" w:w="4320"/>
+          </w:tcPr>
+          <w:p>
+            <w:r>
+              <w:t>La conexión con AEMET permite trabajar con estaciones reales, datos diarios y un flujo ETL reproducible.</w:t>
+            </w:r>
+          </w:p>
+        </w:tc>
+      </w:tr>
+      <w:tr>
+        <w:tc>
+          <w:tcPr>
+            <w:tcW w:type="dxa" w:w="4320"/>
+          </w:tcPr>
+          <w:p>
+            <w:r>
+              <w:t>3</w:t>
+            </w:r>
+          </w:p>
+        </w:tc>
+        <w:tc>
+          <w:tcPr>
+            <w:tcW w:type="dxa" w:w="4320"/>
+          </w:tcPr>
+          <w:p>
+            <w:r>
+              <w:t>El cálculo agronómico ofrece una recomendación defendible en litros, litros por planta y milímetros de riego.</w:t>
+            </w:r>
+          </w:p>
+        </w:tc>
+      </w:tr>
+      <w:tr>
+        <w:tc>
+          <w:tcPr>
+            <w:tcW w:type="dxa" w:w="4320"/>
+          </w:tcPr>
+          <w:p>
+            <w:r>
+              <w:t>4</w:t>
+            </w:r>
+          </w:p>
+        </w:tc>
+        <w:tc>
+          <w:tcPr>
+            <w:tcW w:type="dxa" w:w="4320"/>
+          </w:tcPr>
+          <w:p>
+            <w:r>
+              <w:t>La comparación entre olivar, cítricos y almendro demuestra que el cultivo modifica de forma significativa la demanda hídrica.</w:t>
+            </w:r>
+          </w:p>
+        </w:tc>
+      </w:tr>
+      <w:tr>
+        <w:tc>
+          <w:tcPr>
+            <w:tcW w:type="dxa" w:w="4320"/>
+          </w:tcPr>
+          <w:p>
+            <w:r>
+              <w:t>5</w:t>
+            </w:r>
+          </w:p>
+        </w:tc>
+        <w:tc>
+          <w:tcPr>
+            <w:tcW w:type="dxa" w:w="4320"/>
+          </w:tcPr>
+          <w:p>
+            <w:r>
+              <w:t>La capa ML/Keras queda integrada y validada como aproximación al cálculo agronómico, aunque requiere datos reales de campo para uso profesional.</w:t>
+            </w:r>
+          </w:p>
+        </w:tc>
+      </w:tr>
+      <w:tr>
+        <w:tc>
+          <w:tcPr>
+            <w:tcW w:type="dxa" w:w="4320"/>
+          </w:tcPr>
+          <w:p>
+            <w:r>
+              <w:t>6</w:t>
+            </w:r>
+          </w:p>
+        </w:tc>
+        <w:tc>
+          <w:tcPr>
+            <w:tcW w:type="dxa" w:w="4320"/>
+          </w:tcPr>
+          <w:p>
+            <w:r>
+              <w:t>La interfaz Streamlit transforma el cálculo técnico en un servicio entendible para un cliente.</w:t>
+            </w:r>
+          </w:p>
+        </w:tc>
+      </w:tr>
+      <w:tr>
+        <w:tc>
+          <w:tcPr>
+            <w:tcW w:type="dxa" w:w="4320"/>
+          </w:tcPr>
+          <w:p>
+            <w:r>
+              <w:t>7</w:t>
+            </w:r>
+          </w:p>
+        </w:tc>
+        <w:tc>
+          <w:tcPr>
+            <w:tcW w:type="dxa" w:w="4320"/>
+          </w:tcPr>
+          <w:p>
+            <w:r>
+              <w:t>La estructura exportable deja preparado el salto a BigQuery y a una arquitectura de análisis masivo.</w:t>
+            </w:r>
+          </w:p>
+        </w:tc>
+      </w:tr>
+    </w:tbl>
+    <w:p/>
+    <w:p>
+      <w:r>
+        <w:t>El objetivo general se alcanza a nivel de prototipo: el sistema analiza datos meteorológicos y agronómicos para optimizar la recomendación de riego. La validación comercial real queda condicionada a la incorporación de sensores, histórico de riego aplicado y contraste con parcelas reales.</w:t>
+      </w:r>
+    </w:p>
+    <w:p/>
+    <w:p>
+      <w:pPr>
+        <w:pStyle w:val="Heading2"/>
+      </w:pPr>
+      <w:r>
+        <w:t>5.3 Aprendizajes significativos</w:t>
       </w:r>
     </w:p>
     <w:p/>
@@ -5032,6 +6758,14 @@
         <w:pStyle w:val="ListBullet"/>
       </w:pPr>
       <w:r>
+        <w:t>Documentación metodológica con Scrum, backlog, Gantt y trazabilidad por objetivos.</w:t>
+      </w:r>
+    </w:p>
+    <w:p>
+      <w:pPr>
+        <w:pStyle w:val="ListBullet"/>
+      </w:pPr>
+      <w:r>
         <w:t>Validación mediante pruebas unitarias.</w:t>
       </w:r>
     </w:p>
@@ -5041,7 +6775,7 @@
         <w:pStyle w:val="Heading2"/>
       </w:pPr>
       <w:r>
-        <w:t>5.3 Dificultades encontradas</w:t>
+        <w:t>5.4 Dificultades encontradas</w:t>
       </w:r>
     </w:p>
     <w:p/>
@@ -5091,13 +6825,21 @@
         <w:t>Evitar que el objetivo de Machine Learning se presente como precisión absoluta cuando todavía no hay sensores reales de campo.</w:t>
       </w:r>
     </w:p>
+    <w:p>
+      <w:pPr>
+        <w:pStyle w:val="ListBullet"/>
+      </w:pPr>
+      <w:r>
+        <w:t>Plantear el ROI sin inventar datos económicos no medidos.</w:t>
+      </w:r>
+    </w:p>
     <w:p/>
     <w:p>
       <w:pPr>
         <w:pStyle w:val="Heading2"/>
       </w:pPr>
       <w:r>
-        <w:t>5.4 Mejoras futuras</w:t>
+        <w:t>5.5 Mejoras futuras</w:t>
       </w:r>
     </w:p>
     <w:p/>
@@ -5177,7 +6919,7 @@
         <w:pStyle w:val="Heading2"/>
       </w:pPr>
       <w:r>
-        <w:t>5.5 Cierre</w:t>
+        <w:t>5.6 Cierre</w:t>
       </w:r>
     </w:p>
     <w:p/>
@@ -5247,6 +6989,24 @@
     <w:p>
       <w:r>
         <w:t>[9] K. Schwaber y J. Sutherland, "The Scrum Guide," Scrum Guides, nov. 2020. [En línea]. Disponible en: https://scrumguides.org/download.html. [Accedido: 11-may-2026].</w:t>
+      </w:r>
+    </w:p>
+    <w:p/>
+    <w:p>
+      <w:r>
+        <w:t>[10] UNESCO, "Recommendation on the Ethics of Artificial Intelligence," UNESCO, 2021. [En línea]. Disponible en: https://www.unesco.org/en/legal-affairs/recommendation-ethics-artificial-intelligence. [Accedido: 12-may-2026].</w:t>
+      </w:r>
+    </w:p>
+    <w:p/>
+    <w:p>
+      <w:r>
+        <w:t>[11] Parlamento Europeo y Consejo de la Unión Europea, "Regulation (EU) 2024/1689 of the European Parliament and of the Council of 13 June 2024 laying down harmonised rules on artificial intelligence," Diario Oficial de la Unión Europea, 12-jul-2024. [En línea]. Disponible en: https://eur-lex.europa.eu/eli/reg/2024/1689/oj. [Accedido: 12-may-2026].</w:t>
+      </w:r>
+    </w:p>
+    <w:p/>
+    <w:p>
+      <w:r>
+        <w:t>[12] Creative Commons, "Attribution-NonCommercial-ShareAlike 4.0 International (CC BY-NC-SA 4.0)," Creative Commons. [En línea]. Disponible en: https://creativecommons.org/licenses/by-nc-sa/4.0/. [Accedido: 12-may-2026].</w:t>
       </w:r>
     </w:p>
     <w:p/>
@@ -5818,6 +7578,859 @@
       </w:pPr>
       <w:r>
         <w:t>La predicción usa históricos y cálculo agronómico como base; para operación comercial debe validarse en campo.</w:t>
+      </w:r>
+    </w:p>
+    <w:p/>
+    <w:p>
+      <w:pPr>
+        <w:pStyle w:val="Heading2"/>
+      </w:pPr>
+      <w:r>
+        <w:t>Anexo D. Product Backlog Scrum</w:t>
+      </w:r>
+    </w:p>
+    <w:p/>
+    <w:p>
+      <w:r>
+        <w:t>El Product Backlog recoge las funcionalidades necesarias para alcanzar el objetivo general. La prioridad se ha definido según su impacto en la utilidad del prototipo.</w:t>
+      </w:r>
+    </w:p>
+    <w:p/>
+    <w:tbl>
+      <w:tblPr>
+        <w:tblStyle w:val="TableGrid"/>
+        <w:tblW w:type="auto" w:w="0"/>
+        <w:tblLook w:firstColumn="1" w:firstRow="1" w:lastColumn="0" w:lastRow="0" w:noHBand="0" w:noVBand="1" w:val="04A0"/>
+      </w:tblPr>
+      <w:tblGrid>
+        <w:gridCol w:w="2160"/>
+        <w:gridCol w:w="2160"/>
+        <w:gridCol w:w="2160"/>
+        <w:gridCol w:w="2160"/>
+      </w:tblGrid>
+      <w:tr>
+        <w:tc>
+          <w:tcPr>
+            <w:tcW w:type="dxa" w:w="2160"/>
+          </w:tcPr>
+          <w:p>
+            <w:r>
+              <w:rPr>
+                <w:b/>
+              </w:rPr>
+              <w:t>ID</w:t>
+            </w:r>
+          </w:p>
+        </w:tc>
+        <w:tc>
+          <w:tcPr>
+            <w:tcW w:type="dxa" w:w="2160"/>
+          </w:tcPr>
+          <w:p>
+            <w:r>
+              <w:rPr>
+                <w:b/>
+              </w:rPr>
+              <w:t>Historia/tarea</w:t>
+            </w:r>
+          </w:p>
+        </w:tc>
+        <w:tc>
+          <w:tcPr>
+            <w:tcW w:type="dxa" w:w="2160"/>
+          </w:tcPr>
+          <w:p>
+            <w:r>
+              <w:rPr>
+                <w:b/>
+              </w:rPr>
+              <w:t>Prioridad</w:t>
+            </w:r>
+          </w:p>
+        </w:tc>
+        <w:tc>
+          <w:tcPr>
+            <w:tcW w:type="dxa" w:w="2160"/>
+          </w:tcPr>
+          <w:p>
+            <w:r>
+              <w:rPr>
+                <w:b/>
+              </w:rPr>
+              <w:t>Estado</w:t>
+            </w:r>
+          </w:p>
+        </w:tc>
+      </w:tr>
+      <w:tr>
+        <w:tc>
+          <w:tcPr>
+            <w:tcW w:type="dxa" w:w="2160"/>
+          </w:tcPr>
+          <w:p>
+            <w:r>
+              <w:t>PB-01</w:t>
+            </w:r>
+          </w:p>
+        </w:tc>
+        <w:tc>
+          <w:tcPr>
+            <w:tcW w:type="dxa" w:w="2160"/>
+          </w:tcPr>
+          <w:p>
+            <w:r>
+              <w:t>Como usuario, quiero elegir una estación AEMET para trabajar con datos reales de mi zona.</w:t>
+            </w:r>
+          </w:p>
+        </w:tc>
+        <w:tc>
+          <w:tcPr>
+            <w:tcW w:type="dxa" w:w="2160"/>
+          </w:tcPr>
+          <w:p>
+            <w:r>
+              <w:t>Alta</w:t>
+            </w:r>
+          </w:p>
+        </w:tc>
+        <w:tc>
+          <w:tcPr>
+            <w:tcW w:type="dxa" w:w="2160"/>
+          </w:tcPr>
+          <w:p>
+            <w:r>
+              <w:t>Completado</w:t>
+            </w:r>
+          </w:p>
+        </w:tc>
+      </w:tr>
+      <w:tr>
+        <w:tc>
+          <w:tcPr>
+            <w:tcW w:type="dxa" w:w="2160"/>
+          </w:tcPr>
+          <w:p>
+            <w:r>
+              <w:t>PB-02</w:t>
+            </w:r>
+          </w:p>
+        </w:tc>
+        <w:tc>
+          <w:tcPr>
+            <w:tcW w:type="dxa" w:w="2160"/>
+          </w:tcPr>
+          <w:p>
+            <w:r>
+              <w:t>Como usuario, quiero introducir cultivo, fase, suelo y superficie para adaptar el cálculo a mi parcela.</w:t>
+            </w:r>
+          </w:p>
+        </w:tc>
+        <w:tc>
+          <w:tcPr>
+            <w:tcW w:type="dxa" w:w="2160"/>
+          </w:tcPr>
+          <w:p>
+            <w:r>
+              <w:t>Alta</w:t>
+            </w:r>
+          </w:p>
+        </w:tc>
+        <w:tc>
+          <w:tcPr>
+            <w:tcW w:type="dxa" w:w="2160"/>
+          </w:tcPr>
+          <w:p>
+            <w:r>
+              <w:t>Completado</w:t>
+            </w:r>
+          </w:p>
+        </w:tc>
+      </w:tr>
+      <w:tr>
+        <w:tc>
+          <w:tcPr>
+            <w:tcW w:type="dxa" w:w="2160"/>
+          </w:tcPr>
+          <w:p>
+            <w:r>
+              <w:t>PB-03</w:t>
+            </w:r>
+          </w:p>
+        </w:tc>
+        <w:tc>
+          <w:tcPr>
+            <w:tcW w:type="dxa" w:w="2160"/>
+          </w:tcPr>
+          <w:p>
+            <w:r>
+              <w:t>Como usuario, quiero obtener litros totales, litros por planta y lámina de riego.</w:t>
+            </w:r>
+          </w:p>
+        </w:tc>
+        <w:tc>
+          <w:tcPr>
+            <w:tcW w:type="dxa" w:w="2160"/>
+          </w:tcPr>
+          <w:p>
+            <w:r>
+              <w:t>Alta</w:t>
+            </w:r>
+          </w:p>
+        </w:tc>
+        <w:tc>
+          <w:tcPr>
+            <w:tcW w:type="dxa" w:w="2160"/>
+          </w:tcPr>
+          <w:p>
+            <w:r>
+              <w:t>Completado</w:t>
+            </w:r>
+          </w:p>
+        </w:tc>
+      </w:tr>
+      <w:tr>
+        <w:tc>
+          <w:tcPr>
+            <w:tcW w:type="dxa" w:w="2160"/>
+          </w:tcPr>
+          <w:p>
+            <w:r>
+              <w:t>PB-04</w:t>
+            </w:r>
+          </w:p>
+        </w:tc>
+        <w:tc>
+          <w:tcPr>
+            <w:tcW w:type="dxa" w:w="2160"/>
+          </w:tcPr>
+          <w:p>
+            <w:r>
+              <w:t>Como usuario, quiero comparar olivar, cítricos y almendro bajo el mismo escenario.</w:t>
+            </w:r>
+          </w:p>
+        </w:tc>
+        <w:tc>
+          <w:tcPr>
+            <w:tcW w:type="dxa" w:w="2160"/>
+          </w:tcPr>
+          <w:p>
+            <w:r>
+              <w:t>Alta</w:t>
+            </w:r>
+          </w:p>
+        </w:tc>
+        <w:tc>
+          <w:tcPr>
+            <w:tcW w:type="dxa" w:w="2160"/>
+          </w:tcPr>
+          <w:p>
+            <w:r>
+              <w:t>Completado</w:t>
+            </w:r>
+          </w:p>
+        </w:tc>
+      </w:tr>
+      <w:tr>
+        <w:tc>
+          <w:tcPr>
+            <w:tcW w:type="dxa" w:w="2160"/>
+          </w:tcPr>
+          <w:p>
+            <w:r>
+              <w:t>PB-05</w:t>
+            </w:r>
+          </w:p>
+        </w:tc>
+        <w:tc>
+          <w:tcPr>
+            <w:tcW w:type="dxa" w:w="2160"/>
+          </w:tcPr>
+          <w:p>
+            <w:r>
+              <w:t>Como desarrollador, quiero exportar datasets CSV/JSON para análisis y BigQuery.</w:t>
+            </w:r>
+          </w:p>
+        </w:tc>
+        <w:tc>
+          <w:tcPr>
+            <w:tcW w:type="dxa" w:w="2160"/>
+          </w:tcPr>
+          <w:p>
+            <w:r>
+              <w:t>Media</w:t>
+            </w:r>
+          </w:p>
+        </w:tc>
+        <w:tc>
+          <w:tcPr>
+            <w:tcW w:type="dxa" w:w="2160"/>
+          </w:tcPr>
+          <w:p>
+            <w:r>
+              <w:t>Completado</w:t>
+            </w:r>
+          </w:p>
+        </w:tc>
+      </w:tr>
+      <w:tr>
+        <w:tc>
+          <w:tcPr>
+            <w:tcW w:type="dxa" w:w="2160"/>
+          </w:tcPr>
+          <w:p>
+            <w:r>
+              <w:t>PB-06</w:t>
+            </w:r>
+          </w:p>
+        </w:tc>
+        <w:tc>
+          <w:tcPr>
+            <w:tcW w:type="dxa" w:w="2160"/>
+          </w:tcPr>
+          <w:p>
+            <w:r>
+              <w:t>Como usuario, quiero activar una predicción ML entrenada con históricos.</w:t>
+            </w:r>
+          </w:p>
+        </w:tc>
+        <w:tc>
+          <w:tcPr>
+            <w:tcW w:type="dxa" w:w="2160"/>
+          </w:tcPr>
+          <w:p>
+            <w:r>
+              <w:t>Media</w:t>
+            </w:r>
+          </w:p>
+        </w:tc>
+        <w:tc>
+          <w:tcPr>
+            <w:tcW w:type="dxa" w:w="2160"/>
+          </w:tcPr>
+          <w:p>
+            <w:r>
+              <w:t>Completado</w:t>
+            </w:r>
+          </w:p>
+        </w:tc>
+      </w:tr>
+      <w:tr>
+        <w:tc>
+          <w:tcPr>
+            <w:tcW w:type="dxa" w:w="2160"/>
+          </w:tcPr>
+          <w:p>
+            <w:r>
+              <w:t>PB-07</w:t>
+            </w:r>
+          </w:p>
+        </w:tc>
+        <w:tc>
+          <w:tcPr>
+            <w:tcW w:type="dxa" w:w="2160"/>
+          </w:tcPr>
+          <w:p>
+            <w:r>
+              <w:t>Como usuario, quiero trabajar con cache local para no saturar AEMET.</w:t>
+            </w:r>
+          </w:p>
+        </w:tc>
+        <w:tc>
+          <w:tcPr>
+            <w:tcW w:type="dxa" w:w="2160"/>
+          </w:tcPr>
+          <w:p>
+            <w:r>
+              <w:t>Media</w:t>
+            </w:r>
+          </w:p>
+        </w:tc>
+        <w:tc>
+          <w:tcPr>
+            <w:tcW w:type="dxa" w:w="2160"/>
+          </w:tcPr>
+          <w:p>
+            <w:r>
+              <w:t>Completado</w:t>
+            </w:r>
+          </w:p>
+        </w:tc>
+      </w:tr>
+      <w:tr>
+        <w:tc>
+          <w:tcPr>
+            <w:tcW w:type="dxa" w:w="2160"/>
+          </w:tcPr>
+          <w:p>
+            <w:r>
+              <w:t>PB-08</w:t>
+            </w:r>
+          </w:p>
+        </w:tc>
+        <w:tc>
+          <w:tcPr>
+            <w:tcW w:type="dxa" w:w="2160"/>
+          </w:tcPr>
+          <w:p>
+            <w:r>
+              <w:t>Como responsable técnico, quiero integrar sensores IoT reales.</w:t>
+            </w:r>
+          </w:p>
+        </w:tc>
+        <w:tc>
+          <w:tcPr>
+            <w:tcW w:type="dxa" w:w="2160"/>
+          </w:tcPr>
+          <w:p>
+            <w:r>
+              <w:t>Alta</w:t>
+            </w:r>
+          </w:p>
+        </w:tc>
+        <w:tc>
+          <w:tcPr>
+            <w:tcW w:type="dxa" w:w="2160"/>
+          </w:tcPr>
+          <w:p>
+            <w:r>
+              <w:t>Pendiente</w:t>
+            </w:r>
+          </w:p>
+        </w:tc>
+      </w:tr>
+      <w:tr>
+        <w:tc>
+          <w:tcPr>
+            <w:tcW w:type="dxa" w:w="2160"/>
+          </w:tcPr>
+          <w:p>
+            <w:r>
+              <w:t>PB-09</w:t>
+            </w:r>
+          </w:p>
+        </w:tc>
+        <w:tc>
+          <w:tcPr>
+            <w:tcW w:type="dxa" w:w="2160"/>
+          </w:tcPr>
+          <w:p>
+            <w:r>
+              <w:t>Como responsable del servicio, quiero calcular ROI con consumos y costes reales.</w:t>
+            </w:r>
+          </w:p>
+        </w:tc>
+        <w:tc>
+          <w:tcPr>
+            <w:tcW w:type="dxa" w:w="2160"/>
+          </w:tcPr>
+          <w:p>
+            <w:r>
+              <w:t>Media</w:t>
+            </w:r>
+          </w:p>
+        </w:tc>
+        <w:tc>
+          <w:tcPr>
+            <w:tcW w:type="dxa" w:w="2160"/>
+          </w:tcPr>
+          <w:p>
+            <w:r>
+              <w:t>Pendiente</w:t>
+            </w:r>
+          </w:p>
+        </w:tc>
+      </w:tr>
+      <w:tr>
+        <w:tc>
+          <w:tcPr>
+            <w:tcW w:type="dxa" w:w="2160"/>
+          </w:tcPr>
+          <w:p>
+            <w:r>
+              <w:t>PB-10</w:t>
+            </w:r>
+          </w:p>
+        </w:tc>
+        <w:tc>
+          <w:tcPr>
+            <w:tcW w:type="dxa" w:w="2160"/>
+          </w:tcPr>
+          <w:p>
+            <w:r>
+              <w:t>Como usuario final, quiero informes PDF comerciales.</w:t>
+            </w:r>
+          </w:p>
+        </w:tc>
+        <w:tc>
+          <w:tcPr>
+            <w:tcW w:type="dxa" w:w="2160"/>
+          </w:tcPr>
+          <w:p>
+            <w:r>
+              <w:t>Baja</w:t>
+            </w:r>
+          </w:p>
+        </w:tc>
+        <w:tc>
+          <w:tcPr>
+            <w:tcW w:type="dxa" w:w="2160"/>
+          </w:tcPr>
+          <w:p>
+            <w:r>
+              <w:t>Pendiente</w:t>
+            </w:r>
+          </w:p>
+        </w:tc>
+      </w:tr>
+    </w:tbl>
+    <w:p/>
+    <w:p>
+      <w:pPr>
+        <w:pStyle w:val="Heading2"/>
+      </w:pPr>
+      <w:r>
+        <w:t>Anexo E. Sprint Backlog</w:t>
+      </w:r>
+    </w:p>
+    <w:p/>
+    <w:tbl>
+      <w:tblPr>
+        <w:tblStyle w:val="TableGrid"/>
+        <w:tblW w:type="auto" w:w="0"/>
+        <w:tblLook w:firstColumn="1" w:firstRow="1" w:lastColumn="0" w:lastRow="0" w:noHBand="0" w:noVBand="1" w:val="04A0"/>
+      </w:tblPr>
+      <w:tblGrid>
+        <w:gridCol w:w="2160"/>
+        <w:gridCol w:w="2160"/>
+        <w:gridCol w:w="2160"/>
+        <w:gridCol w:w="2160"/>
+      </w:tblGrid>
+      <w:tr>
+        <w:tc>
+          <w:tcPr>
+            <w:tcW w:type="dxa" w:w="2160"/>
+          </w:tcPr>
+          <w:p>
+            <w:r>
+              <w:rPr>
+                <w:b/>
+              </w:rPr>
+              <w:t>Sprint</w:t>
+            </w:r>
+          </w:p>
+        </w:tc>
+        <w:tc>
+          <w:tcPr>
+            <w:tcW w:type="dxa" w:w="2160"/>
+          </w:tcPr>
+          <w:p>
+            <w:r>
+              <w:rPr>
+                <w:b/>
+              </w:rPr>
+              <w:t>Objetivo</w:t>
+            </w:r>
+          </w:p>
+        </w:tc>
+        <w:tc>
+          <w:tcPr>
+            <w:tcW w:type="dxa" w:w="2160"/>
+          </w:tcPr>
+          <w:p>
+            <w:r>
+              <w:rPr>
+                <w:b/>
+              </w:rPr>
+              <w:t>Tareas principales</w:t>
+            </w:r>
+          </w:p>
+        </w:tc>
+        <w:tc>
+          <w:tcPr>
+            <w:tcW w:type="dxa" w:w="2160"/>
+          </w:tcPr>
+          <w:p>
+            <w:r>
+              <w:rPr>
+                <w:b/>
+              </w:rPr>
+              <w:t>Entregable</w:t>
+            </w:r>
+          </w:p>
+        </w:tc>
+      </w:tr>
+      <w:tr>
+        <w:tc>
+          <w:tcPr>
+            <w:tcW w:type="dxa" w:w="2160"/>
+          </w:tcPr>
+          <w:p>
+            <w:r>
+              <w:t>Sprint 1</w:t>
+            </w:r>
+          </w:p>
+        </w:tc>
+        <w:tc>
+          <w:tcPr>
+            <w:tcW w:type="dxa" w:w="2160"/>
+          </w:tcPr>
+          <w:p>
+            <w:r>
+              <w:t>Base agronómica</w:t>
+            </w:r>
+          </w:p>
+        </w:tc>
+        <w:tc>
+          <w:tcPr>
+            <w:tcW w:type="dxa" w:w="2160"/>
+          </w:tcPr>
+          <w:p>
+            <w:r>
+              <w:t>Definir cultivos, suelos, ET0, Kc y fórmula de riego.</w:t>
+            </w:r>
+          </w:p>
+        </w:tc>
+        <w:tc>
+          <w:tcPr>
+            <w:tcW w:type="dxa" w:w="2160"/>
+          </w:tcPr>
+          <w:p>
+            <w:r>
+              <w:t>Motor de cálculo inicial.</w:t>
+            </w:r>
+          </w:p>
+        </w:tc>
+      </w:tr>
+      <w:tr>
+        <w:tc>
+          <w:tcPr>
+            <w:tcW w:type="dxa" w:w="2160"/>
+          </w:tcPr>
+          <w:p>
+            <w:r>
+              <w:t>Sprint 2</w:t>
+            </w:r>
+          </w:p>
+        </w:tc>
+        <w:tc>
+          <w:tcPr>
+            <w:tcW w:type="dxa" w:w="2160"/>
+          </w:tcPr>
+          <w:p>
+            <w:r>
+              <w:t>Datos AEMET</w:t>
+            </w:r>
+          </w:p>
+        </w:tc>
+        <w:tc>
+          <w:tcPr>
+            <w:tcW w:type="dxa" w:w="2160"/>
+          </w:tcPr>
+          <w:p>
+            <w:r>
+              <w:t>Implementar cliente API, búsqueda de estaciones y ETL.</w:t>
+            </w:r>
+          </w:p>
+        </w:tc>
+        <w:tc>
+          <w:tcPr>
+            <w:tcW w:type="dxa" w:w="2160"/>
+          </w:tcPr>
+          <w:p>
+            <w:r>
+              <w:t>Datos diarios por estación.</w:t>
+            </w:r>
+          </w:p>
+        </w:tc>
+      </w:tr>
+      <w:tr>
+        <w:tc>
+          <w:tcPr>
+            <w:tcW w:type="dxa" w:w="2160"/>
+          </w:tcPr>
+          <w:p>
+            <w:r>
+              <w:t>Sprint 3</w:t>
+            </w:r>
+          </w:p>
+        </w:tc>
+        <w:tc>
+          <w:tcPr>
+            <w:tcW w:type="dxa" w:w="2160"/>
+          </w:tcPr>
+          <w:p>
+            <w:r>
+              <w:t>Comparativas</w:t>
+            </w:r>
+          </w:p>
+        </w:tc>
+        <w:tc>
+          <w:tcPr>
+            <w:tcW w:type="dxa" w:w="2160"/>
+          </w:tcPr>
+          <w:p>
+            <w:r>
+              <w:t>Añadir tres cultivos, exportaciones y resumen.</w:t>
+            </w:r>
+          </w:p>
+        </w:tc>
+        <w:tc>
+          <w:tcPr>
+            <w:tcW w:type="dxa" w:w="2160"/>
+          </w:tcPr>
+          <w:p>
+            <w:r>
+              <w:t>CSV/Markdown defendibles.</w:t>
+            </w:r>
+          </w:p>
+        </w:tc>
+      </w:tr>
+      <w:tr>
+        <w:tc>
+          <w:tcPr>
+            <w:tcW w:type="dxa" w:w="2160"/>
+          </w:tcPr>
+          <w:p>
+            <w:r>
+              <w:t>Sprint 4</w:t>
+            </w:r>
+          </w:p>
+        </w:tc>
+        <w:tc>
+          <w:tcPr>
+            <w:tcW w:type="dxa" w:w="2160"/>
+          </w:tcPr>
+          <w:p>
+            <w:r>
+              <w:t>Servicio cliente</w:t>
+            </w:r>
+          </w:p>
+        </w:tc>
+        <w:tc>
+          <w:tcPr>
+            <w:tcW w:type="dxa" w:w="2160"/>
+          </w:tcPr>
+          <w:p>
+            <w:r>
+              <w:t>Crear interfaz Streamlit y formulario de parcela.</w:t>
+            </w:r>
+          </w:p>
+        </w:tc>
+        <w:tc>
+          <w:tcPr>
+            <w:tcW w:type="dxa" w:w="2160"/>
+          </w:tcPr>
+          <w:p>
+            <w:r>
+              <w:t>App local funcional.</w:t>
+            </w:r>
+          </w:p>
+        </w:tc>
+      </w:tr>
+      <w:tr>
+        <w:tc>
+          <w:tcPr>
+            <w:tcW w:type="dxa" w:w="2160"/>
+          </w:tcPr>
+          <w:p>
+            <w:r>
+              <w:t>Sprint 5</w:t>
+            </w:r>
+          </w:p>
+        </w:tc>
+        <w:tc>
+          <w:tcPr>
+            <w:tcW w:type="dxa" w:w="2160"/>
+          </w:tcPr>
+          <w:p>
+            <w:r>
+              <w:t>Machine Learning</w:t>
+            </w:r>
+          </w:p>
+        </w:tc>
+        <w:tc>
+          <w:tcPr>
+            <w:tcW w:type="dxa" w:w="2160"/>
+          </w:tcPr>
+          <w:p>
+            <w:r>
+              <w:t>Generar dataset ML, entrenar Keras y medir resultados.</w:t>
+            </w:r>
+          </w:p>
+        </w:tc>
+        <w:tc>
+          <w:tcPr>
+            <w:tcW w:type="dxa" w:w="2160"/>
+          </w:tcPr>
+          <w:p>
+            <w:r>
+              <w:t>Modelo predictivo.</w:t>
+            </w:r>
+          </w:p>
+        </w:tc>
+      </w:tr>
+      <w:tr>
+        <w:tc>
+          <w:tcPr>
+            <w:tcW w:type="dxa" w:w="2160"/>
+          </w:tcPr>
+          <w:p>
+            <w:r>
+              <w:t>Sprint 6</w:t>
+            </w:r>
+          </w:p>
+        </w:tc>
+        <w:tc>
+          <w:tcPr>
+            <w:tcW w:type="dxa" w:w="2160"/>
+          </w:tcPr>
+          <w:p>
+            <w:r>
+              <w:t>Calidad y entrega</w:t>
+            </w:r>
+          </w:p>
+        </w:tc>
+        <w:tc>
+          <w:tcPr>
+            <w:tcW w:type="dxa" w:w="2160"/>
+          </w:tcPr>
+          <w:p>
+            <w:r>
+              <w:t>Añadir pruebas, memoria, GitHub, ética, Gantt y anexos.</w:t>
+            </w:r>
+          </w:p>
+        </w:tc>
+        <w:tc>
+          <w:tcPr>
+            <w:tcW w:type="dxa" w:w="2160"/>
+          </w:tcPr>
+          <w:p>
+            <w:r>
+              <w:t>Proyecto documentado.</w:t>
+            </w:r>
+          </w:p>
+        </w:tc>
+      </w:tr>
+    </w:tbl>
+    <w:p/>
+    <w:p>
+      <w:pPr>
+        <w:pStyle w:val="Heading2"/>
+      </w:pPr>
+      <w:r>
+        <w:t>Anexo F. Licencia documental</w:t>
+      </w:r>
+    </w:p>
+    <w:p/>
+    <w:p>
+      <w:r>
+        <w:t>La memoria y documentación asociada se publican bajo licencia Creative Commons Reconocimiento-NoComercial-CompartirIgual 4.0 Internacional (CC BY-NC-SA 4.0). Esto permite compartir y adaptar el material citando la autoría, sin uso comercial y manteniendo la misma licencia en obras derivadas [12].</w:t>
+      </w:r>
+    </w:p>
+    <w:p/>
+    <w:p>
+      <w:r>
+        <w:t>El código fuente se mantiene en el repositorio académico del proyecto. Para una publicación como software reutilizable se recomienda añadir una licencia específica de software, por ejemplo MIT, Apache-2.0 o GPL, según el nivel de apertura deseado.</w:t>
       </w:r>
     </w:p>
     <w:sectPr>

</xml_diff>

<commit_message>
Simplificar alcance del servicio de riego
</commit_message>
<xml_diff>
--- a/docs/memoria_proyecto_intermodular.docx
+++ b/docs/memoria_proyecto_intermodular.docx
@@ -16,7 +16,7 @@
         <w:pStyle w:val="Heading1"/>
       </w:pPr>
       <w:r>
-        <w:t>Sistema predictivo de recomendación de riego basado en AEMET, IoT y Machine Learning</w:t>
+        <w:t>Sistema predictivo de recomendación de riego basado en AEMET y Machine Learning</w:t>
       </w:r>
     </w:p>
     <w:p>
@@ -229,15 +229,6 @@
       </w:pPr>
       <w:r>
         <w:t>Cultivo.</w:t>
-      </w:r>
-    </w:p>
-    <w:p>
-      <w:pPr>
-        <w:pStyle w:val="ListBullet"/>
-        <w:spacing w:after="60"/>
-      </w:pPr>
-      <w:r>
-        <w:t>Tipo de suelo.</w:t>
       </w:r>
     </w:p>
     <w:p>
@@ -535,7 +526,7 @@
               <w:rPr>
                 <w:sz w:val="18"/>
               </w:rPr>
-              <w:t>Definición de variables meteorológicas, edáficas, fisiológicas y de parcela.</w:t>
+              <w:t>Definición de variables meteorológicas, de cultivo y de parcela.</w:t>
             </w:r>
           </w:p>
         </w:tc>
@@ -890,7 +881,7 @@
               <w:rPr>
                 <w:sz w:val="18"/>
               </w:rPr>
-              <w:t>Aplicación Streamlit con selección de estación, cultivo, suelo y parcela.</w:t>
+              <w:t>Aplicación Streamlit con selección de estación, fechas, cultivo y superficie.</w:t>
             </w:r>
           </w:p>
         </w:tc>
@@ -938,7 +929,7 @@
               <w:rPr>
                 <w:sz w:val="18"/>
               </w:rPr>
-              <w:t>Preparar el proyecto para almacenamiento masivo.</w:t>
+              <w:t>Preparar el proyecto para exportación analítica local.</w:t>
             </w:r>
           </w:p>
         </w:tc>
@@ -961,7 +952,7 @@
               <w:rPr>
                 <w:sz w:val="18"/>
               </w:rPr>
-              <w:t>Estructura de datos compatible con BigQuery para futura explotación cloud.</w:t>
+              <w:t>Dataset CSV/JSON documentado para revisión y análisis posterior.</w:t>
             </w:r>
           </w:p>
         </w:tc>
@@ -989,7 +980,7 @@
         <w:spacing w:after="120"/>
       </w:pPr>
       <w:r>
-        <w:t>La principal limitación actual es que el modelo de Machine Learning se ha entrenado con datos históricos y etiquetas generadas a partir del cálculo agronómico. Para una operación comercial real, el siguiente paso sería calibrar el sistema con sensores IoT instalados en campo y datos reales de humedad del suelo, producción y riego aplicado.</w:t>
+        <w:t>La principal limitación actual es que el modelo de Machine Learning se ha entrenado con datos históricos y etiquetas generadas a partir del cálculo agronómico. Para una operación comercial real, el siguiente paso sería calibrar el sistema con datos reales de riego aplicado, producción y validación de campo.</w:t>
       </w:r>
     </w:p>
     <w:p>
@@ -1013,7 +1004,7 @@
         <w:spacing w:after="120"/>
       </w:pPr>
       <w:r>
-        <w:t>La agricultura de precisión consiste en utilizar datos, sensores y herramientas digitales para tomar decisiones más ajustadas a las condiciones reales de una parcela. En el caso del riego, esta aproximación permite pasar de calendarios generales a recomendaciones basadas en clima, suelo, cultivo y estado hídrico.</w:t>
+        <w:t>La agricultura de precisión consiste en utilizar datos y herramientas digitales para tomar decisiones más ajustadas a las condiciones reales de una parcela. En el caso del riego, esta aproximación permite pasar de calendarios generales a recomendaciones basadas en clima, cultivo y superficie.</w:t>
       </w:r>
     </w:p>
     <w:p>
@@ -1030,7 +1021,7 @@
         <w:spacing w:after="60"/>
       </w:pPr>
       <w:r>
-        <w:t>Captación de datos: estaciones AEMET y futura red de sensores IoT.</w:t>
+        <w:t>Captación de datos: estaciones AEMET.</w:t>
       </w:r>
     </w:p>
     <w:p>
@@ -1039,7 +1030,7 @@
         <w:spacing w:after="60"/>
       </w:pPr>
       <w:r>
-        <w:t>Almacenamiento: CSV local y estructura preparada para BigQuery.</w:t>
+        <w:t>Almacenamiento: CSV/JSON local y estructura exportable.</w:t>
       </w:r>
     </w:p>
     <w:p>
@@ -1177,7 +1168,7 @@
         <w:pStyle w:val="Heading2"/>
       </w:pPr>
       <w:r>
-        <w:t>2.4 Suelo y agua disponible</w:t>
+        <w:t>2.4 Parámetros auxiliares de suelo</w:t>
       </w:r>
     </w:p>
     <w:p>
@@ -1185,7 +1176,31 @@
         <w:spacing w:after="120"/>
       </w:pPr>
       <w:r>
-        <w:t>El tipo de suelo condiciona cuánta agua puede retener la parcela. El proyecto utiliza cinco perfiles edáficos:</w:t>
+        <w:t>El cálculo principal de la aplicación no pide al usuario el tipo de suelo ni la humedad inicial. La dosis diaria se obtiene con ET0, Kc, lluvia efectiva, superficie y eficiencia de riego.</w:t>
+      </w:r>
+    </w:p>
+    <w:p>
+      <w:pPr>
+        <w:spacing w:after="120"/>
+      </w:pPr>
+      <w:r>
+        <w:t>El código conserva un perfil técnico interno por compatibilidad del motor, pero no se expone en la interfaz ni en los comandos principales. En la memoria y en los resultados no se usa como variable de decisión del servicio.</w:t>
+      </w:r>
+    </w:p>
+    <w:p>
+      <w:pPr>
+        <w:pStyle w:val="Heading2"/>
+      </w:pPr>
+      <w:r>
+        <w:t>2.5 Cultivos seleccionados</w:t>
+      </w:r>
+    </w:p>
+    <w:p>
+      <w:pPr>
+        <w:spacing w:after="120"/>
+      </w:pPr>
+      <w:r>
+        <w:t>El proyecto trabaja con tres cultivos configurables:</w:t>
       </w:r>
     </w:p>
     <w:tbl>
@@ -1223,7 +1238,7 @@
                 <w:b/>
                 <w:sz w:val="18"/>
               </w:rPr>
-              <w:t>Suelo</w:t>
+              <w:t>Cultivo</w:t>
             </w:r>
           </w:p>
         </w:tc>
@@ -1248,7 +1263,7 @@
                 <w:b/>
                 <w:sz w:val="18"/>
               </w:rPr>
-              <w:t>Capacidad de campo</w:t>
+              <w:t>Marco estimado</w:t>
             </w:r>
           </w:p>
         </w:tc>
@@ -1273,7 +1288,7 @@
                 <w:b/>
                 <w:sz w:val="18"/>
               </w:rPr>
-              <w:t>Punto de marchitez</w:t>
+              <w:t>Kc en fase media</w:t>
             </w:r>
           </w:p>
         </w:tc>
@@ -1298,7 +1313,7 @@
               <w:rPr>
                 <w:sz w:val="18"/>
               </w:rPr>
-              <w:t>Arenoso</w:t>
+              <w:t>Olivar</w:t>
             </w:r>
           </w:p>
         </w:tc>
@@ -1321,7 +1336,7 @@
               <w:rPr>
                 <w:sz w:val="18"/>
               </w:rPr>
-              <w:t>0,10</w:t>
+              <w:t>8 m2/planta</w:t>
             </w:r>
           </w:p>
         </w:tc>
@@ -1344,7 +1359,7 @@
               <w:rPr>
                 <w:sz w:val="18"/>
               </w:rPr>
-              <w:t>0,05</w:t>
+              <w:t>0,70</w:t>
             </w:r>
           </w:p>
         </w:tc>
@@ -1369,7 +1384,7 @@
               <w:rPr>
                 <w:sz w:val="18"/>
               </w:rPr>
-              <w:t>Franco arenoso</w:t>
+              <w:t>Cítricos</w:t>
             </w:r>
           </w:p>
         </w:tc>
@@ -1392,7 +1407,7 @@
               <w:rPr>
                 <w:sz w:val="18"/>
               </w:rPr>
-              <w:t>0,15</w:t>
+              <w:t>20 m2/planta</w:t>
             </w:r>
           </w:p>
         </w:tc>
@@ -1415,7 +1430,7 @@
               <w:rPr>
                 <w:sz w:val="18"/>
               </w:rPr>
-              <w:t>0,07</w:t>
+              <w:t>0,75</w:t>
             </w:r>
           </w:p>
         </w:tc>
@@ -1440,7 +1455,7 @@
               <w:rPr>
                 <w:sz w:val="18"/>
               </w:rPr>
-              <w:t>Franco</w:t>
+              <w:t>Almendro</w:t>
             </w:r>
           </w:p>
         </w:tc>
@@ -1463,7 +1478,7 @@
               <w:rPr>
                 <w:sz w:val="18"/>
               </w:rPr>
-              <w:t>0,25</w:t>
+              <w:t>30 m2/planta</w:t>
             </w:r>
           </w:p>
         </w:tc>
@@ -1486,149 +1501,7 @@
               <w:rPr>
                 <w:sz w:val="18"/>
               </w:rPr>
-              <w:t>0,12</w:t>
-            </w:r>
-          </w:p>
-        </w:tc>
-      </w:tr>
-      <w:tr>
-        <w:tc>
-          <w:tcPr>
-            <w:tcW w:type="dxa" w:w="3024"/>
-            <w:vAlign w:val="center"/>
-            <w:tcMar>
-              <w:top w:w="80" w:type="dxa"/>
-              <w:start w:w="120" w:type="dxa"/>
-              <w:bottom w:w="80" w:type="dxa"/>
-              <w:end w:w="120" w:type="dxa"/>
-            </w:tcMar>
-          </w:tcPr>
-          <w:p>
-            <w:pPr>
-              <w:spacing w:after="0"/>
-            </w:pPr>
-            <w:r>
-              <w:rPr>
-                <w:sz w:val="18"/>
-              </w:rPr>
-              <w:t>Franco arcilloso</w:t>
-            </w:r>
-          </w:p>
-        </w:tc>
-        <w:tc>
-          <w:tcPr>
-            <w:tcW w:type="dxa" w:w="3024"/>
-            <w:vAlign w:val="center"/>
-            <w:tcMar>
-              <w:top w:w="80" w:type="dxa"/>
-              <w:start w:w="120" w:type="dxa"/>
-              <w:bottom w:w="80" w:type="dxa"/>
-              <w:end w:w="120" w:type="dxa"/>
-            </w:tcMar>
-          </w:tcPr>
-          <w:p>
-            <w:pPr>
-              <w:spacing w:after="0"/>
-            </w:pPr>
-            <w:r>
-              <w:rPr>
-                <w:sz w:val="18"/>
-              </w:rPr>
-              <w:t>0,31</w:t>
-            </w:r>
-          </w:p>
-        </w:tc>
-        <w:tc>
-          <w:tcPr>
-            <w:tcW w:type="dxa" w:w="3024"/>
-            <w:vAlign w:val="center"/>
-            <w:tcMar>
-              <w:top w:w="80" w:type="dxa"/>
-              <w:start w:w="120" w:type="dxa"/>
-              <w:bottom w:w="80" w:type="dxa"/>
-              <w:end w:w="120" w:type="dxa"/>
-            </w:tcMar>
-          </w:tcPr>
-          <w:p>
-            <w:pPr>
-              <w:spacing w:after="0"/>
-            </w:pPr>
-            <w:r>
-              <w:rPr>
-                <w:sz w:val="18"/>
-              </w:rPr>
-              <w:t>0,16</w:t>
-            </w:r>
-          </w:p>
-        </w:tc>
-      </w:tr>
-      <w:tr>
-        <w:tc>
-          <w:tcPr>
-            <w:tcW w:type="dxa" w:w="3024"/>
-            <w:vAlign w:val="center"/>
-            <w:tcMar>
-              <w:top w:w="80" w:type="dxa"/>
-              <w:start w:w="120" w:type="dxa"/>
-              <w:bottom w:w="80" w:type="dxa"/>
-              <w:end w:w="120" w:type="dxa"/>
-            </w:tcMar>
-          </w:tcPr>
-          <w:p>
-            <w:pPr>
-              <w:spacing w:after="0"/>
-            </w:pPr>
-            <w:r>
-              <w:rPr>
-                <w:sz w:val="18"/>
-              </w:rPr>
-              <w:t>Arcilloso</w:t>
-            </w:r>
-          </w:p>
-        </w:tc>
-        <w:tc>
-          <w:tcPr>
-            <w:tcW w:type="dxa" w:w="3024"/>
-            <w:vAlign w:val="center"/>
-            <w:tcMar>
-              <w:top w:w="80" w:type="dxa"/>
-              <w:start w:w="120" w:type="dxa"/>
-              <w:bottom w:w="80" w:type="dxa"/>
-              <w:end w:w="120" w:type="dxa"/>
-            </w:tcMar>
-          </w:tcPr>
-          <w:p>
-            <w:pPr>
-              <w:spacing w:after="0"/>
-            </w:pPr>
-            <w:r>
-              <w:rPr>
-                <w:sz w:val="18"/>
-              </w:rPr>
-              <w:t>0,37</w:t>
-            </w:r>
-          </w:p>
-        </w:tc>
-        <w:tc>
-          <w:tcPr>
-            <w:tcW w:type="dxa" w:w="3024"/>
-            <w:vAlign w:val="center"/>
-            <w:tcMar>
-              <w:top w:w="80" w:type="dxa"/>
-              <w:start w:w="120" w:type="dxa"/>
-              <w:bottom w:w="80" w:type="dxa"/>
-              <w:end w:w="120" w:type="dxa"/>
-            </w:tcMar>
-          </w:tcPr>
-          <w:p>
-            <w:pPr>
-              <w:spacing w:after="0"/>
-            </w:pPr>
-            <w:r>
-              <w:rPr>
-                <w:sz w:val="18"/>
-              </w:rPr>
-              <w:t>0,22</w:t>
+              <w:t>0,90</w:t>
             </w:r>
           </w:p>
         </w:tc>
@@ -1640,33 +1513,23 @@
         <w:spacing w:after="120"/>
       </w:pPr>
       <w:r>
-        <w:t>Estos valores permiten estimar el agua disponible en el perfil radicular:</w:t>
+        <w:t>La elección de estos cultivos permite comparar demandas hídricas diferentes dentro de un contexto agrícola mediterráneo.</w:t>
       </w:r>
     </w:p>
     <w:p>
-      <w:pPr/>
+      <w:pPr>
+        <w:pStyle w:val="Heading2"/>
+      </w:pPr>
       <w:r>
-        <w:rPr>
-          <w:rFonts w:ascii="Consolas" w:hAnsi="Consolas"/>
-          <w:sz w:val="16"/>
-        </w:rPr>
-        <w:t>Agua disponible total = (capacidad de campo - punto de marchitez) * profundidad radicular * 1000</w:t>
+        <w:t>2.6 Big Data y BigQuery</w:t>
       </w:r>
     </w:p>
     <w:p>
       <w:pPr>
-        <w:pStyle w:val="Heading2"/>
+        <w:spacing w:after="120"/>
       </w:pPr>
       <w:r>
-        <w:t>2.5 Cultivos seleccionados</w:t>
-      </w:r>
-    </w:p>
-    <w:p>
-      <w:pPr>
-        <w:spacing w:after="120"/>
-      </w:pPr>
-      <w:r>
-        <w:t>El proyecto trabaja con tres cultivos configurables:</w:t>
+        <w:t>El proyecto no despliega BigQuery. Lo que sí entrega es una estructura de datos exportable en CSV/JSON que podría cargarse en una herramienta analítica posterior. Google BigQuery se mantiene como referencia tecnológica para una futura versión cloud, ya que es un almacén de datos gestionado orientado al análisis de grandes volúmenes de información [4].</w:t>
       </w:r>
     </w:p>
     <w:tbl>
@@ -1678,16 +1541,13 @@
         <w:tblLook w:firstColumn="1" w:firstRow="1" w:lastColumn="0" w:lastRow="0" w:noHBand="0" w:noVBand="1" w:val="04A0"/>
       </w:tblPr>
       <w:tblGrid>
-        <w:gridCol w:w="1814"/>
-        <w:gridCol w:w="1814"/>
-        <w:gridCol w:w="1814"/>
-        <w:gridCol w:w="1814"/>
-        <w:gridCol w:w="1814"/>
+        <w:gridCol w:w="4536"/>
+        <w:gridCol w:w="4536"/>
       </w:tblGrid>
       <w:tr>
         <w:tc>
           <w:tcPr>
-            <w:tcW w:type="dxa" w:w="1814"/>
+            <w:tcW w:type="dxa" w:w="4536"/>
             <w:vAlign w:val="center"/>
             <w:tcMar>
               <w:top w:w="80" w:type="dxa"/>
@@ -1706,13 +1566,13 @@
                 <w:b/>
                 <w:sz w:val="18"/>
               </w:rPr>
-              <w:t>Cultivo</w:t>
-            </w:r>
-          </w:p>
-        </w:tc>
-        <w:tc>
-          <w:tcPr>
-            <w:tcW w:type="dxa" w:w="1814"/>
+              <w:t>Elemento</w:t>
+            </w:r>
+          </w:p>
+        </w:tc>
+        <w:tc>
+          <w:tcPr>
+            <w:tcW w:type="dxa" w:w="4536"/>
             <w:vAlign w:val="center"/>
             <w:tcMar>
               <w:top w:w="80" w:type="dxa"/>
@@ -1731,82 +1591,7 @@
                 <w:b/>
                 <w:sz w:val="18"/>
               </w:rPr>
-              <w:t>Profundidad radicular</w:t>
-            </w:r>
-          </w:p>
-        </w:tc>
-        <w:tc>
-          <w:tcPr>
-            <w:tcW w:type="dxa" w:w="1814"/>
-            <w:vAlign w:val="center"/>
-            <w:tcMar>
-              <w:top w:w="80" w:type="dxa"/>
-              <w:start w:w="120" w:type="dxa"/>
-              <w:bottom w:w="80" w:type="dxa"/>
-              <w:end w:w="120" w:type="dxa"/>
-            </w:tcMar>
-            <w:shd w:fill="E8EEF5"/>
-          </w:tcPr>
-          <w:p>
-            <w:pPr>
-              <w:spacing w:after="0"/>
-            </w:pPr>
-            <w:r>
-              <w:rPr>
-                <w:b/>
-                <w:sz w:val="18"/>
-              </w:rPr>
-              <w:t>Marco estimado</w:t>
-            </w:r>
-          </w:p>
-        </w:tc>
-        <w:tc>
-          <w:tcPr>
-            <w:tcW w:type="dxa" w:w="1814"/>
-            <w:vAlign w:val="center"/>
-            <w:tcMar>
-              <w:top w:w="80" w:type="dxa"/>
-              <w:start w:w="120" w:type="dxa"/>
-              <w:bottom w:w="80" w:type="dxa"/>
-              <w:end w:w="120" w:type="dxa"/>
-            </w:tcMar>
-            <w:shd w:fill="E8EEF5"/>
-          </w:tcPr>
-          <w:p>
-            <w:pPr>
-              <w:spacing w:after="0"/>
-            </w:pPr>
-            <w:r>
-              <w:rPr>
-                <w:b/>
-                <w:sz w:val="18"/>
-              </w:rPr>
-              <w:t>Agotamiento máximo</w:t>
-            </w:r>
-          </w:p>
-        </w:tc>
-        <w:tc>
-          <w:tcPr>
-            <w:tcW w:type="dxa" w:w="1814"/>
-            <w:vAlign w:val="center"/>
-            <w:tcMar>
-              <w:top w:w="80" w:type="dxa"/>
-              <w:start w:w="120" w:type="dxa"/>
-              <w:bottom w:w="80" w:type="dxa"/>
-              <w:end w:w="120" w:type="dxa"/>
-            </w:tcMar>
-            <w:shd w:fill="E8EEF5"/>
-          </w:tcPr>
-          <w:p>
-            <w:pPr>
-              <w:spacing w:after="0"/>
-            </w:pPr>
-            <w:r>
-              <w:rPr>
-                <w:b/>
-                <w:sz w:val="18"/>
-              </w:rPr>
-              <w:t>Kc en fase media</w:t>
+              <w:t>Estado en el proyecto</w:t>
             </w:r>
           </w:p>
         </w:tc>
@@ -1814,116 +1599,47 @@
       <w:tr>
         <w:tc>
           <w:tcPr>
-            <w:tcW w:type="dxa" w:w="1814"/>
-            <w:vAlign w:val="center"/>
-            <w:tcMar>
-              <w:top w:w="80" w:type="dxa"/>
-              <w:start w:w="120" w:type="dxa"/>
-              <w:bottom w:w="80" w:type="dxa"/>
-              <w:end w:w="120" w:type="dxa"/>
-            </w:tcMar>
-          </w:tcPr>
-          <w:p>
-            <w:pPr>
-              <w:spacing w:after="0"/>
-            </w:pPr>
-            <w:r>
-              <w:rPr>
-                <w:sz w:val="18"/>
-              </w:rPr>
-              <w:t>Olivar</w:t>
-            </w:r>
-          </w:p>
-        </w:tc>
-        <w:tc>
-          <w:tcPr>
-            <w:tcW w:type="dxa" w:w="1814"/>
-            <w:vAlign w:val="center"/>
-            <w:tcMar>
-              <w:top w:w="80" w:type="dxa"/>
-              <w:start w:w="120" w:type="dxa"/>
-              <w:bottom w:w="80" w:type="dxa"/>
-              <w:end w:w="120" w:type="dxa"/>
-            </w:tcMar>
-          </w:tcPr>
-          <w:p>
-            <w:pPr>
-              <w:spacing w:after="0"/>
-            </w:pPr>
-            <w:r>
-              <w:rPr>
-                <w:sz w:val="18"/>
-              </w:rPr>
-              <w:t>0,60 m</w:t>
-            </w:r>
-          </w:p>
-        </w:tc>
-        <w:tc>
-          <w:tcPr>
-            <w:tcW w:type="dxa" w:w="1814"/>
-            <w:vAlign w:val="center"/>
-            <w:tcMar>
-              <w:top w:w="80" w:type="dxa"/>
-              <w:start w:w="120" w:type="dxa"/>
-              <w:bottom w:w="80" w:type="dxa"/>
-              <w:end w:w="120" w:type="dxa"/>
-            </w:tcMar>
-          </w:tcPr>
-          <w:p>
-            <w:pPr>
-              <w:spacing w:after="0"/>
-            </w:pPr>
-            <w:r>
-              <w:rPr>
-                <w:sz w:val="18"/>
-              </w:rPr>
-              <w:t>8 m2/planta</w:t>
-            </w:r>
-          </w:p>
-        </w:tc>
-        <w:tc>
-          <w:tcPr>
-            <w:tcW w:type="dxa" w:w="1814"/>
-            <w:vAlign w:val="center"/>
-            <w:tcMar>
-              <w:top w:w="80" w:type="dxa"/>
-              <w:start w:w="120" w:type="dxa"/>
-              <w:bottom w:w="80" w:type="dxa"/>
-              <w:end w:w="120" w:type="dxa"/>
-            </w:tcMar>
-          </w:tcPr>
-          <w:p>
-            <w:pPr>
-              <w:spacing w:after="0"/>
-            </w:pPr>
-            <w:r>
-              <w:rPr>
-                <w:sz w:val="18"/>
-              </w:rPr>
-              <w:t>0,50</w:t>
-            </w:r>
-          </w:p>
-        </w:tc>
-        <w:tc>
-          <w:tcPr>
-            <w:tcW w:type="dxa" w:w="1814"/>
-            <w:vAlign w:val="center"/>
-            <w:tcMar>
-              <w:top w:w="80" w:type="dxa"/>
-              <w:start w:w="120" w:type="dxa"/>
-              <w:bottom w:w="80" w:type="dxa"/>
-              <w:end w:w="120" w:type="dxa"/>
-            </w:tcMar>
-          </w:tcPr>
-          <w:p>
-            <w:pPr>
-              <w:spacing w:after="0"/>
-            </w:pPr>
-            <w:r>
-              <w:rPr>
-                <w:sz w:val="18"/>
-              </w:rPr>
-              <w:t>0,70</w:t>
+            <w:tcW w:type="dxa" w:w="4536"/>
+            <w:vAlign w:val="center"/>
+            <w:tcMar>
+              <w:top w:w="80" w:type="dxa"/>
+              <w:start w:w="120" w:type="dxa"/>
+              <w:bottom w:w="80" w:type="dxa"/>
+              <w:end w:w="120" w:type="dxa"/>
+            </w:tcMar>
+          </w:tcPr>
+          <w:p>
+            <w:pPr>
+              <w:spacing w:after="0"/>
+            </w:pPr>
+            <w:r>
+              <w:rPr>
+                <w:sz w:val="18"/>
+              </w:rPr>
+              <w:t>Exportación CSV/JSON</w:t>
+            </w:r>
+          </w:p>
+        </w:tc>
+        <w:tc>
+          <w:tcPr>
+            <w:tcW w:type="dxa" w:w="4536"/>
+            <w:vAlign w:val="center"/>
+            <w:tcMar>
+              <w:top w:w="80" w:type="dxa"/>
+              <w:start w:w="120" w:type="dxa"/>
+              <w:bottom w:w="80" w:type="dxa"/>
+              <w:end w:w="120" w:type="dxa"/>
+            </w:tcMar>
+          </w:tcPr>
+          <w:p>
+            <w:pPr>
+              <w:spacing w:after="0"/>
+            </w:pPr>
+            <w:r>
+              <w:rPr>
+                <w:sz w:val="18"/>
+              </w:rPr>
+              <w:t>Implementada.</w:t>
             </w:r>
           </w:p>
         </w:tc>
@@ -1931,116 +1647,47 @@
       <w:tr>
         <w:tc>
           <w:tcPr>
-            <w:tcW w:type="dxa" w:w="1814"/>
-            <w:vAlign w:val="center"/>
-            <w:tcMar>
-              <w:top w:w="80" w:type="dxa"/>
-              <w:start w:w="120" w:type="dxa"/>
-              <w:bottom w:w="80" w:type="dxa"/>
-              <w:end w:w="120" w:type="dxa"/>
-            </w:tcMar>
-          </w:tcPr>
-          <w:p>
-            <w:pPr>
-              <w:spacing w:after="0"/>
-            </w:pPr>
-            <w:r>
-              <w:rPr>
-                <w:sz w:val="18"/>
-              </w:rPr>
-              <w:t>Cítricos</w:t>
-            </w:r>
-          </w:p>
-        </w:tc>
-        <w:tc>
-          <w:tcPr>
-            <w:tcW w:type="dxa" w:w="1814"/>
-            <w:vAlign w:val="center"/>
-            <w:tcMar>
-              <w:top w:w="80" w:type="dxa"/>
-              <w:start w:w="120" w:type="dxa"/>
-              <w:bottom w:w="80" w:type="dxa"/>
-              <w:end w:w="120" w:type="dxa"/>
-            </w:tcMar>
-          </w:tcPr>
-          <w:p>
-            <w:pPr>
-              <w:spacing w:after="0"/>
-            </w:pPr>
-            <w:r>
-              <w:rPr>
-                <w:sz w:val="18"/>
-              </w:rPr>
-              <w:t>0,70 m</w:t>
-            </w:r>
-          </w:p>
-        </w:tc>
-        <w:tc>
-          <w:tcPr>
-            <w:tcW w:type="dxa" w:w="1814"/>
-            <w:vAlign w:val="center"/>
-            <w:tcMar>
-              <w:top w:w="80" w:type="dxa"/>
-              <w:start w:w="120" w:type="dxa"/>
-              <w:bottom w:w="80" w:type="dxa"/>
-              <w:end w:w="120" w:type="dxa"/>
-            </w:tcMar>
-          </w:tcPr>
-          <w:p>
-            <w:pPr>
-              <w:spacing w:after="0"/>
-            </w:pPr>
-            <w:r>
-              <w:rPr>
-                <w:sz w:val="18"/>
-              </w:rPr>
-              <w:t>20 m2/planta</w:t>
-            </w:r>
-          </w:p>
-        </w:tc>
-        <w:tc>
-          <w:tcPr>
-            <w:tcW w:type="dxa" w:w="1814"/>
-            <w:vAlign w:val="center"/>
-            <w:tcMar>
-              <w:top w:w="80" w:type="dxa"/>
-              <w:start w:w="120" w:type="dxa"/>
-              <w:bottom w:w="80" w:type="dxa"/>
-              <w:end w:w="120" w:type="dxa"/>
-            </w:tcMar>
-          </w:tcPr>
-          <w:p>
-            <w:pPr>
-              <w:spacing w:after="0"/>
-            </w:pPr>
-            <w:r>
-              <w:rPr>
-                <w:sz w:val="18"/>
-              </w:rPr>
-              <w:t>0,45</w:t>
-            </w:r>
-          </w:p>
-        </w:tc>
-        <w:tc>
-          <w:tcPr>
-            <w:tcW w:type="dxa" w:w="1814"/>
-            <w:vAlign w:val="center"/>
-            <w:tcMar>
-              <w:top w:w="80" w:type="dxa"/>
-              <w:start w:w="120" w:type="dxa"/>
-              <w:bottom w:w="80" w:type="dxa"/>
-              <w:end w:w="120" w:type="dxa"/>
-            </w:tcMar>
-          </w:tcPr>
-          <w:p>
-            <w:pPr>
-              <w:spacing w:after="0"/>
-            </w:pPr>
-            <w:r>
-              <w:rPr>
-                <w:sz w:val="18"/>
-              </w:rPr>
-              <w:t>0,75</w:t>
+            <w:tcW w:type="dxa" w:w="4536"/>
+            <w:vAlign w:val="center"/>
+            <w:tcMar>
+              <w:top w:w="80" w:type="dxa"/>
+              <w:start w:w="120" w:type="dxa"/>
+              <w:bottom w:w="80" w:type="dxa"/>
+              <w:end w:w="120" w:type="dxa"/>
+            </w:tcMar>
+          </w:tcPr>
+          <w:p>
+            <w:pPr>
+              <w:spacing w:after="0"/>
+            </w:pPr>
+            <w:r>
+              <w:rPr>
+                <w:sz w:val="18"/>
+              </w:rPr>
+              <w:t>Estructura tabular compatible con análisis posterior</w:t>
+            </w:r>
+          </w:p>
+        </w:tc>
+        <w:tc>
+          <w:tcPr>
+            <w:tcW w:type="dxa" w:w="4536"/>
+            <w:vAlign w:val="center"/>
+            <w:tcMar>
+              <w:top w:w="80" w:type="dxa"/>
+              <w:start w:w="120" w:type="dxa"/>
+              <w:bottom w:w="80" w:type="dxa"/>
+              <w:end w:w="120" w:type="dxa"/>
+            </w:tcMar>
+          </w:tcPr>
+          <w:p>
+            <w:pPr>
+              <w:spacing w:after="0"/>
+            </w:pPr>
+            <w:r>
+              <w:rPr>
+                <w:sz w:val="18"/>
+              </w:rPr>
+              <w:t>Implementada.</w:t>
             </w:r>
           </w:p>
         </w:tc>
@@ -2048,116 +1695,95 @@
       <w:tr>
         <w:tc>
           <w:tcPr>
-            <w:tcW w:type="dxa" w:w="1814"/>
-            <w:vAlign w:val="center"/>
-            <w:tcMar>
-              <w:top w:w="80" w:type="dxa"/>
-              <w:start w:w="120" w:type="dxa"/>
-              <w:bottom w:w="80" w:type="dxa"/>
-              <w:end w:w="120" w:type="dxa"/>
-            </w:tcMar>
-          </w:tcPr>
-          <w:p>
-            <w:pPr>
-              <w:spacing w:after="0"/>
-            </w:pPr>
-            <w:r>
-              <w:rPr>
-                <w:sz w:val="18"/>
-              </w:rPr>
-              <w:t>Almendro</w:t>
-            </w:r>
-          </w:p>
-        </w:tc>
-        <w:tc>
-          <w:tcPr>
-            <w:tcW w:type="dxa" w:w="1814"/>
-            <w:vAlign w:val="center"/>
-            <w:tcMar>
-              <w:top w:w="80" w:type="dxa"/>
-              <w:start w:w="120" w:type="dxa"/>
-              <w:bottom w:w="80" w:type="dxa"/>
-              <w:end w:w="120" w:type="dxa"/>
-            </w:tcMar>
-          </w:tcPr>
-          <w:p>
-            <w:pPr>
-              <w:spacing w:after="0"/>
-            </w:pPr>
-            <w:r>
-              <w:rPr>
-                <w:sz w:val="18"/>
-              </w:rPr>
-              <w:t>0,80 m</w:t>
-            </w:r>
-          </w:p>
-        </w:tc>
-        <w:tc>
-          <w:tcPr>
-            <w:tcW w:type="dxa" w:w="1814"/>
-            <w:vAlign w:val="center"/>
-            <w:tcMar>
-              <w:top w:w="80" w:type="dxa"/>
-              <w:start w:w="120" w:type="dxa"/>
-              <w:bottom w:w="80" w:type="dxa"/>
-              <w:end w:w="120" w:type="dxa"/>
-            </w:tcMar>
-          </w:tcPr>
-          <w:p>
-            <w:pPr>
-              <w:spacing w:after="0"/>
-            </w:pPr>
-            <w:r>
-              <w:rPr>
-                <w:sz w:val="18"/>
-              </w:rPr>
-              <w:t>30 m2/planta</w:t>
-            </w:r>
-          </w:p>
-        </w:tc>
-        <w:tc>
-          <w:tcPr>
-            <w:tcW w:type="dxa" w:w="1814"/>
-            <w:vAlign w:val="center"/>
-            <w:tcMar>
-              <w:top w:w="80" w:type="dxa"/>
-              <w:start w:w="120" w:type="dxa"/>
-              <w:bottom w:w="80" w:type="dxa"/>
-              <w:end w:w="120" w:type="dxa"/>
-            </w:tcMar>
-          </w:tcPr>
-          <w:p>
-            <w:pPr>
-              <w:spacing w:after="0"/>
-            </w:pPr>
-            <w:r>
-              <w:rPr>
-                <w:sz w:val="18"/>
-              </w:rPr>
-              <w:t>0,55</w:t>
-            </w:r>
-          </w:p>
-        </w:tc>
-        <w:tc>
-          <w:tcPr>
-            <w:tcW w:type="dxa" w:w="1814"/>
-            <w:vAlign w:val="center"/>
-            <w:tcMar>
-              <w:top w:w="80" w:type="dxa"/>
-              <w:start w:w="120" w:type="dxa"/>
-              <w:bottom w:w="80" w:type="dxa"/>
-              <w:end w:w="120" w:type="dxa"/>
-            </w:tcMar>
-          </w:tcPr>
-          <w:p>
-            <w:pPr>
-              <w:spacing w:after="0"/>
-            </w:pPr>
-            <w:r>
-              <w:rPr>
-                <w:sz w:val="18"/>
-              </w:rPr>
-              <w:t>0,90</w:t>
+            <w:tcW w:type="dxa" w:w="4536"/>
+            <w:vAlign w:val="center"/>
+            <w:tcMar>
+              <w:top w:w="80" w:type="dxa"/>
+              <w:start w:w="120" w:type="dxa"/>
+              <w:bottom w:w="80" w:type="dxa"/>
+              <w:end w:w="120" w:type="dxa"/>
+            </w:tcMar>
+          </w:tcPr>
+          <w:p>
+            <w:pPr>
+              <w:spacing w:after="0"/>
+            </w:pPr>
+            <w:r>
+              <w:rPr>
+                <w:sz w:val="18"/>
+              </w:rPr>
+              <w:t>Creación de dataset/tablas en BigQuery</w:t>
+            </w:r>
+          </w:p>
+        </w:tc>
+        <w:tc>
+          <w:tcPr>
+            <w:tcW w:type="dxa" w:w="4536"/>
+            <w:vAlign w:val="center"/>
+            <w:tcMar>
+              <w:top w:w="80" w:type="dxa"/>
+              <w:start w:w="120" w:type="dxa"/>
+              <w:bottom w:w="80" w:type="dxa"/>
+              <w:end w:w="120" w:type="dxa"/>
+            </w:tcMar>
+          </w:tcPr>
+          <w:p>
+            <w:pPr>
+              <w:spacing w:after="0"/>
+            </w:pPr>
+            <w:r>
+              <w:rPr>
+                <w:sz w:val="18"/>
+              </w:rPr>
+              <w:t>No implementada.</w:t>
+            </w:r>
+          </w:p>
+        </w:tc>
+      </w:tr>
+      <w:tr>
+        <w:tc>
+          <w:tcPr>
+            <w:tcW w:type="dxa" w:w="4536"/>
+            <w:vAlign w:val="center"/>
+            <w:tcMar>
+              <w:top w:w="80" w:type="dxa"/>
+              <w:start w:w="120" w:type="dxa"/>
+              <w:bottom w:w="80" w:type="dxa"/>
+              <w:end w:w="120" w:type="dxa"/>
+            </w:tcMar>
+          </w:tcPr>
+          <w:p>
+            <w:pPr>
+              <w:spacing w:after="0"/>
+            </w:pPr>
+            <w:r>
+              <w:rPr>
+                <w:sz w:val="18"/>
+              </w:rPr>
+              <w:t>Ingesta automática en Google Cloud</w:t>
+            </w:r>
+          </w:p>
+        </w:tc>
+        <w:tc>
+          <w:tcPr>
+            <w:tcW w:type="dxa" w:w="4536"/>
+            <w:vAlign w:val="center"/>
+            <w:tcMar>
+              <w:top w:w="80" w:type="dxa"/>
+              <w:start w:w="120" w:type="dxa"/>
+              <w:bottom w:w="80" w:type="dxa"/>
+              <w:end w:w="120" w:type="dxa"/>
+            </w:tcMar>
+          </w:tcPr>
+          <w:p>
+            <w:pPr>
+              <w:spacing w:after="0"/>
+            </w:pPr>
+            <w:r>
+              <w:rPr>
+                <w:sz w:val="18"/>
+              </w:rPr>
+              <w:t>No implementada.</w:t>
             </w:r>
           </w:p>
         </w:tc>
@@ -2169,66 +1795,7 @@
         <w:spacing w:after="120"/>
       </w:pPr>
       <w:r>
-        <w:t>La elección de estos cultivos permite comparar demandas hídricas diferentes dentro de un contexto agrícola mediterráneo.</w:t>
-      </w:r>
-    </w:p>
-    <w:p>
-      <w:pPr>
-        <w:pStyle w:val="Heading2"/>
-      </w:pPr>
-      <w:r>
-        <w:t>2.6 Big Data y BigQuery</w:t>
-      </w:r>
-    </w:p>
-    <w:p>
-      <w:pPr>
-        <w:spacing w:after="120"/>
-      </w:pPr>
-      <w:r>
-        <w:t>El proyecto está preparado para evolucionar desde archivos CSV locales hacia una infraestructura de almacenamiento masivo. Google BigQuery es un almacén de datos gestionado orientado al análisis de grandes volúmenes de información [4].</w:t>
-      </w:r>
-    </w:p>
-    <w:p>
-      <w:pPr>
-        <w:spacing w:after="120"/>
-      </w:pPr>
-      <w:r>
-        <w:t>En el contexto del proyecto, BigQuery tendría tres funciones:</w:t>
-      </w:r>
-    </w:p>
-    <w:p>
-      <w:pPr>
-        <w:pStyle w:val="ListBullet"/>
-        <w:spacing w:after="60"/>
-      </w:pPr>
-      <w:r>
-        <w:t>Centralizar históricos meteorológicos de AEMET.</w:t>
-      </w:r>
-    </w:p>
-    <w:p>
-      <w:pPr>
-        <w:pStyle w:val="ListBullet"/>
-        <w:spacing w:after="60"/>
-      </w:pPr>
-      <w:r>
-        <w:t>Almacenar lecturas IoT de humedad, temperatura y conductividad eléctrica.</w:t>
-      </w:r>
-    </w:p>
-    <w:p>
-      <w:pPr>
-        <w:pStyle w:val="ListBullet"/>
-        <w:spacing w:after="60"/>
-      </w:pPr>
-      <w:r>
-        <w:t>Servir como base para consultas analíticas y entrenamiento de modelos.</w:t>
-      </w:r>
-    </w:p>
-    <w:p>
-      <w:pPr>
-        <w:spacing w:after="120"/>
-      </w:pPr>
-      <w:r>
-        <w:t>La versión actual define la estructura de columnas y el flujo ETL, pero la conexión efectiva con BigQuery queda como despliegue cloud posterior.</w:t>
+        <w:t>Por tanto, BigQuery queda cerrado como alcance preparado pero no desplegado. En la entrega actual no se afirma que exista una infraestructura cloud funcionando.</w:t>
       </w:r>
     </w:p>
     <w:p>
@@ -2357,7 +1924,7 @@
         <w:spacing w:after="60"/>
       </w:pPr>
       <w:r>
-        <w:t>Configuración de cultivo, suelo y parcela.</w:t>
+        <w:t>Configuración de cultivo, fechas y superficie.</w:t>
       </w:r>
     </w:p>
     <w:p>
@@ -2443,7 +2010,7 @@
         <w:spacing w:after="60"/>
       </w:pPr>
       <w:r>
-        <w:t>No presentar la predicción ML como verdad de campo si no está calibrada con sensores reales.</w:t>
+        <w:t>No presentar la predicción ML como verdad de campo sin validación agronómica real.</w:t>
       </w:r>
     </w:p>
     <w:p>
@@ -2690,7 +2257,7 @@
               <w:rPr>
                 <w:sz w:val="18"/>
               </w:rPr>
-              <w:t>Modelado de cultivos, suelos y parcela.</w:t>
+              <w:t>Modelado de cultivos y parcela.</w:t>
             </w:r>
           </w:p>
         </w:tc>
@@ -3645,7 +3212,7 @@
               <w:rPr>
                 <w:sz w:val="18"/>
               </w:rPr>
-              <w:t>Capa prevista para almacenamiento masivo.</w:t>
+              <w:t>Referencia teórica cerrada como no desplegada en el prototipo.</w:t>
             </w:r>
           </w:p>
         </w:tc>
@@ -3688,10 +3255,6 @@
         <w:t xml:space="preserve">    H --&gt; I</w:t>
         <w:br/>
         <w:t xml:space="preserve">    I --&gt; J["Informe y dashboard"]</w:t>
-        <w:br/>
-        <w:t xml:space="preserve">    F -. futuro .-&gt; K["BigQuery"]</w:t>
-        <w:br/>
-        <w:t xml:space="preserve">    L["Sensores IoT"] -. futuro .-&gt; K</w:t>
       </w:r>
     </w:p>
     <w:p>
@@ -3767,7 +3330,7 @@
         <w:t>Carga:</w:t>
       </w:r>
       <w:r>
-        <w:t xml:space="preserve"> generación de un dataset estructurado en CSV y preparación para futura ingesta en BigQuery.</w:t>
+        <w:t xml:space="preserve"> generación de un dataset estructurado en CSV/JSON para análisis local y entrenamiento del modelo.</w:t>
       </w:r>
     </w:p>
     <w:p>
@@ -3900,15 +3463,6 @@
         <w:spacing w:after="60"/>
       </w:pPr>
       <w:r>
-        <w:t>Tipo de suelo.</w:t>
-      </w:r>
-    </w:p>
-    <w:p>
-      <w:pPr>
-        <w:pStyle w:val="ListBullet"/>
-        <w:spacing w:after="60"/>
-      </w:pPr>
-      <w:r>
         <w:t>Superficie.</w:t>
       </w:r>
     </w:p>
@@ -4886,7 +4440,7 @@
         <w:spacing w:after="120"/>
       </w:pPr>
       <w:r>
-        <w:t>El tipo de suelo y la humedad volumétrica inicial no forman parte del cálculo diario estándar. Solo se aplican si se activa la opción de calcular un primer riego hasta capacidad de campo. Por eso se consideran variables auxiliares, no variables principales del servicio.</w:t>
+        <w:t>El perfil de suelo queda fuera del flujo principal. La decisión que recibe el cliente se basa en clima AEMET, cultivo, fase, superficie, lluvia efectiva y eficiencia de riego.</w:t>
       </w:r>
     </w:p>
     <w:p>
@@ -5113,7 +4667,7 @@
               <w:rPr>
                 <w:sz w:val="18"/>
               </w:rPr>
-              <w:t>Variables AEMET, suelo, cultivo y parcela.</w:t>
+              <w:t>Variables AEMET, cultivo y parcela.</w:t>
             </w:r>
           </w:p>
         </w:tc>
@@ -5393,7 +4947,7 @@
               <w:rPr>
                 <w:sz w:val="18"/>
               </w:rPr>
-              <w:t>Pruebas unitarias de riego, lluvia y primer riego.</w:t>
+              <w:t>Pruebas unitarias de riego y lluvia efectiva.</w:t>
             </w:r>
           </w:p>
         </w:tc>
@@ -5792,7 +5346,7 @@
               <w:rPr>
                 <w:sz w:val="18"/>
               </w:rPr>
-              <w:t>Preparar Big Data.</w:t>
+              <w:t>Preparar exportación analítica.</w:t>
             </w:r>
           </w:p>
         </w:tc>
@@ -5815,7 +5369,7 @@
               <w:rPr>
                 <w:sz w:val="18"/>
               </w:rPr>
-              <w:t>Estructura compatible con BigQuery.</w:t>
+              <w:t>CSV/JSON estructurado.</w:t>
             </w:r>
           </w:p>
         </w:tc>
@@ -5861,7 +5415,7 @@
               <w:rPr>
                 <w:sz w:val="18"/>
               </w:rPr>
-              <w:t>Dataset tabular preparado para carga futura.</w:t>
+              <w:t>Dataset tabular preparado para análisis posterior.</w:t>
             </w:r>
           </w:p>
         </w:tc>
@@ -7967,7 +7521,7 @@
               <w:rPr>
                 <w:sz w:val="18"/>
               </w:rPr>
-              <w:t>Diseño de variables de cultivo, suelo y riego.</w:t>
+              <w:t>Diseño de variables de cultivo y riego.</w:t>
             </w:r>
           </w:p>
         </w:tc>
@@ -8436,7 +7990,7 @@
         <w:spacing w:after="120"/>
       </w:pPr>
       <w:r>
-        <w:t>No se calcula un ROI monetario cerrado porque faltan datos reales de explotación: consumo histórico de riego tradicional, precio del agua, coste del servicio, coste de sensores y ahorro confirmado en campo. Para evitar estimaciones no justificadas, el proyecto deja definido el método de cálculo:</w:t>
+        <w:t>No se calcula un ROI monetario cerrado porque faltan datos reales de explotación: consumo histórico de riego tradicional, precio del agua, coste del servicio y ahorro confirmado en campo. Para evitar estimaciones no justificadas, el proyecto deja definido el método de cálculo:</w:t>
       </w:r>
     </w:p>
     <w:p>
@@ -8889,7 +8443,7 @@
               <w:rPr>
                 <w:sz w:val="18"/>
               </w:rPr>
-              <w:t>Prototipo IoT futuro: microcontroladores</w:t>
+              <w:t>Total estimado</w:t>
             </w:r>
           </w:p>
         </w:tc>
@@ -8912,7 +8466,6 @@
               <w:rPr>
                 <w:sz w:val="18"/>
               </w:rPr>
-              <w:t>2</w:t>
             </w:r>
           </w:p>
         </w:tc>
@@ -8935,7 +8488,6 @@
               <w:rPr>
                 <w:sz w:val="18"/>
               </w:rPr>
-              <w:t>20 EUR</w:t>
             </w:r>
           </w:p>
         </w:tc>
@@ -8958,475 +8510,7 @@
               <w:rPr>
                 <w:sz w:val="18"/>
               </w:rPr>
-              <w:t>40 EUR</w:t>
-            </w:r>
-          </w:p>
-        </w:tc>
-      </w:tr>
-      <w:tr>
-        <w:tc>
-          <w:tcPr>
-            <w:tcW w:type="dxa" w:w="2268"/>
-            <w:vAlign w:val="center"/>
-            <w:tcMar>
-              <w:top w:w="80" w:type="dxa"/>
-              <w:start w:w="120" w:type="dxa"/>
-              <w:bottom w:w="80" w:type="dxa"/>
-              <w:end w:w="120" w:type="dxa"/>
-            </w:tcMar>
-          </w:tcPr>
-          <w:p>
-            <w:pPr>
-              <w:spacing w:after="0"/>
-            </w:pPr>
-            <w:r>
-              <w:rPr>
-                <w:sz w:val="18"/>
-              </w:rPr>
-              <w:t>Sensores humedad/temperatura suelo</w:t>
-            </w:r>
-          </w:p>
-        </w:tc>
-        <w:tc>
-          <w:tcPr>
-            <w:tcW w:type="dxa" w:w="2268"/>
-            <w:vAlign w:val="center"/>
-            <w:tcMar>
-              <w:top w:w="80" w:type="dxa"/>
-              <w:start w:w="120" w:type="dxa"/>
-              <w:bottom w:w="80" w:type="dxa"/>
-              <w:end w:w="120" w:type="dxa"/>
-            </w:tcMar>
-          </w:tcPr>
-          <w:p>
-            <w:pPr>
-              <w:spacing w:after="0"/>
-            </w:pPr>
-            <w:r>
-              <w:rPr>
-                <w:sz w:val="18"/>
-              </w:rPr>
-              <w:t>3</w:t>
-            </w:r>
-          </w:p>
-        </w:tc>
-        <w:tc>
-          <w:tcPr>
-            <w:tcW w:type="dxa" w:w="2268"/>
-            <w:vAlign w:val="center"/>
-            <w:tcMar>
-              <w:top w:w="80" w:type="dxa"/>
-              <w:start w:w="120" w:type="dxa"/>
-              <w:bottom w:w="80" w:type="dxa"/>
-              <w:end w:w="120" w:type="dxa"/>
-            </w:tcMar>
-          </w:tcPr>
-          <w:p>
-            <w:pPr>
-              <w:spacing w:after="0"/>
-            </w:pPr>
-            <w:r>
-              <w:rPr>
-                <w:sz w:val="18"/>
-              </w:rPr>
-              <w:t>25 EUR</w:t>
-            </w:r>
-          </w:p>
-        </w:tc>
-        <w:tc>
-          <w:tcPr>
-            <w:tcW w:type="dxa" w:w="2268"/>
-            <w:vAlign w:val="center"/>
-            <w:tcMar>
-              <w:top w:w="80" w:type="dxa"/>
-              <w:start w:w="120" w:type="dxa"/>
-              <w:bottom w:w="80" w:type="dxa"/>
-              <w:end w:w="120" w:type="dxa"/>
-            </w:tcMar>
-          </w:tcPr>
-          <w:p>
-            <w:pPr>
-              <w:spacing w:after="0"/>
-            </w:pPr>
-            <w:r>
-              <w:rPr>
-                <w:sz w:val="18"/>
-              </w:rPr>
-              <w:t>75 EUR</w:t>
-            </w:r>
-          </w:p>
-        </w:tc>
-      </w:tr>
-      <w:tr>
-        <w:tc>
-          <w:tcPr>
-            <w:tcW w:type="dxa" w:w="2268"/>
-            <w:vAlign w:val="center"/>
-            <w:tcMar>
-              <w:top w:w="80" w:type="dxa"/>
-              <w:start w:w="120" w:type="dxa"/>
-              <w:bottom w:w="80" w:type="dxa"/>
-              <w:end w:w="120" w:type="dxa"/>
-            </w:tcMar>
-          </w:tcPr>
-          <w:p>
-            <w:pPr>
-              <w:spacing w:after="0"/>
-            </w:pPr>
-            <w:r>
-              <w:rPr>
-                <w:sz w:val="18"/>
-              </w:rPr>
-              <w:t>Sensor conductividad eléctrica</w:t>
-            </w:r>
-          </w:p>
-        </w:tc>
-        <w:tc>
-          <w:tcPr>
-            <w:tcW w:type="dxa" w:w="2268"/>
-            <w:vAlign w:val="center"/>
-            <w:tcMar>
-              <w:top w:w="80" w:type="dxa"/>
-              <w:start w:w="120" w:type="dxa"/>
-              <w:bottom w:w="80" w:type="dxa"/>
-              <w:end w:w="120" w:type="dxa"/>
-            </w:tcMar>
-          </w:tcPr>
-          <w:p>
-            <w:pPr>
-              <w:spacing w:after="0"/>
-            </w:pPr>
-            <w:r>
-              <w:rPr>
-                <w:sz w:val="18"/>
-              </w:rPr>
-              <w:t>1</w:t>
-            </w:r>
-          </w:p>
-        </w:tc>
-        <w:tc>
-          <w:tcPr>
-            <w:tcW w:type="dxa" w:w="2268"/>
-            <w:vAlign w:val="center"/>
-            <w:tcMar>
-              <w:top w:w="80" w:type="dxa"/>
-              <w:start w:w="120" w:type="dxa"/>
-              <w:bottom w:w="80" w:type="dxa"/>
-              <w:end w:w="120" w:type="dxa"/>
-            </w:tcMar>
-          </w:tcPr>
-          <w:p>
-            <w:pPr>
-              <w:spacing w:after="0"/>
-            </w:pPr>
-            <w:r>
-              <w:rPr>
-                <w:sz w:val="18"/>
-              </w:rPr>
-              <w:t>45 EUR</w:t>
-            </w:r>
-          </w:p>
-        </w:tc>
-        <w:tc>
-          <w:tcPr>
-            <w:tcW w:type="dxa" w:w="2268"/>
-            <w:vAlign w:val="center"/>
-            <w:tcMar>
-              <w:top w:w="80" w:type="dxa"/>
-              <w:start w:w="120" w:type="dxa"/>
-              <w:bottom w:w="80" w:type="dxa"/>
-              <w:end w:w="120" w:type="dxa"/>
-            </w:tcMar>
-          </w:tcPr>
-          <w:p>
-            <w:pPr>
-              <w:spacing w:after="0"/>
-            </w:pPr>
-            <w:r>
-              <w:rPr>
-                <w:sz w:val="18"/>
-              </w:rPr>
-              <w:t>45 EUR</w:t>
-            </w:r>
-          </w:p>
-        </w:tc>
-      </w:tr>
-      <w:tr>
-        <w:tc>
-          <w:tcPr>
-            <w:tcW w:type="dxa" w:w="2268"/>
-            <w:vAlign w:val="center"/>
-            <w:tcMar>
-              <w:top w:w="80" w:type="dxa"/>
-              <w:start w:w="120" w:type="dxa"/>
-              <w:bottom w:w="80" w:type="dxa"/>
-              <w:end w:w="120" w:type="dxa"/>
-            </w:tcMar>
-          </w:tcPr>
-          <w:p>
-            <w:pPr>
-              <w:spacing w:after="0"/>
-            </w:pPr>
-            <w:r>
-              <w:rPr>
-                <w:sz w:val="18"/>
-              </w:rPr>
-              <w:t>Comunicaciones y alimentación</w:t>
-            </w:r>
-          </w:p>
-        </w:tc>
-        <w:tc>
-          <w:tcPr>
-            <w:tcW w:type="dxa" w:w="2268"/>
-            <w:vAlign w:val="center"/>
-            <w:tcMar>
-              <w:top w:w="80" w:type="dxa"/>
-              <w:start w:w="120" w:type="dxa"/>
-              <w:bottom w:w="80" w:type="dxa"/>
-              <w:end w:w="120" w:type="dxa"/>
-            </w:tcMar>
-          </w:tcPr>
-          <w:p>
-            <w:pPr>
-              <w:spacing w:after="0"/>
-            </w:pPr>
-            <w:r>
-              <w:rPr>
-                <w:sz w:val="18"/>
-              </w:rPr>
-              <w:t>1</w:t>
-            </w:r>
-          </w:p>
-        </w:tc>
-        <w:tc>
-          <w:tcPr>
-            <w:tcW w:type="dxa" w:w="2268"/>
-            <w:vAlign w:val="center"/>
-            <w:tcMar>
-              <w:top w:w="80" w:type="dxa"/>
-              <w:start w:w="120" w:type="dxa"/>
-              <w:bottom w:w="80" w:type="dxa"/>
-              <w:end w:w="120" w:type="dxa"/>
-            </w:tcMar>
-          </w:tcPr>
-          <w:p>
-            <w:pPr>
-              <w:spacing w:after="0"/>
-            </w:pPr>
-            <w:r>
-              <w:rPr>
-                <w:sz w:val="18"/>
-              </w:rPr>
-              <w:t>60 EUR</w:t>
-            </w:r>
-          </w:p>
-        </w:tc>
-        <w:tc>
-          <w:tcPr>
-            <w:tcW w:type="dxa" w:w="2268"/>
-            <w:vAlign w:val="center"/>
-            <w:tcMar>
-              <w:top w:w="80" w:type="dxa"/>
-              <w:start w:w="120" w:type="dxa"/>
-              <w:bottom w:w="80" w:type="dxa"/>
-              <w:end w:w="120" w:type="dxa"/>
-            </w:tcMar>
-          </w:tcPr>
-          <w:p>
-            <w:pPr>
-              <w:spacing w:after="0"/>
-            </w:pPr>
-            <w:r>
-              <w:rPr>
-                <w:sz w:val="18"/>
-              </w:rPr>
-              <w:t>60 EUR</w:t>
-            </w:r>
-          </w:p>
-        </w:tc>
-      </w:tr>
-      <w:tr>
-        <w:tc>
-          <w:tcPr>
-            <w:tcW w:type="dxa" w:w="2268"/>
-            <w:vAlign w:val="center"/>
-            <w:tcMar>
-              <w:top w:w="80" w:type="dxa"/>
-              <w:start w:w="120" w:type="dxa"/>
-              <w:bottom w:w="80" w:type="dxa"/>
-              <w:end w:w="120" w:type="dxa"/>
-            </w:tcMar>
-          </w:tcPr>
-          <w:p>
-            <w:pPr>
-              <w:spacing w:after="0"/>
-            </w:pPr>
-            <w:r>
-              <w:rPr>
-                <w:sz w:val="18"/>
-              </w:rPr>
-              <w:t>Uso inicial de cloud/BigQuery</w:t>
-            </w:r>
-          </w:p>
-        </w:tc>
-        <w:tc>
-          <w:tcPr>
-            <w:tcW w:type="dxa" w:w="2268"/>
-            <w:vAlign w:val="center"/>
-            <w:tcMar>
-              <w:top w:w="80" w:type="dxa"/>
-              <w:start w:w="120" w:type="dxa"/>
-              <w:bottom w:w="80" w:type="dxa"/>
-              <w:end w:w="120" w:type="dxa"/>
-            </w:tcMar>
-          </w:tcPr>
-          <w:p>
-            <w:pPr>
-              <w:spacing w:after="0"/>
-            </w:pPr>
-            <w:r>
-              <w:rPr>
-                <w:sz w:val="18"/>
-              </w:rPr>
-              <w:t>1</w:t>
-            </w:r>
-          </w:p>
-        </w:tc>
-        <w:tc>
-          <w:tcPr>
-            <w:tcW w:type="dxa" w:w="2268"/>
-            <w:vAlign w:val="center"/>
-            <w:tcMar>
-              <w:top w:w="80" w:type="dxa"/>
-              <w:start w:w="120" w:type="dxa"/>
-              <w:bottom w:w="80" w:type="dxa"/>
-              <w:end w:w="120" w:type="dxa"/>
-            </w:tcMar>
-          </w:tcPr>
-          <w:p>
-            <w:pPr>
-              <w:spacing w:after="0"/>
-            </w:pPr>
-            <w:r>
-              <w:rPr>
-                <w:sz w:val="18"/>
-              </w:rPr>
-              <w:t>0-30 EUR</w:t>
-            </w:r>
-          </w:p>
-        </w:tc>
-        <w:tc>
-          <w:tcPr>
-            <w:tcW w:type="dxa" w:w="2268"/>
-            <w:vAlign w:val="center"/>
-            <w:tcMar>
-              <w:top w:w="80" w:type="dxa"/>
-              <w:start w:w="120" w:type="dxa"/>
-              <w:bottom w:w="80" w:type="dxa"/>
-              <w:end w:w="120" w:type="dxa"/>
-            </w:tcMar>
-          </w:tcPr>
-          <w:p>
-            <w:pPr>
-              <w:spacing w:after="0"/>
-            </w:pPr>
-            <w:r>
-              <w:rPr>
-                <w:sz w:val="18"/>
-              </w:rPr>
-              <w:t>30 EUR</w:t>
-            </w:r>
-          </w:p>
-        </w:tc>
-      </w:tr>
-      <w:tr>
-        <w:tc>
-          <w:tcPr>
-            <w:tcW w:type="dxa" w:w="2268"/>
-            <w:vAlign w:val="center"/>
-            <w:tcMar>
-              <w:top w:w="80" w:type="dxa"/>
-              <w:start w:w="120" w:type="dxa"/>
-              <w:bottom w:w="80" w:type="dxa"/>
-              <w:end w:w="120" w:type="dxa"/>
-            </w:tcMar>
-          </w:tcPr>
-          <w:p>
-            <w:pPr>
-              <w:spacing w:after="0"/>
-            </w:pPr>
-            <w:r>
-              <w:rPr>
-                <w:sz w:val="18"/>
-              </w:rPr>
-              <w:t>Total estimado</w:t>
-            </w:r>
-          </w:p>
-        </w:tc>
-        <w:tc>
-          <w:tcPr>
-            <w:tcW w:type="dxa" w:w="2268"/>
-            <w:vAlign w:val="center"/>
-            <w:tcMar>
-              <w:top w:w="80" w:type="dxa"/>
-              <w:start w:w="120" w:type="dxa"/>
-              <w:bottom w:w="80" w:type="dxa"/>
-              <w:end w:w="120" w:type="dxa"/>
-            </w:tcMar>
-          </w:tcPr>
-          <w:p>
-            <w:pPr>
-              <w:spacing w:after="0"/>
-            </w:pPr>
-            <w:r>
-              <w:rPr>
-                <w:sz w:val="18"/>
-              </w:rPr>
-            </w:r>
-          </w:p>
-        </w:tc>
-        <w:tc>
-          <w:tcPr>
-            <w:tcW w:type="dxa" w:w="2268"/>
-            <w:vAlign w:val="center"/>
-            <w:tcMar>
-              <w:top w:w="80" w:type="dxa"/>
-              <w:start w:w="120" w:type="dxa"/>
-              <w:bottom w:w="80" w:type="dxa"/>
-              <w:end w:w="120" w:type="dxa"/>
-            </w:tcMar>
-          </w:tcPr>
-          <w:p>
-            <w:pPr>
-              <w:spacing w:after="0"/>
-            </w:pPr>
-            <w:r>
-              <w:rPr>
-                <w:sz w:val="18"/>
-              </w:rPr>
-            </w:r>
-          </w:p>
-        </w:tc>
-        <w:tc>
-          <w:tcPr>
-            <w:tcW w:type="dxa" w:w="2268"/>
-            <w:vAlign w:val="center"/>
-            <w:tcMar>
-              <w:top w:w="80" w:type="dxa"/>
-              <w:start w:w="120" w:type="dxa"/>
-              <w:bottom w:w="80" w:type="dxa"/>
-              <w:end w:w="120" w:type="dxa"/>
-            </w:tcMar>
-          </w:tcPr>
-          <w:p>
-            <w:pPr>
-              <w:spacing w:after="0"/>
-            </w:pPr>
-            <w:r>
-              <w:rPr>
-                <w:sz w:val="18"/>
-              </w:rPr>
-              <w:t>1.450 EUR</w:t>
+              <w:t>1.200 EUR</w:t>
             </w:r>
           </w:p>
         </w:tc>
@@ -9438,7 +8522,7 @@
         <w:spacing w:after="120"/>
       </w:pPr>
       <w:r>
-        <w:t>El presupuesto distingue entre el prototipo software ya desarrollado y una posible instalación IoT en campo. Las herramientas principales utilizadas son gratuitas o de código abierto.</w:t>
+        <w:t>El presupuesto corresponde al prototipo software desarrollado. No se incluyen sensores IoT ni costes cloud porque no forman parte del entregable implementado.</w:t>
       </w:r>
     </w:p>
     <w:p>
@@ -9576,7 +8660,7 @@
         <w:spacing w:after="60"/>
       </w:pPr>
       <w:r>
-        <w:t>Configuración de cultivo, fase fenológica, suelo y parcela.</w:t>
+        <w:t>Configuración de cultivo, fase fenológica y superficie de parcela.</w:t>
       </w:r>
     </w:p>
     <w:p>
@@ -9892,7 +8976,7 @@
               <w:rPr>
                 <w:sz w:val="18"/>
               </w:rPr>
-              <w:t>Modelos de datos, cultivos y suelos.</w:t>
+              <w:t>Modelos de datos y cultivos.</w:t>
             </w:r>
           </w:p>
         </w:tc>
@@ -10956,7 +10040,7 @@
         <w:spacing w:after="120"/>
       </w:pPr>
       <w:r>
-        <w:t>Para una parcela de 3.500 m2 de olivar en fase media, suelo franco, estación Sevilla Aeropuerto y periodo del 1 al 7 de mayo de 2024, el sistema generó:</w:t>
+        <w:t>Para una parcela de 3.500 m2 de olivar en fase media, estación Sevilla Aeropuerto y periodo del 1 al 7 de mayo de 2024, el sistema generó:</w:t>
       </w:r>
     </w:p>
     <w:tbl>
@@ -11648,7 +10732,7 @@
         <w:spacing w:after="120"/>
       </w:pPr>
       <w:r>
-        <w:t>El modelo supera el umbral del 85 % si se interpreta la precisión como R2 en un problema de regresión. No obstante, este dato debe presentarse con rigor: el modelo aprende a reproducir el cálculo agronómico sobre el dataset generado, no una verdad de campo medida con sensores.</w:t>
+        <w:t>El modelo supera el umbral del 85 % si se interpreta la precisión como R2 en un problema de regresión. No obstante, este dato debe presentarse con rigor: el modelo aprende a reproducir el cálculo agronómico sobre el dataset generado, no una verdad de campo medida.</w:t>
       </w:r>
     </w:p>
     <w:p>
@@ -12111,15 +11195,6 @@
         <w:spacing w:after="60"/>
       </w:pPr>
       <w:r>
-        <w:t>Primer riego hasta capacidad de campo.</w:t>
-      </w:r>
-    </w:p>
-    <w:p>
-      <w:pPr>
-        <w:pStyle w:val="ListBullet"/>
-        <w:spacing w:after="60"/>
-      </w:pPr>
-      <w:r>
         <w:t>Estimación ET0.</w:t>
       </w:r>
     </w:p>
@@ -12181,7 +11256,7 @@
         <w:spacing w:after="120"/>
       </w:pPr>
       <w:r>
-        <w:t>Las siguientes capturas corresponden a una ejecución real del prototipo. El escenario utilizado para documentar la prueba es: estación AEMET Sevilla Aeropuerto, periodo del 01/05/2024 al 07/05/2024, cultivo olivar, fase media, suelo franco, superficie de 3.500 m2 y modelo ML activado.</w:t>
+        <w:t>Las siguientes capturas corresponden a una ejecución real del prototipo. El escenario utilizado para documentar la prueba es: estación AEMET Sevilla Aeropuerto, periodo del 01/05/2024 al 07/05/2024, cultivo olivar, fase media, superficie de 3.500 m2 y modelo ML activado.</w:t>
       </w:r>
     </w:p>
     <w:tbl>
@@ -12339,7 +11414,7 @@
               <w:rPr>
                 <w:sz w:val="18"/>
               </w:rPr>
-              <w:t>Formulario principal de configuración de estación, fechas, cultivo, suelo y parcela.</w:t>
+              <w:t>Formulario principal de configuración de estación, fechas, cultivo y superficie.</w:t>
             </w:r>
           </w:p>
         </w:tc>
@@ -12654,7 +11729,7 @@
       <w:r>
         <w:drawing>
           <wp:inline xmlns:a="http://schemas.openxmlformats.org/drawingml/2006/main" xmlns:pic="http://schemas.openxmlformats.org/drawingml/2006/picture">
-            <wp:extent cx="5669280" cy="3768783"/>
+            <wp:extent cx="5669280" cy="3410874"/>
             <wp:docPr id="1" name="Picture 1"/>
             <wp:cNvGraphicFramePr>
               <a:graphicFrameLocks noChangeAspect="1"/>
@@ -12675,7 +11750,7 @@
                   <pic:spPr>
                     <a:xfrm>
                       <a:off x="0" y="0"/>
-                      <a:ext cx="5669280" cy="3768783"/>
+                      <a:ext cx="5669280" cy="3410874"/>
                     </a:xfrm>
                     <a:prstGeom prst="rect"/>
                   </pic:spPr>
@@ -12706,7 +11781,7 @@
       <w:r>
         <w:drawing>
           <wp:inline xmlns:a="http://schemas.openxmlformats.org/drawingml/2006/main" xmlns:pic="http://schemas.openxmlformats.org/drawingml/2006/picture">
-            <wp:extent cx="5669280" cy="3768783"/>
+            <wp:extent cx="5669280" cy="3410874"/>
             <wp:docPr id="2" name="Picture 2"/>
             <wp:cNvGraphicFramePr>
               <a:graphicFrameLocks noChangeAspect="1"/>
@@ -12727,7 +11802,7 @@
                   <pic:spPr>
                     <a:xfrm>
                       <a:off x="0" y="0"/>
-                      <a:ext cx="5669280" cy="3768783"/>
+                      <a:ext cx="5669280" cy="3410874"/>
                     </a:xfrm>
                     <a:prstGeom prst="rect"/>
                   </pic:spPr>
@@ -12758,7 +11833,7 @@
       <w:r>
         <w:drawing>
           <wp:inline xmlns:a="http://schemas.openxmlformats.org/drawingml/2006/main" xmlns:pic="http://schemas.openxmlformats.org/drawingml/2006/picture">
-            <wp:extent cx="5669280" cy="3768783"/>
+            <wp:extent cx="5669280" cy="3410874"/>
             <wp:docPr id="3" name="Picture 3"/>
             <wp:cNvGraphicFramePr>
               <a:graphicFrameLocks noChangeAspect="1"/>
@@ -12779,7 +11854,7 @@
                   <pic:spPr>
                     <a:xfrm>
                       <a:off x="0" y="0"/>
-                      <a:ext cx="5669280" cy="3768783"/>
+                      <a:ext cx="5669280" cy="3410874"/>
                     </a:xfrm>
                     <a:prstGeom prst="rect"/>
                   </pic:spPr>
@@ -12810,7 +11885,7 @@
       <w:r>
         <w:drawing>
           <wp:inline xmlns:a="http://schemas.openxmlformats.org/drawingml/2006/main" xmlns:pic="http://schemas.openxmlformats.org/drawingml/2006/picture">
-            <wp:extent cx="5669280" cy="3768783"/>
+            <wp:extent cx="5669280" cy="3410874"/>
             <wp:docPr id="4" name="Picture 4"/>
             <wp:cNvGraphicFramePr>
               <a:graphicFrameLocks noChangeAspect="1"/>
@@ -12831,7 +11906,7 @@
                   <pic:spPr>
                     <a:xfrm>
                       <a:off x="0" y="0"/>
-                      <a:ext cx="5669280" cy="3768783"/>
+                      <a:ext cx="5669280" cy="3410874"/>
                     </a:xfrm>
                     <a:prstGeom prst="rect"/>
                   </pic:spPr>
@@ -12862,7 +11937,7 @@
       <w:r>
         <w:drawing>
           <wp:inline xmlns:a="http://schemas.openxmlformats.org/drawingml/2006/main" xmlns:pic="http://schemas.openxmlformats.org/drawingml/2006/picture">
-            <wp:extent cx="5669280" cy="3768783"/>
+            <wp:extent cx="5669280" cy="3410874"/>
             <wp:docPr id="5" name="Picture 5"/>
             <wp:cNvGraphicFramePr>
               <a:graphicFrameLocks noChangeAspect="1"/>
@@ -12883,7 +11958,7 @@
                   <pic:spPr>
                     <a:xfrm>
                       <a:off x="0" y="0"/>
-                      <a:ext cx="5669280" cy="3768783"/>
+                      <a:ext cx="5669280" cy="3410874"/>
                     </a:xfrm>
                     <a:prstGeom prst="rect"/>
                   </pic:spPr>
@@ -12914,7 +11989,7 @@
       <w:r>
         <w:drawing>
           <wp:inline xmlns:a="http://schemas.openxmlformats.org/drawingml/2006/main" xmlns:pic="http://schemas.openxmlformats.org/drawingml/2006/picture">
-            <wp:extent cx="5669280" cy="3768783"/>
+            <wp:extent cx="5669280" cy="3410874"/>
             <wp:docPr id="6" name="Picture 6"/>
             <wp:cNvGraphicFramePr>
               <a:graphicFrameLocks noChangeAspect="1"/>
@@ -12935,7 +12010,7 @@
                   <pic:spPr>
                     <a:xfrm>
                       <a:off x="0" y="0"/>
-                      <a:ext cx="5669280" cy="3768783"/>
+                      <a:ext cx="5669280" cy="3410874"/>
                     </a:xfrm>
                     <a:prstGeom prst="rect"/>
                   </pic:spPr>
@@ -13263,7 +12338,7 @@
               <w:rPr>
                 <w:sz w:val="18"/>
               </w:rPr>
-              <w:t>Variables AEMET, suelo, cultivo y parcela definidas.</w:t>
+              <w:t>Variables AEMET, cultivo y parcela definidas.</w:t>
             </w:r>
           </w:p>
         </w:tc>
@@ -13545,7 +12620,7 @@
               <w:rPr>
                 <w:sz w:val="18"/>
               </w:rPr>
-              <w:t>Olivar, cítricos y almendro con Kc, raíz, marco y agotamiento propios.</w:t>
+              <w:t>Olivar, cítricos y almendro con Kc y marco por planta propios.</w:t>
             </w:r>
           </w:p>
         </w:tc>
@@ -13733,7 +12808,7 @@
               <w:rPr>
                 <w:sz w:val="18"/>
               </w:rPr>
-              <w:t>App Streamlit con estación, cultivo, suelo, parcela y ML opcional.</w:t>
+              <w:t>App Streamlit con estación, fechas, cultivo, superficie y ML opcional.</w:t>
             </w:r>
           </w:p>
         </w:tc>
@@ -13781,7 +12856,7 @@
               <w:rPr>
                 <w:sz w:val="18"/>
               </w:rPr>
-              <w:t>Preparar almacenamiento masivo.</w:t>
+              <w:t>Preparar exportación analítica.</w:t>
             </w:r>
           </w:p>
         </w:tc>
@@ -13804,7 +12879,7 @@
               <w:rPr>
                 <w:sz w:val="18"/>
               </w:rPr>
-              <w:t>Parcial</w:t>
+              <w:t>Cumplido</w:t>
             </w:r>
           </w:p>
         </w:tc>
@@ -13827,7 +12902,7 @@
               <w:rPr>
                 <w:sz w:val="18"/>
               </w:rPr>
-              <w:t>Dataset exportable y estructura compatible; despliegue BigQuery pendiente.</w:t>
+              <w:t>Dataset CSV/JSON exportable; BigQuery queda fuera del despliegue.</w:t>
             </w:r>
           </w:p>
         </w:tc>
@@ -13989,7 +13064,7 @@
               <w:rPr>
                 <w:sz w:val="18"/>
               </w:rPr>
-              <w:t>La estructura de datos climáticos, edáficos, fisiológicos y de parcela queda definida y preparada para ampliarse con sensores IoT.</w:t>
+              <w:t>La estructura de datos climáticos, de cultivo y de parcela queda definida y alineada con el cálculo de riego.</w:t>
             </w:r>
           </w:p>
         </w:tc>
@@ -14277,7 +13352,7 @@
               <w:rPr>
                 <w:sz w:val="18"/>
               </w:rPr>
-              <w:t>La estructura exportable deja preparado el salto a BigQuery y a una arquitectura de análisis masivo.</w:t>
+              <w:t>La estructura exportable permite revisar los datos, repetir pruebas y alimentar el entrenamiento ML sin depender de infraestructura cloud.</w:t>
             </w:r>
           </w:p>
         </w:tc>
@@ -14289,7 +13364,7 @@
         <w:spacing w:after="120"/>
       </w:pPr>
       <w:r>
-        <w:t>El objetivo general se alcanza a nivel de prototipo: el sistema analiza datos meteorológicos y agronómicos para optimizar la recomendación de riego. La validación comercial real queda condicionada a la incorporación de sensores, histórico de riego aplicado y contraste con parcelas reales.</w:t>
+        <w:t>El objetivo general se alcanza a nivel de prototipo: el sistema analiza datos meteorológicos y agronómicos para optimizar la recomendación de riego. La validación comercial real queda condicionada a disponer de histórico de riego aplicado y contraste con parcelas reales.</w:t>
       </w:r>
     </w:p>
     <w:p>
@@ -14332,7 +13407,7 @@
         <w:spacing w:after="60"/>
       </w:pPr>
       <w:r>
-        <w:t>Modelado de cultivos, suelos y parcelas.</w:t>
+        <w:t>Modelado de cultivos y parcelas.</w:t>
       </w:r>
     </w:p>
     <w:p>
@@ -14447,7 +13522,7 @@
         <w:spacing w:after="60"/>
       </w:pPr>
       <w:r>
-        <w:t>Evitar que el objetivo de Machine Learning se presente como precisión absoluta cuando todavía no hay sensores reales de campo.</w:t>
+        <w:t>Evitar que el objetivo de Machine Learning se presente como precisión absoluta cuando todavía no hay validación real de campo.</w:t>
       </w:r>
     </w:p>
     <w:p>
@@ -14481,7 +13556,7 @@
         <w:spacing w:after="60"/>
       </w:pPr>
       <w:r>
-        <w:t>Incorporar sensores IoT reales de humedad del suelo, temperatura y conductividad eléctrica.</w:t>
+        <w:t>Integrar sensores IoT solo como mejora futura, si el servicio necesita datos de campo en tiempo real.</w:t>
       </w:r>
     </w:p>
     <w:p>
@@ -14490,16 +13565,7 @@
         <w:spacing w:after="60"/>
       </w:pPr>
       <w:r>
-        <w:t>Guardar históricos en BigQuery.</w:t>
-      </w:r>
-    </w:p>
-    <w:p>
-      <w:pPr>
-        <w:pStyle w:val="ListBullet"/>
-        <w:spacing w:after="60"/>
-      </w:pPr>
-      <w:r>
-        <w:t>Añadir NDVI mediante imágenes satelitales.</w:t>
+        <w:t>Desplegar BigQuery solo si el volumen de datos requiere una infraestructura cloud.</w:t>
       </w:r>
     </w:p>
     <w:p>
@@ -14796,8 +13862,6 @@
         <w:br/>
         <w:t xml:space="preserve">  --stage media `</w:t>
         <w:br/>
-        <w:t xml:space="preserve">  --soil franco `</w:t>
-        <w:br/>
         <w:t xml:space="preserve">  --area-m2 3500 `</w:t>
         <w:br/>
         <w:t xml:space="preserve">  --output markdown</w:t>
@@ -14816,7 +13880,7 @@
         <w:spacing w:after="120"/>
       </w:pPr>
       <w:r>
-        <w:t>El cálculo principal no necesita información hidráulica de goteros ni sensores no integrados. Las variables mínimas que explican el resultado son las siguientes:</w:t>
+        <w:t>El cálculo principal no necesita información hidráulica de goteros ni variables no aplicadas. Las variables mínimas que explican el resultado son las siguientes:</w:t>
       </w:r>
     </w:p>
     <w:tbl>
@@ -15571,7 +14635,7 @@
         <w:spacing w:after="60"/>
       </w:pPr>
       <w:r>
-        <w:t>El modelo no incorpora todavía sensores reales de humedad del suelo.</w:t>
+        <w:t>El modelo no incorpora todavía datos reales de riego aplicado en campo.</w:t>
       </w:r>
     </w:p>
     <w:p>
@@ -15580,7 +14644,7 @@
         <w:spacing w:after="60"/>
       </w:pPr>
       <w:r>
-        <w:t>BigQuery está definido como arquitectura, pero no desplegado.</w:t>
+        <w:t>BigQuery queda definido como posible destino analítico, pero no desplegado.</w:t>
       </w:r>
     </w:p>
     <w:p>
@@ -15870,7 +14934,7 @@
               <w:rPr>
                 <w:sz w:val="18"/>
               </w:rPr>
-              <w:t>Como usuario, quiero introducir cultivo, fase, suelo y superficie para adaptar el cálculo a mi parcela.</w:t>
+              <w:t>Como usuario, quiero introducir cultivo, fase y superficie para adaptar el cálculo a mi parcela.</w:t>
             </w:r>
           </w:p>
         </w:tc>
@@ -16152,7 +15216,7 @@
               <w:rPr>
                 <w:sz w:val="18"/>
               </w:rPr>
-              <w:t>Como desarrollador, quiero exportar datasets CSV/JSON para análisis y BigQuery.</w:t>
+              <w:t>Como desarrollador, quiero exportar datasets CSV/JSON para análisis local y entrenamiento ML.</w:t>
             </w:r>
           </w:p>
         </w:tc>
@@ -16434,7 +15498,7 @@
               <w:rPr>
                 <w:sz w:val="18"/>
               </w:rPr>
-              <w:t>Como responsable técnico, quiero integrar sensores IoT reales.</w:t>
+              <w:t>Como responsable técnico, quiero estudiar una integración IoT futura.</w:t>
             </w:r>
           </w:p>
         </w:tc>
@@ -16457,7 +15521,7 @@
               <w:rPr>
                 <w:sz w:val="18"/>
               </w:rPr>
-              <w:t>Alta</w:t>
+              <w:t>Baja</w:t>
             </w:r>
           </w:p>
         </w:tc>
@@ -16865,7 +15929,7 @@
               <w:rPr>
                 <w:sz w:val="18"/>
               </w:rPr>
-              <w:t>Definir cultivos, suelos, ET0, Kc y fórmula de riego.</w:t>
+              <w:t>Definir cultivos, ET0, Kc y fórmula de riego.</w:t>
             </w:r>
           </w:p>
         </w:tc>

</xml_diff>

<commit_message>
Documentar indicadores y corregir informes descargables
</commit_message>
<xml_diff>
--- a/docs/memoria_proyecto_intermodular.docx
+++ b/docs/memoria_proyecto_intermodular.docx
@@ -10458,7 +10458,1277 @@
         <w:pStyle w:val="Heading2"/>
       </w:pPr>
       <w:r>
-        <w:t>4.5 Resultado del modelo ML/Keras</w:t>
+        <w:t>4.5 Interpretación de los indicadores de la aplicación</w:t>
+      </w:r>
+    </w:p>
+    <w:p>
+      <w:pPr>
+        <w:spacing w:after="120"/>
+      </w:pPr>
+      <w:r>
+        <w:t>La interfaz muestra únicamente indicadores necesarios para que el usuario pueda decidir cuánta agua debe aplicar. Cada resultado se interpreta de la siguiente forma:</w:t>
+      </w:r>
+    </w:p>
+    <w:tbl>
+      <w:tblPr>
+        <w:tblStyle w:val="TableGrid"/>
+        <w:tblW w:type="auto" w:w="0"/>
+        <w:jc w:val="center"/>
+        <w:tblLayout w:type="autofit"/>
+        <w:tblLook w:firstColumn="1" w:firstRow="1" w:lastColumn="0" w:lastRow="0" w:noHBand="0" w:noVBand="1" w:val="04A0"/>
+      </w:tblPr>
+      <w:tblGrid>
+        <w:gridCol w:w="2268"/>
+        <w:gridCol w:w="2268"/>
+        <w:gridCol w:w="2268"/>
+        <w:gridCol w:w="2268"/>
+      </w:tblGrid>
+      <w:tr>
+        <w:tc>
+          <w:tcPr>
+            <w:tcW w:type="dxa" w:w="2268"/>
+            <w:vAlign w:val="center"/>
+            <w:tcMar>
+              <w:top w:w="80" w:type="dxa"/>
+              <w:start w:w="120" w:type="dxa"/>
+              <w:bottom w:w="80" w:type="dxa"/>
+              <w:end w:w="120" w:type="dxa"/>
+            </w:tcMar>
+            <w:shd w:fill="E8EEF5"/>
+          </w:tcPr>
+          <w:p>
+            <w:pPr>
+              <w:spacing w:after="0"/>
+            </w:pPr>
+            <w:r>
+              <w:rPr>
+                <w:b/>
+                <w:sz w:val="18"/>
+              </w:rPr>
+              <w:t>Indicador de la app</w:t>
+            </w:r>
+          </w:p>
+        </w:tc>
+        <w:tc>
+          <w:tcPr>
+            <w:tcW w:type="dxa" w:w="2268"/>
+            <w:vAlign w:val="center"/>
+            <w:tcMar>
+              <w:top w:w="80" w:type="dxa"/>
+              <w:start w:w="120" w:type="dxa"/>
+              <w:bottom w:w="80" w:type="dxa"/>
+              <w:end w:w="120" w:type="dxa"/>
+            </w:tcMar>
+            <w:shd w:fill="E8EEF5"/>
+          </w:tcPr>
+          <w:p>
+            <w:pPr>
+              <w:spacing w:after="0"/>
+            </w:pPr>
+            <w:r>
+              <w:rPr>
+                <w:b/>
+                <w:sz w:val="18"/>
+              </w:rPr>
+              <w:t>Unidad</w:t>
+            </w:r>
+          </w:p>
+        </w:tc>
+        <w:tc>
+          <w:tcPr>
+            <w:tcW w:type="dxa" w:w="2268"/>
+            <w:vAlign w:val="center"/>
+            <w:tcMar>
+              <w:top w:w="80" w:type="dxa"/>
+              <w:start w:w="120" w:type="dxa"/>
+              <w:bottom w:w="80" w:type="dxa"/>
+              <w:end w:w="120" w:type="dxa"/>
+            </w:tcMar>
+            <w:shd w:fill="E8EEF5"/>
+          </w:tcPr>
+          <w:p>
+            <w:pPr>
+              <w:spacing w:after="0"/>
+            </w:pPr>
+            <w:r>
+              <w:rPr>
+                <w:b/>
+                <w:sz w:val="18"/>
+              </w:rPr>
+              <w:t>Significado</w:t>
+            </w:r>
+          </w:p>
+        </w:tc>
+        <w:tc>
+          <w:tcPr>
+            <w:tcW w:type="dxa" w:w="2268"/>
+            <w:vAlign w:val="center"/>
+            <w:tcMar>
+              <w:top w:w="80" w:type="dxa"/>
+              <w:start w:w="120" w:type="dxa"/>
+              <w:bottom w:w="80" w:type="dxa"/>
+              <w:end w:w="120" w:type="dxa"/>
+            </w:tcMar>
+            <w:shd w:fill="E8EEF5"/>
+          </w:tcPr>
+          <w:p>
+            <w:pPr>
+              <w:spacing w:after="0"/>
+            </w:pPr>
+            <w:r>
+              <w:rPr>
+                <w:b/>
+                <w:sz w:val="18"/>
+              </w:rPr>
+              <w:t>Utilidad para el cliente</w:t>
+            </w:r>
+          </w:p>
+        </w:tc>
+      </w:tr>
+      <w:tr>
+        <w:tc>
+          <w:tcPr>
+            <w:tcW w:type="dxa" w:w="2268"/>
+            <w:vAlign w:val="center"/>
+            <w:tcMar>
+              <w:top w:w="80" w:type="dxa"/>
+              <w:start w:w="120" w:type="dxa"/>
+              <w:bottom w:w="80" w:type="dxa"/>
+              <w:end w:w="120" w:type="dxa"/>
+            </w:tcMar>
+          </w:tcPr>
+          <w:p>
+            <w:pPr>
+              <w:spacing w:after="0"/>
+            </w:pPr>
+            <w:r>
+              <w:rPr>
+                <w:sz w:val="18"/>
+              </w:rPr>
+              <w:t>Riego total</w:t>
+            </w:r>
+          </w:p>
+        </w:tc>
+        <w:tc>
+          <w:tcPr>
+            <w:tcW w:type="dxa" w:w="2268"/>
+            <w:vAlign w:val="center"/>
+            <w:tcMar>
+              <w:top w:w="80" w:type="dxa"/>
+              <w:start w:w="120" w:type="dxa"/>
+              <w:bottom w:w="80" w:type="dxa"/>
+              <w:end w:w="120" w:type="dxa"/>
+            </w:tcMar>
+          </w:tcPr>
+          <w:p>
+            <w:pPr>
+              <w:spacing w:after="0"/>
+            </w:pPr>
+            <w:r>
+              <w:rPr>
+                <w:sz w:val="18"/>
+              </w:rPr>
+              <w:t>L</w:t>
+            </w:r>
+          </w:p>
+        </w:tc>
+        <w:tc>
+          <w:tcPr>
+            <w:tcW w:type="dxa" w:w="2268"/>
+            <w:vAlign w:val="center"/>
+            <w:tcMar>
+              <w:top w:w="80" w:type="dxa"/>
+              <w:start w:w="120" w:type="dxa"/>
+              <w:bottom w:w="80" w:type="dxa"/>
+              <w:end w:w="120" w:type="dxa"/>
+            </w:tcMar>
+          </w:tcPr>
+          <w:p>
+            <w:pPr>
+              <w:spacing w:after="0"/>
+            </w:pPr>
+            <w:r>
+              <w:rPr>
+                <w:sz w:val="18"/>
+              </w:rPr>
+              <w:t>Volumen total recomendado para toda la parcela durante el periodo seleccionado.</w:t>
+            </w:r>
+          </w:p>
+        </w:tc>
+        <w:tc>
+          <w:tcPr>
+            <w:tcW w:type="dxa" w:w="2268"/>
+            <w:vAlign w:val="center"/>
+            <w:tcMar>
+              <w:top w:w="80" w:type="dxa"/>
+              <w:start w:w="120" w:type="dxa"/>
+              <w:bottom w:w="80" w:type="dxa"/>
+              <w:end w:w="120" w:type="dxa"/>
+            </w:tcMar>
+          </w:tcPr>
+          <w:p>
+            <w:pPr>
+              <w:spacing w:after="0"/>
+            </w:pPr>
+            <w:r>
+              <w:rPr>
+                <w:sz w:val="18"/>
+              </w:rPr>
+              <w:t>Permite saber cuánta agua debe distribuirse en el conjunto de la explotación.</w:t>
+            </w:r>
+          </w:p>
+        </w:tc>
+      </w:tr>
+      <w:tr>
+        <w:tc>
+          <w:tcPr>
+            <w:tcW w:type="dxa" w:w="2268"/>
+            <w:vAlign w:val="center"/>
+            <w:tcMar>
+              <w:top w:w="80" w:type="dxa"/>
+              <w:start w:w="120" w:type="dxa"/>
+              <w:bottom w:w="80" w:type="dxa"/>
+              <w:end w:w="120" w:type="dxa"/>
+            </w:tcMar>
+          </w:tcPr>
+          <w:p>
+            <w:pPr>
+              <w:spacing w:after="0"/>
+            </w:pPr>
+            <w:r>
+              <w:rPr>
+                <w:sz w:val="18"/>
+              </w:rPr>
+              <w:t>Riego medio diario</w:t>
+            </w:r>
+          </w:p>
+        </w:tc>
+        <w:tc>
+          <w:tcPr>
+            <w:tcW w:type="dxa" w:w="2268"/>
+            <w:vAlign w:val="center"/>
+            <w:tcMar>
+              <w:top w:w="80" w:type="dxa"/>
+              <w:start w:w="120" w:type="dxa"/>
+              <w:bottom w:w="80" w:type="dxa"/>
+              <w:end w:w="120" w:type="dxa"/>
+            </w:tcMar>
+          </w:tcPr>
+          <w:p>
+            <w:pPr>
+              <w:spacing w:after="0"/>
+            </w:pPr>
+            <w:r>
+              <w:rPr>
+                <w:sz w:val="18"/>
+              </w:rPr>
+              <w:t>L/día</w:t>
+            </w:r>
+          </w:p>
+        </w:tc>
+        <w:tc>
+          <w:tcPr>
+            <w:tcW w:type="dxa" w:w="2268"/>
+            <w:vAlign w:val="center"/>
+            <w:tcMar>
+              <w:top w:w="80" w:type="dxa"/>
+              <w:start w:w="120" w:type="dxa"/>
+              <w:bottom w:w="80" w:type="dxa"/>
+              <w:end w:w="120" w:type="dxa"/>
+            </w:tcMar>
+          </w:tcPr>
+          <w:p>
+            <w:pPr>
+              <w:spacing w:after="0"/>
+            </w:pPr>
+            <w:r>
+              <w:rPr>
+                <w:sz w:val="18"/>
+              </w:rPr>
+              <w:t>Promedio diario del volumen total de riego de la parcela.</w:t>
+            </w:r>
+          </w:p>
+        </w:tc>
+        <w:tc>
+          <w:tcPr>
+            <w:tcW w:type="dxa" w:w="2268"/>
+            <w:vAlign w:val="center"/>
+            <w:tcMar>
+              <w:top w:w="80" w:type="dxa"/>
+              <w:start w:w="120" w:type="dxa"/>
+              <w:bottom w:w="80" w:type="dxa"/>
+              <w:end w:w="120" w:type="dxa"/>
+            </w:tcMar>
+          </w:tcPr>
+          <w:p>
+            <w:pPr>
+              <w:spacing w:after="0"/>
+            </w:pPr>
+            <w:r>
+              <w:rPr>
+                <w:sz w:val="18"/>
+              </w:rPr>
+              <w:t>Facilita convertir la recomendación del periodo en una pauta diaria.</w:t>
+            </w:r>
+          </w:p>
+        </w:tc>
+      </w:tr>
+      <w:tr>
+        <w:tc>
+          <w:tcPr>
+            <w:tcW w:type="dxa" w:w="2268"/>
+            <w:vAlign w:val="center"/>
+            <w:tcMar>
+              <w:top w:w="80" w:type="dxa"/>
+              <w:start w:w="120" w:type="dxa"/>
+              <w:bottom w:w="80" w:type="dxa"/>
+              <w:end w:w="120" w:type="dxa"/>
+            </w:tcMar>
+          </w:tcPr>
+          <w:p>
+            <w:pPr>
+              <w:spacing w:after="0"/>
+            </w:pPr>
+            <w:r>
+              <w:rPr>
+                <w:sz w:val="18"/>
+              </w:rPr>
+              <w:t>Litros por planta</w:t>
+            </w:r>
+          </w:p>
+        </w:tc>
+        <w:tc>
+          <w:tcPr>
+            <w:tcW w:type="dxa" w:w="2268"/>
+            <w:vAlign w:val="center"/>
+            <w:tcMar>
+              <w:top w:w="80" w:type="dxa"/>
+              <w:start w:w="120" w:type="dxa"/>
+              <w:bottom w:w="80" w:type="dxa"/>
+              <w:end w:w="120" w:type="dxa"/>
+            </w:tcMar>
+          </w:tcPr>
+          <w:p>
+            <w:pPr>
+              <w:spacing w:after="0"/>
+            </w:pPr>
+            <w:r>
+              <w:rPr>
+                <w:sz w:val="18"/>
+              </w:rPr>
+              <w:t>L/planta/día</w:t>
+            </w:r>
+          </w:p>
+        </w:tc>
+        <w:tc>
+          <w:tcPr>
+            <w:tcW w:type="dxa" w:w="2268"/>
+            <w:vAlign w:val="center"/>
+            <w:tcMar>
+              <w:top w:w="80" w:type="dxa"/>
+              <w:start w:w="120" w:type="dxa"/>
+              <w:bottom w:w="80" w:type="dxa"/>
+              <w:end w:w="120" w:type="dxa"/>
+            </w:tcMar>
+          </w:tcPr>
+          <w:p>
+            <w:pPr>
+              <w:spacing w:after="0"/>
+            </w:pPr>
+            <w:r>
+              <w:rPr>
+                <w:sz w:val="18"/>
+              </w:rPr>
+              <w:t>Media diaria estimada por planta según la superficie y el marco medio del cultivo.</w:t>
+            </w:r>
+          </w:p>
+        </w:tc>
+        <w:tc>
+          <w:tcPr>
+            <w:tcW w:type="dxa" w:w="2268"/>
+            <w:vAlign w:val="center"/>
+            <w:tcMar>
+              <w:top w:w="80" w:type="dxa"/>
+              <w:start w:w="120" w:type="dxa"/>
+              <w:bottom w:w="80" w:type="dxa"/>
+              <w:end w:w="120" w:type="dxa"/>
+            </w:tcMar>
+          </w:tcPr>
+          <w:p>
+            <w:pPr>
+              <w:spacing w:after="0"/>
+            </w:pPr>
+            <w:r>
+              <w:rPr>
+                <w:sz w:val="18"/>
+              </w:rPr>
+              <w:t>Ayuda a interpretar el resultado a escala de árbol o planta.</w:t>
+            </w:r>
+          </w:p>
+        </w:tc>
+      </w:tr>
+      <w:tr>
+        <w:tc>
+          <w:tcPr>
+            <w:tcW w:type="dxa" w:w="2268"/>
+            <w:vAlign w:val="center"/>
+            <w:tcMar>
+              <w:top w:w="80" w:type="dxa"/>
+              <w:start w:w="120" w:type="dxa"/>
+              <w:bottom w:w="80" w:type="dxa"/>
+              <w:end w:w="120" w:type="dxa"/>
+            </w:tcMar>
+          </w:tcPr>
+          <w:p>
+            <w:pPr>
+              <w:spacing w:after="0"/>
+            </w:pPr>
+            <w:r>
+              <w:rPr>
+                <w:sz w:val="18"/>
+              </w:rPr>
+              <w:t>Lámina diaria</w:t>
+            </w:r>
+          </w:p>
+        </w:tc>
+        <w:tc>
+          <w:tcPr>
+            <w:tcW w:type="dxa" w:w="2268"/>
+            <w:vAlign w:val="center"/>
+            <w:tcMar>
+              <w:top w:w="80" w:type="dxa"/>
+              <w:start w:w="120" w:type="dxa"/>
+              <w:bottom w:w="80" w:type="dxa"/>
+              <w:end w:w="120" w:type="dxa"/>
+            </w:tcMar>
+          </w:tcPr>
+          <w:p>
+            <w:pPr>
+              <w:spacing w:after="0"/>
+            </w:pPr>
+            <w:r>
+              <w:rPr>
+                <w:sz w:val="18"/>
+              </w:rPr>
+              <w:t>mm/día</w:t>
+            </w:r>
+          </w:p>
+        </w:tc>
+        <w:tc>
+          <w:tcPr>
+            <w:tcW w:type="dxa" w:w="2268"/>
+            <w:vAlign w:val="center"/>
+            <w:tcMar>
+              <w:top w:w="80" w:type="dxa"/>
+              <w:start w:w="120" w:type="dxa"/>
+              <w:bottom w:w="80" w:type="dxa"/>
+              <w:end w:w="120" w:type="dxa"/>
+            </w:tcMar>
+          </w:tcPr>
+          <w:p>
+            <w:pPr>
+              <w:spacing w:after="0"/>
+            </w:pPr>
+            <w:r>
+              <w:rPr>
+                <w:sz w:val="18"/>
+              </w:rPr>
+              <w:t>Profundidad media diaria de agua que debe aplicarse sobre el terreno. Un milímetro equivale a 1 L/m2.</w:t>
+            </w:r>
+          </w:p>
+        </w:tc>
+        <w:tc>
+          <w:tcPr>
+            <w:tcW w:type="dxa" w:w="2268"/>
+            <w:vAlign w:val="center"/>
+            <w:tcMar>
+              <w:top w:w="80" w:type="dxa"/>
+              <w:start w:w="120" w:type="dxa"/>
+              <w:bottom w:w="80" w:type="dxa"/>
+              <w:end w:w="120" w:type="dxa"/>
+            </w:tcMar>
+          </w:tcPr>
+          <w:p>
+            <w:pPr>
+              <w:spacing w:after="0"/>
+            </w:pPr>
+            <w:r>
+              <w:rPr>
+                <w:sz w:val="18"/>
+              </w:rPr>
+              <w:t>Conecta la recomendación agronómica con una unidad habitual de riego.</w:t>
+            </w:r>
+          </w:p>
+        </w:tc>
+      </w:tr>
+      <w:tr>
+        <w:tc>
+          <w:tcPr>
+            <w:tcW w:type="dxa" w:w="2268"/>
+            <w:vAlign w:val="center"/>
+            <w:tcMar>
+              <w:top w:w="80" w:type="dxa"/>
+              <w:start w:w="120" w:type="dxa"/>
+              <w:bottom w:w="80" w:type="dxa"/>
+              <w:end w:w="120" w:type="dxa"/>
+            </w:tcMar>
+          </w:tcPr>
+          <w:p>
+            <w:pPr>
+              <w:spacing w:after="0"/>
+            </w:pPr>
+            <w:r>
+              <w:rPr>
+                <w:sz w:val="18"/>
+              </w:rPr>
+              <w:t>ET0 media</w:t>
+            </w:r>
+          </w:p>
+        </w:tc>
+        <w:tc>
+          <w:tcPr>
+            <w:tcW w:type="dxa" w:w="2268"/>
+            <w:vAlign w:val="center"/>
+            <w:tcMar>
+              <w:top w:w="80" w:type="dxa"/>
+              <w:start w:w="120" w:type="dxa"/>
+              <w:bottom w:w="80" w:type="dxa"/>
+              <w:end w:w="120" w:type="dxa"/>
+            </w:tcMar>
+          </w:tcPr>
+          <w:p>
+            <w:pPr>
+              <w:spacing w:after="0"/>
+            </w:pPr>
+            <w:r>
+              <w:rPr>
+                <w:sz w:val="18"/>
+              </w:rPr>
+              <w:t>mm/día</w:t>
+            </w:r>
+          </w:p>
+        </w:tc>
+        <w:tc>
+          <w:tcPr>
+            <w:tcW w:type="dxa" w:w="2268"/>
+            <w:vAlign w:val="center"/>
+            <w:tcMar>
+              <w:top w:w="80" w:type="dxa"/>
+              <w:start w:w="120" w:type="dxa"/>
+              <w:bottom w:w="80" w:type="dxa"/>
+              <w:end w:w="120" w:type="dxa"/>
+            </w:tcMar>
+          </w:tcPr>
+          <w:p>
+            <w:pPr>
+              <w:spacing w:after="0"/>
+            </w:pPr>
+            <w:r>
+              <w:rPr>
+                <w:sz w:val="18"/>
+              </w:rPr>
+              <w:t>Evapotranspiración de referencia media del periodo; representa la demanda atmosférica de agua.</w:t>
+            </w:r>
+          </w:p>
+        </w:tc>
+        <w:tc>
+          <w:tcPr>
+            <w:tcW w:type="dxa" w:w="2268"/>
+            <w:vAlign w:val="center"/>
+            <w:tcMar>
+              <w:top w:w="80" w:type="dxa"/>
+              <w:start w:w="120" w:type="dxa"/>
+              <w:bottom w:w="80" w:type="dxa"/>
+              <w:end w:w="120" w:type="dxa"/>
+            </w:tcMar>
+          </w:tcPr>
+          <w:p>
+            <w:pPr>
+              <w:spacing w:after="0"/>
+            </w:pPr>
+            <w:r>
+              <w:rPr>
+                <w:sz w:val="18"/>
+              </w:rPr>
+              <w:t>Indica la presión climática: a mayor ET0, mayor tendencia a necesitar riego.</w:t>
+            </w:r>
+          </w:p>
+        </w:tc>
+      </w:tr>
+      <w:tr>
+        <w:tc>
+          <w:tcPr>
+            <w:tcW w:type="dxa" w:w="2268"/>
+            <w:vAlign w:val="center"/>
+            <w:tcMar>
+              <w:top w:w="80" w:type="dxa"/>
+              <w:start w:w="120" w:type="dxa"/>
+              <w:bottom w:w="80" w:type="dxa"/>
+              <w:end w:w="120" w:type="dxa"/>
+            </w:tcMar>
+          </w:tcPr>
+          <w:p>
+            <w:pPr>
+              <w:spacing w:after="0"/>
+            </w:pPr>
+            <w:r>
+              <w:rPr>
+                <w:sz w:val="18"/>
+              </w:rPr>
+              <w:t>Lluvia total</w:t>
+            </w:r>
+          </w:p>
+        </w:tc>
+        <w:tc>
+          <w:tcPr>
+            <w:tcW w:type="dxa" w:w="2268"/>
+            <w:vAlign w:val="center"/>
+            <w:tcMar>
+              <w:top w:w="80" w:type="dxa"/>
+              <w:start w:w="120" w:type="dxa"/>
+              <w:bottom w:w="80" w:type="dxa"/>
+              <w:end w:w="120" w:type="dxa"/>
+            </w:tcMar>
+          </w:tcPr>
+          <w:p>
+            <w:pPr>
+              <w:spacing w:after="0"/>
+            </w:pPr>
+            <w:r>
+              <w:rPr>
+                <w:sz w:val="18"/>
+              </w:rPr>
+              <w:t>mm</w:t>
+            </w:r>
+          </w:p>
+        </w:tc>
+        <w:tc>
+          <w:tcPr>
+            <w:tcW w:type="dxa" w:w="2268"/>
+            <w:vAlign w:val="center"/>
+            <w:tcMar>
+              <w:top w:w="80" w:type="dxa"/>
+              <w:start w:w="120" w:type="dxa"/>
+              <w:bottom w:w="80" w:type="dxa"/>
+              <w:end w:w="120" w:type="dxa"/>
+            </w:tcMar>
+          </w:tcPr>
+          <w:p>
+            <w:pPr>
+              <w:spacing w:after="0"/>
+            </w:pPr>
+            <w:r>
+              <w:rPr>
+                <w:sz w:val="18"/>
+              </w:rPr>
+              <w:t>Precipitación acumulada durante el periodo.</w:t>
+            </w:r>
+          </w:p>
+        </w:tc>
+        <w:tc>
+          <w:tcPr>
+            <w:tcW w:type="dxa" w:w="2268"/>
+            <w:vAlign w:val="center"/>
+            <w:tcMar>
+              <w:top w:w="80" w:type="dxa"/>
+              <w:start w:w="120" w:type="dxa"/>
+              <w:bottom w:w="80" w:type="dxa"/>
+              <w:end w:w="120" w:type="dxa"/>
+            </w:tcMar>
+          </w:tcPr>
+          <w:p>
+            <w:pPr>
+              <w:spacing w:after="0"/>
+            </w:pPr>
+            <w:r>
+              <w:rPr>
+                <w:sz w:val="18"/>
+              </w:rPr>
+              <w:t>Reduce la necesidad de riego cuando parte de la lluvia se considera efectiva.</w:t>
+            </w:r>
+          </w:p>
+        </w:tc>
+      </w:tr>
+      <w:tr>
+        <w:tc>
+          <w:tcPr>
+            <w:tcW w:type="dxa" w:w="2268"/>
+            <w:vAlign w:val="center"/>
+            <w:tcMar>
+              <w:top w:w="80" w:type="dxa"/>
+              <w:start w:w="120" w:type="dxa"/>
+              <w:bottom w:w="80" w:type="dxa"/>
+              <w:end w:w="120" w:type="dxa"/>
+            </w:tcMar>
+          </w:tcPr>
+          <w:p>
+            <w:pPr>
+              <w:spacing w:after="0"/>
+            </w:pPr>
+            <w:r>
+              <w:rPr>
+                <w:sz w:val="18"/>
+              </w:rPr>
+              <w:t>ETc media</w:t>
+            </w:r>
+          </w:p>
+        </w:tc>
+        <w:tc>
+          <w:tcPr>
+            <w:tcW w:type="dxa" w:w="2268"/>
+            <w:vAlign w:val="center"/>
+            <w:tcMar>
+              <w:top w:w="80" w:type="dxa"/>
+              <w:start w:w="120" w:type="dxa"/>
+              <w:bottom w:w="80" w:type="dxa"/>
+              <w:end w:w="120" w:type="dxa"/>
+            </w:tcMar>
+          </w:tcPr>
+          <w:p>
+            <w:pPr>
+              <w:spacing w:after="0"/>
+            </w:pPr>
+            <w:r>
+              <w:rPr>
+                <w:sz w:val="18"/>
+              </w:rPr>
+              <w:t>mm/día</w:t>
+            </w:r>
+          </w:p>
+        </w:tc>
+        <w:tc>
+          <w:tcPr>
+            <w:tcW w:type="dxa" w:w="2268"/>
+            <w:vAlign w:val="center"/>
+            <w:tcMar>
+              <w:top w:w="80" w:type="dxa"/>
+              <w:start w:w="120" w:type="dxa"/>
+              <w:bottom w:w="80" w:type="dxa"/>
+              <w:end w:w="120" w:type="dxa"/>
+            </w:tcMar>
+          </w:tcPr>
+          <w:p>
+            <w:pPr>
+              <w:spacing w:after="0"/>
+            </w:pPr>
+            <w:r>
+              <w:rPr>
+                <w:sz w:val="18"/>
+              </w:rPr>
+              <w:t>Evapotranspiración del cultivo; se obtiene multiplicando ET0 por el coeficiente Kc del cultivo y fase.</w:t>
+            </w:r>
+          </w:p>
+        </w:tc>
+        <w:tc>
+          <w:tcPr>
+            <w:tcW w:type="dxa" w:w="2268"/>
+            <w:vAlign w:val="center"/>
+            <w:tcMar>
+              <w:top w:w="80" w:type="dxa"/>
+              <w:start w:w="120" w:type="dxa"/>
+              <w:bottom w:w="80" w:type="dxa"/>
+              <w:end w:w="120" w:type="dxa"/>
+            </w:tcMar>
+          </w:tcPr>
+          <w:p>
+            <w:pPr>
+              <w:spacing w:after="0"/>
+            </w:pPr>
+            <w:r>
+              <w:rPr>
+                <w:sz w:val="18"/>
+              </w:rPr>
+              <w:t>Representa la demanda hídrica concreta del cultivo seleccionado.</w:t>
+            </w:r>
+          </w:p>
+        </w:tc>
+      </w:tr>
+      <w:tr>
+        <w:tc>
+          <w:tcPr>
+            <w:tcW w:type="dxa" w:w="2268"/>
+            <w:vAlign w:val="center"/>
+            <w:tcMar>
+              <w:top w:w="80" w:type="dxa"/>
+              <w:start w:w="120" w:type="dxa"/>
+              <w:bottom w:w="80" w:type="dxa"/>
+              <w:end w:w="120" w:type="dxa"/>
+            </w:tcMar>
+          </w:tcPr>
+          <w:p>
+            <w:pPr>
+              <w:spacing w:after="0"/>
+            </w:pPr>
+            <w:r>
+              <w:rPr>
+                <w:sz w:val="18"/>
+              </w:rPr>
+              <w:t>Plantas estimadas</w:t>
+            </w:r>
+          </w:p>
+        </w:tc>
+        <w:tc>
+          <w:tcPr>
+            <w:tcW w:type="dxa" w:w="2268"/>
+            <w:vAlign w:val="center"/>
+            <w:tcMar>
+              <w:top w:w="80" w:type="dxa"/>
+              <w:start w:w="120" w:type="dxa"/>
+              <w:bottom w:w="80" w:type="dxa"/>
+              <w:end w:w="120" w:type="dxa"/>
+            </w:tcMar>
+          </w:tcPr>
+          <w:p>
+            <w:pPr>
+              <w:spacing w:after="0"/>
+            </w:pPr>
+            <w:r>
+              <w:rPr>
+                <w:sz w:val="18"/>
+              </w:rPr>
+              <w:t>plantas</w:t>
+            </w:r>
+          </w:p>
+        </w:tc>
+        <w:tc>
+          <w:tcPr>
+            <w:tcW w:type="dxa" w:w="2268"/>
+            <w:vAlign w:val="center"/>
+            <w:tcMar>
+              <w:top w:w="80" w:type="dxa"/>
+              <w:start w:w="120" w:type="dxa"/>
+              <w:bottom w:w="80" w:type="dxa"/>
+              <w:end w:w="120" w:type="dxa"/>
+            </w:tcMar>
+          </w:tcPr>
+          <w:p>
+            <w:pPr>
+              <w:spacing w:after="0"/>
+            </w:pPr>
+            <w:r>
+              <w:rPr>
+                <w:sz w:val="18"/>
+              </w:rPr>
+              <w:t>Número aproximado de plantas calculado con la superficie y el marco medio del cultivo.</w:t>
+            </w:r>
+          </w:p>
+        </w:tc>
+        <w:tc>
+          <w:tcPr>
+            <w:tcW w:type="dxa" w:w="2268"/>
+            <w:vAlign w:val="center"/>
+            <w:tcMar>
+              <w:top w:w="80" w:type="dxa"/>
+              <w:start w:w="120" w:type="dxa"/>
+              <w:bottom w:w="80" w:type="dxa"/>
+              <w:end w:w="120" w:type="dxa"/>
+            </w:tcMar>
+          </w:tcPr>
+          <w:p>
+            <w:pPr>
+              <w:spacing w:after="0"/>
+            </w:pPr>
+            <w:r>
+              <w:rPr>
+                <w:sz w:val="18"/>
+              </w:rPr>
+              <w:t>Sirve para expresar el resultado también en litros por planta.</w:t>
+            </w:r>
+          </w:p>
+        </w:tc>
+      </w:tr>
+      <w:tr>
+        <w:tc>
+          <w:tcPr>
+            <w:tcW w:type="dxa" w:w="2268"/>
+            <w:vAlign w:val="center"/>
+            <w:tcMar>
+              <w:top w:w="80" w:type="dxa"/>
+              <w:start w:w="120" w:type="dxa"/>
+              <w:bottom w:w="80" w:type="dxa"/>
+              <w:end w:w="120" w:type="dxa"/>
+            </w:tcMar>
+          </w:tcPr>
+          <w:p>
+            <w:pPr>
+              <w:spacing w:after="0"/>
+            </w:pPr>
+            <w:r>
+              <w:rPr>
+                <w:sz w:val="18"/>
+              </w:rPr>
+              <w:t>Riego total ML</w:t>
+            </w:r>
+          </w:p>
+        </w:tc>
+        <w:tc>
+          <w:tcPr>
+            <w:tcW w:type="dxa" w:w="2268"/>
+            <w:vAlign w:val="center"/>
+            <w:tcMar>
+              <w:top w:w="80" w:type="dxa"/>
+              <w:start w:w="120" w:type="dxa"/>
+              <w:bottom w:w="80" w:type="dxa"/>
+              <w:end w:w="120" w:type="dxa"/>
+            </w:tcMar>
+          </w:tcPr>
+          <w:p>
+            <w:pPr>
+              <w:spacing w:after="0"/>
+            </w:pPr>
+            <w:r>
+              <w:rPr>
+                <w:sz w:val="18"/>
+              </w:rPr>
+              <w:t>L</w:t>
+            </w:r>
+          </w:p>
+        </w:tc>
+        <w:tc>
+          <w:tcPr>
+            <w:tcW w:type="dxa" w:w="2268"/>
+            <w:vAlign w:val="center"/>
+            <w:tcMar>
+              <w:top w:w="80" w:type="dxa"/>
+              <w:start w:w="120" w:type="dxa"/>
+              <w:bottom w:w="80" w:type="dxa"/>
+              <w:end w:w="120" w:type="dxa"/>
+            </w:tcMar>
+          </w:tcPr>
+          <w:p>
+            <w:pPr>
+              <w:spacing w:after="0"/>
+            </w:pPr>
+            <w:r>
+              <w:rPr>
+                <w:sz w:val="18"/>
+              </w:rPr>
+              <w:t>Predicción del modelo para el volumen total del periodo.</w:t>
+            </w:r>
+          </w:p>
+        </w:tc>
+        <w:tc>
+          <w:tcPr>
+            <w:tcW w:type="dxa" w:w="2268"/>
+            <w:vAlign w:val="center"/>
+            <w:tcMar>
+              <w:top w:w="80" w:type="dxa"/>
+              <w:start w:w="120" w:type="dxa"/>
+              <w:bottom w:w="80" w:type="dxa"/>
+              <w:end w:w="120" w:type="dxa"/>
+            </w:tcMar>
+          </w:tcPr>
+          <w:p>
+            <w:pPr>
+              <w:spacing w:after="0"/>
+            </w:pPr>
+            <w:r>
+              <w:rPr>
+                <w:sz w:val="18"/>
+              </w:rPr>
+              <w:t>Permite comparar la salida predictiva con el cálculo agronómico base.</w:t>
+            </w:r>
+          </w:p>
+        </w:tc>
+      </w:tr>
+      <w:tr>
+        <w:tc>
+          <w:tcPr>
+            <w:tcW w:type="dxa" w:w="2268"/>
+            <w:vAlign w:val="center"/>
+            <w:tcMar>
+              <w:top w:w="80" w:type="dxa"/>
+              <w:start w:w="120" w:type="dxa"/>
+              <w:bottom w:w="80" w:type="dxa"/>
+              <w:end w:w="120" w:type="dxa"/>
+            </w:tcMar>
+          </w:tcPr>
+          <w:p>
+            <w:pPr>
+              <w:spacing w:after="0"/>
+            </w:pPr>
+            <w:r>
+              <w:rPr>
+                <w:sz w:val="18"/>
+              </w:rPr>
+              <w:t>Riego medio ML</w:t>
+            </w:r>
+          </w:p>
+        </w:tc>
+        <w:tc>
+          <w:tcPr>
+            <w:tcW w:type="dxa" w:w="2268"/>
+            <w:vAlign w:val="center"/>
+            <w:tcMar>
+              <w:top w:w="80" w:type="dxa"/>
+              <w:start w:w="120" w:type="dxa"/>
+              <w:bottom w:w="80" w:type="dxa"/>
+              <w:end w:w="120" w:type="dxa"/>
+            </w:tcMar>
+          </w:tcPr>
+          <w:p>
+            <w:pPr>
+              <w:spacing w:after="0"/>
+            </w:pPr>
+            <w:r>
+              <w:rPr>
+                <w:sz w:val="18"/>
+              </w:rPr>
+              <w:t>L/día</w:t>
+            </w:r>
+          </w:p>
+        </w:tc>
+        <w:tc>
+          <w:tcPr>
+            <w:tcW w:type="dxa" w:w="2268"/>
+            <w:vAlign w:val="center"/>
+            <w:tcMar>
+              <w:top w:w="80" w:type="dxa"/>
+              <w:start w:w="120" w:type="dxa"/>
+              <w:bottom w:w="80" w:type="dxa"/>
+              <w:end w:w="120" w:type="dxa"/>
+            </w:tcMar>
+          </w:tcPr>
+          <w:p>
+            <w:pPr>
+              <w:spacing w:after="0"/>
+            </w:pPr>
+            <w:r>
+              <w:rPr>
+                <w:sz w:val="18"/>
+              </w:rPr>
+              <w:t>Predicción media diaria del modelo.</w:t>
+            </w:r>
+          </w:p>
+        </w:tc>
+        <w:tc>
+          <w:tcPr>
+            <w:tcW w:type="dxa" w:w="2268"/>
+            <w:vAlign w:val="center"/>
+            <w:tcMar>
+              <w:top w:w="80" w:type="dxa"/>
+              <w:start w:w="120" w:type="dxa"/>
+              <w:bottom w:w="80" w:type="dxa"/>
+              <w:end w:w="120" w:type="dxa"/>
+            </w:tcMar>
+          </w:tcPr>
+          <w:p>
+            <w:pPr>
+              <w:spacing w:after="0"/>
+            </w:pPr>
+            <w:r>
+              <w:rPr>
+                <w:sz w:val="18"/>
+              </w:rPr>
+              <w:t>Resume la recomendación ML en una pauta diaria.</w:t>
+            </w:r>
+          </w:p>
+        </w:tc>
+      </w:tr>
+      <w:tr>
+        <w:tc>
+          <w:tcPr>
+            <w:tcW w:type="dxa" w:w="2268"/>
+            <w:vAlign w:val="center"/>
+            <w:tcMar>
+              <w:top w:w="80" w:type="dxa"/>
+              <w:start w:w="120" w:type="dxa"/>
+              <w:bottom w:w="80" w:type="dxa"/>
+              <w:end w:w="120" w:type="dxa"/>
+            </w:tcMar>
+          </w:tcPr>
+          <w:p>
+            <w:pPr>
+              <w:spacing w:after="0"/>
+            </w:pPr>
+            <w:r>
+              <w:rPr>
+                <w:sz w:val="18"/>
+              </w:rPr>
+              <w:t>Litros/planta ML</w:t>
+            </w:r>
+          </w:p>
+        </w:tc>
+        <w:tc>
+          <w:tcPr>
+            <w:tcW w:type="dxa" w:w="2268"/>
+            <w:vAlign w:val="center"/>
+            <w:tcMar>
+              <w:top w:w="80" w:type="dxa"/>
+              <w:start w:w="120" w:type="dxa"/>
+              <w:bottom w:w="80" w:type="dxa"/>
+              <w:end w:w="120" w:type="dxa"/>
+            </w:tcMar>
+          </w:tcPr>
+          <w:p>
+            <w:pPr>
+              <w:spacing w:after="0"/>
+            </w:pPr>
+            <w:r>
+              <w:rPr>
+                <w:sz w:val="18"/>
+              </w:rPr>
+              <w:t>L/planta/día</w:t>
+            </w:r>
+          </w:p>
+        </w:tc>
+        <w:tc>
+          <w:tcPr>
+            <w:tcW w:type="dxa" w:w="2268"/>
+            <w:vAlign w:val="center"/>
+            <w:tcMar>
+              <w:top w:w="80" w:type="dxa"/>
+              <w:start w:w="120" w:type="dxa"/>
+              <w:bottom w:w="80" w:type="dxa"/>
+              <w:end w:w="120" w:type="dxa"/>
+            </w:tcMar>
+          </w:tcPr>
+          <w:p>
+            <w:pPr>
+              <w:spacing w:after="0"/>
+            </w:pPr>
+            <w:r>
+              <w:rPr>
+                <w:sz w:val="18"/>
+              </w:rPr>
+              <w:t>Predicción media diaria por planta.</w:t>
+            </w:r>
+          </w:p>
+        </w:tc>
+        <w:tc>
+          <w:tcPr>
+            <w:tcW w:type="dxa" w:w="2268"/>
+            <w:vAlign w:val="center"/>
+            <w:tcMar>
+              <w:top w:w="80" w:type="dxa"/>
+              <w:start w:w="120" w:type="dxa"/>
+              <w:bottom w:w="80" w:type="dxa"/>
+              <w:end w:w="120" w:type="dxa"/>
+            </w:tcMar>
+          </w:tcPr>
+          <w:p>
+            <w:pPr>
+              <w:spacing w:after="0"/>
+            </w:pPr>
+            <w:r>
+              <w:rPr>
+                <w:sz w:val="18"/>
+              </w:rPr>
+              <w:t>Traduce la salida ML a una unidad comprensible para el agricultor.</w:t>
+            </w:r>
+          </w:p>
+        </w:tc>
+      </w:tr>
+      <w:tr>
+        <w:tc>
+          <w:tcPr>
+            <w:tcW w:type="dxa" w:w="2268"/>
+            <w:vAlign w:val="center"/>
+            <w:tcMar>
+              <w:top w:w="80" w:type="dxa"/>
+              <w:start w:w="120" w:type="dxa"/>
+              <w:bottom w:w="80" w:type="dxa"/>
+              <w:end w:w="120" w:type="dxa"/>
+            </w:tcMar>
+          </w:tcPr>
+          <w:p>
+            <w:pPr>
+              <w:spacing w:after="0"/>
+            </w:pPr>
+            <w:r>
+              <w:rPr>
+                <w:sz w:val="18"/>
+              </w:rPr>
+              <w:t>Lámina ML</w:t>
+            </w:r>
+          </w:p>
+        </w:tc>
+        <w:tc>
+          <w:tcPr>
+            <w:tcW w:type="dxa" w:w="2268"/>
+            <w:vAlign w:val="center"/>
+            <w:tcMar>
+              <w:top w:w="80" w:type="dxa"/>
+              <w:start w:w="120" w:type="dxa"/>
+              <w:bottom w:w="80" w:type="dxa"/>
+              <w:end w:w="120" w:type="dxa"/>
+            </w:tcMar>
+          </w:tcPr>
+          <w:p>
+            <w:pPr>
+              <w:spacing w:after="0"/>
+            </w:pPr>
+            <w:r>
+              <w:rPr>
+                <w:sz w:val="18"/>
+              </w:rPr>
+              <w:t>mm/día</w:t>
+            </w:r>
+          </w:p>
+        </w:tc>
+        <w:tc>
+          <w:tcPr>
+            <w:tcW w:type="dxa" w:w="2268"/>
+            <w:vAlign w:val="center"/>
+            <w:tcMar>
+              <w:top w:w="80" w:type="dxa"/>
+              <w:start w:w="120" w:type="dxa"/>
+              <w:bottom w:w="80" w:type="dxa"/>
+              <w:end w:w="120" w:type="dxa"/>
+            </w:tcMar>
+          </w:tcPr>
+          <w:p>
+            <w:pPr>
+              <w:spacing w:after="0"/>
+            </w:pPr>
+            <w:r>
+              <w:rPr>
+                <w:sz w:val="18"/>
+              </w:rPr>
+              <w:t>Lámina media diaria predicha por el modelo.</w:t>
+            </w:r>
+          </w:p>
+        </w:tc>
+        <w:tc>
+          <w:tcPr>
+            <w:tcW w:type="dxa" w:w="2268"/>
+            <w:vAlign w:val="center"/>
+            <w:tcMar>
+              <w:top w:w="80" w:type="dxa"/>
+              <w:start w:w="120" w:type="dxa"/>
+              <w:bottom w:w="80" w:type="dxa"/>
+              <w:end w:w="120" w:type="dxa"/>
+            </w:tcMar>
+          </w:tcPr>
+          <w:p>
+            <w:pPr>
+              <w:spacing w:after="0"/>
+            </w:pPr>
+            <w:r>
+              <w:rPr>
+                <w:sz w:val="18"/>
+              </w:rPr>
+              <w:t>Muestra la dosis ML antes de convertirla a litros.</w:t>
+            </w:r>
+          </w:p>
+        </w:tc>
+      </w:tr>
+    </w:tbl>
+    <w:p/>
+    <w:p>
+      <w:pPr>
+        <w:spacing w:after="120"/>
+      </w:pPr>
+      <w:r>
+        <w:t>La diferencia entre ET0 y ETc es clave: ET0 describe la demanda climática general, mientras que ETc ajusta esa demanda al cultivo real mediante Kc. La lámina diaria expresa la dosis en milímetros y el riego medio diario la transforma en litros para la superficie de la parcela.</w:t>
+      </w:r>
+    </w:p>
+    <w:p>
+      <w:pPr>
+        <w:pStyle w:val="Heading2"/>
+      </w:pPr>
+      <w:r>
+        <w:t>4.6 Resultado del modelo ML/Keras</w:t>
       </w:r>
     </w:p>
     <w:p>
@@ -10740,7 +12010,7 @@
         <w:pStyle w:val="Heading2"/>
       </w:pPr>
       <w:r>
-        <w:t>4.6 Comparación entre cálculo agronómico y ML</w:t>
+        <w:t>4.7 Comparación entre cálculo agronómico y ML</w:t>
       </w:r>
     </w:p>
     <w:p>
@@ -11140,7 +12410,7 @@
         <w:pStyle w:val="Heading2"/>
       </w:pPr>
       <w:r>
-        <w:t>4.7 Validación técnica</w:t>
+        <w:t>4.8 Validación técnica</w:t>
       </w:r>
     </w:p>
     <w:p>
@@ -11248,7 +12518,7 @@
         <w:pStyle w:val="Heading2"/>
       </w:pPr>
       <w:r>
-        <w:t>4.8 Capturas del sistema</w:t>
+        <w:t>4.9 Capturas del sistema</w:t>
       </w:r>
     </w:p>
     <w:p>
@@ -11558,7 +12828,7 @@
               <w:rPr>
                 <w:sz w:val="18"/>
               </w:rPr>
-              <w:t>Predicción ML y comparación con el cálculo diario.</w:t>
+              <w:t>Predicción ML resumida y comparable con la recomendación base.</w:t>
             </w:r>
           </w:p>
         </w:tc>
@@ -11606,7 +12876,7 @@
               <w:rPr>
                 <w:sz w:val="18"/>
               </w:rPr>
-              <w:t>Detalle diario y exportación de resultados.</w:t>
+              <w:t>Descarga de informes en formato Markdown y JSON.</w:t>
             </w:r>
           </w:p>
         </w:tc>
@@ -11979,7 +13249,7 @@
         <w:rPr>
           <w:b/>
         </w:rPr>
-        <w:t>Figura 6. Detalle diario y exportación.</w:t>
+        <w:t>Figura 6. Descarga de informes.</w:t>
       </w:r>
     </w:p>
     <w:p>
@@ -11998,11 +13268,11 @@
               <a:graphicData uri="http://schemas.openxmlformats.org/drawingml/2006/picture">
                 <pic:pic>
                   <pic:nvPicPr>
-                    <pic:cNvPr id="0" name="figura_05_detalle_diario.png"/>
+                    <pic:cNvPr id="0" name="figura_04_prediccion_ml.png"/>
                     <pic:cNvPicPr/>
                   </pic:nvPicPr>
                   <pic:blipFill>
-                    <a:blip r:embed="rId14"/>
+                    <a:blip r:embed="rId13"/>
                     <a:stretch>
                       <a:fillRect/>
                     </a:stretch>
@@ -12054,7 +13324,7 @@
                     <pic:cNvPicPr/>
                   </pic:nvPicPr>
                   <pic:blipFill>
-                    <a:blip r:embed="rId15"/>
+                    <a:blip r:embed="rId14"/>
                     <a:stretch>
                       <a:fillRect/>
                     </a:stretch>
@@ -12106,7 +13376,7 @@
                     <pic:cNvPicPr/>
                   </pic:nvPicPr>
                   <pic:blipFill>
-                    <a:blip r:embed="rId16"/>
+                    <a:blip r:embed="rId15"/>
                     <a:stretch>
                       <a:fillRect/>
                     </a:stretch>

</xml_diff>

<commit_message>
Actualizar memoria y presentacion con Streamlit
</commit_message>
<xml_diff>
--- a/docs/memoria_proyecto_intermodular.docx
+++ b/docs/memoria_proyecto_intermodular.docx
@@ -30,7 +30,7 @@
         <w:t>Alumno:</w:t>
       </w:r>
       <w:r>
-        <w:t xml:space="preserve"> Roman Maeztu</w:t>
+        <w:t xml:space="preserve"> Román Maeztu</w:t>
       </w:r>
     </w:p>
     <w:p>
@@ -972,7 +972,7 @@
         <w:spacing w:after="120"/>
       </w:pPr>
       <w:r>
-        <w:t>El proyecto se centra en un prototipo funcional. La versión desarrollada permite trabajar con estaciones AEMET de España, con especial validación sobre datos de la estación Sevilla Aeropuerto. La solución no sustituye una auditoría agronómica profesional, pero sí ofrece una base técnica para construir un servicio de recomendación y predicción de riego.</w:t>
+        <w:t>El proyecto se centra en un prototipo funcional. La versión desarrollada permite visualizar un inventario nacional de 920 estaciones AEMET y trabajar con estaciones de España. La validación principal se realiza sobre datos de la estación Sevilla Aeropuerto, porque el CSV local de demostración contiene esa estación versionada. La solución no sustituye una auditoría agronómica profesional, pero sí ofrece una base técnica para construir un servicio de recomendación y predicción de riego.</w:t>
       </w:r>
     </w:p>
     <w:p>
@@ -4784,7 +4784,7 @@
               <w:rPr>
                 <w:sz w:val="18"/>
               </w:rPr>
-              <w:t>AEMET OpenData y cache local SQLite.</w:t>
+              <w:t>AEMET OpenData y caché local SQLite.</w:t>
             </w:r>
           </w:p>
         </w:tc>
@@ -4830,7 +4830,7 @@
               <w:rPr>
                 <w:sz w:val="18"/>
               </w:rPr>
-              <w:t>Descarga por estación/fecha y pruebas con cache.</w:t>
+              <w:t>Descarga por estación/fecha y pruebas con caché.</w:t>
             </w:r>
           </w:p>
         </w:tc>
@@ -8624,7 +8624,7 @@
         <w:spacing w:after="60"/>
       </w:pPr>
       <w:r>
-        <w:t>Consulta de estaciones AEMET a nivel nacional.</w:t>
+        <w:t>Visualización del inventario nacional de 920 estaciones AEMET.</w:t>
       </w:r>
     </w:p>
     <w:p>
@@ -8634,6 +8634,15 @@
       </w:pPr>
       <w:r>
         <w:t>Filtro de estaciones por provincia y nombre.</w:t>
+      </w:r>
+    </w:p>
+    <w:p>
+      <w:pPr>
+        <w:pStyle w:val="ListBullet"/>
+        <w:spacing w:after="60"/>
+      </w:pPr>
+      <w:r>
+        <w:t>Cálculo estable en modo CSV local fijado a Sevilla Aeropuerto, al ser la estación disponible en el dataset versionado de demostración.</w:t>
       </w:r>
     </w:p>
     <w:p>
@@ -12177,7 +12186,7 @@
               <w:rPr>
                 <w:sz w:val="18"/>
               </w:rPr>
-              <w:t>97.165,39 L</w:t>
+              <w:t>97.160,07 L</w:t>
             </w:r>
           </w:p>
         </w:tc>
@@ -12248,7 +12257,7 @@
               <w:rPr>
                 <w:sz w:val="18"/>
               </w:rPr>
-              <w:t>13.880,77 L/día</w:t>
+              <w:t>13.880,01 L/día</w:t>
             </w:r>
           </w:p>
         </w:tc>
@@ -12390,7 +12399,7 @@
               <w:rPr>
                 <w:sz w:val="18"/>
               </w:rPr>
-              <w:t>31,73 L/planta/día</w:t>
+              <w:t>31,72 L/planta/día</w:t>
             </w:r>
           </w:p>
         </w:tc>
@@ -12510,7 +12519,7 @@
         <w:spacing w:after="60"/>
       </w:pPr>
       <w:r>
-        <w:t>Selector nacional de estaciones AEMET.</w:t>
+        <w:t>Selector nacional de estaciones AEMET con 920 estaciones visibles.</w:t>
       </w:r>
     </w:p>
     <w:p>
@@ -12526,7 +12535,7 @@
         <w:spacing w:after="120"/>
       </w:pPr>
       <w:r>
-        <w:t>Las siguientes capturas corresponden a una ejecución real del prototipo. El escenario utilizado para documentar la prueba es: estación AEMET Sevilla Aeropuerto, periodo del 01/05/2024 al 07/05/2024, cultivo olivar, fase media, superficie de 3.500 m2 y modelo ML activado.</w:t>
+        <w:t>Las siguientes capturas corresponden a una ejecución real del prototipo. El escenario utilizado para documentar la prueba es: estación AEMET Sevilla Aeropuerto, periodo del 01/05/2024 al 07/05/2024, cultivo olivar, fase media, superficie de 3.500 m2 y modelo ML activado. La interfaz permite consultar el inventario nacional de 920 estaciones AEMET; en modo CSV local, el cálculo queda fijado a Sevilla Aeropuerto porque es la estación incluida en el dataset de demostración.</w:t>
       </w:r>
     </w:p>
     <w:tbl>
@@ -12636,7 +12645,7 @@
               <w:rPr>
                 <w:sz w:val="18"/>
               </w:rPr>
-              <w:t>Selector nacional de estaciones AEMET mediante cache local.</w:t>
+              <w:t>Inventario nacional AEMET mediante caché local, con filtro por provincia y nombre.</w:t>
             </w:r>
           </w:p>
         </w:tc>
@@ -12684,7 +12693,7 @@
               <w:rPr>
                 <w:sz w:val="18"/>
               </w:rPr>
-              <w:t>Formulario principal de configuración de estación, fechas, cultivo y superficie.</w:t>
+              <w:t>Formulario principal de configuración de estación, fechas, cultivo y superficie; en CSV local se usa Sevilla Aeropuerto.</w:t>
             </w:r>
           </w:p>
         </w:tc>
@@ -13702,7 +13711,7 @@
               <w:rPr>
                 <w:sz w:val="18"/>
               </w:rPr>
-              <w:t>Cliente AEMET, inventario nacional, cache local y datos diarios por estación.</w:t>
+              <w:t>Cliente AEMET, inventario nacional, caché local y datos diarios por estación.</w:t>
             </w:r>
           </w:p>
         </w:tc>
@@ -16674,7 +16683,7 @@
               <w:rPr>
                 <w:sz w:val="18"/>
               </w:rPr>
-              <w:t>Como usuario, quiero trabajar con cache local para no saturar AEMET.</w:t>
+              <w:t>Como usuario, quiero trabajar con caché local para no saturar AEMET.</w:t>
             </w:r>
           </w:p>
         </w:tc>

</xml_diff>

<commit_message>
Formalizar tono de documentacion
</commit_message>
<xml_diff>
--- a/docs/memoria_proyecto_intermodular.docx
+++ b/docs/memoria_proyecto_intermodular.docx
@@ -81,7 +81,7 @@
         <w:ind w:left="283"/>
       </w:pPr>
       <w:r>
-        <w:t>Documento base para revisión académica. Los datos personales del centro y la validación final con el tutor deben completarse antes de la entrega.</w:t>
+        <w:t>Memoria técnica del proyecto. El documento describe el alcance implementado, la metodología seguida, los resultados obtenidos y las limitaciones actuales del prototipo.</w:t>
       </w:r>
     </w:p>
     <w:p>
@@ -293,7 +293,7 @@
         <w:spacing w:after="120"/>
       </w:pPr>
       <w:r>
-        <w:t>El problema que se aborda es la dificultad de calcular de forma precisa y defendible la cantidad de agua que debe aplicarse a una parcela agrícola. En muchos casos, el riego se realiza mediante criterios generales, turnos fijos o estimaciones poco conectadas con los datos meteorológicos reales.</w:t>
+        <w:t>El problema que se aborda es la dificultad de calcular de forma precisa y técnicamente justificable la cantidad de agua que debe aplicarse a una parcela agrícola. En muchos casos, el riego se realiza mediante criterios generales, turnos fijos o estimaciones poco conectadas con los datos meteorológicos reales.</w:t>
       </w:r>
     </w:p>
     <w:p>
@@ -972,7 +972,7 @@
         <w:spacing w:after="120"/>
       </w:pPr>
       <w:r>
-        <w:t>El proyecto se centra en un prototipo funcional. La versión desarrollada permite visualizar un inventario nacional de 920 estaciones AEMET y trabajar con estaciones de España. La validación principal se realiza sobre datos de la estación Sevilla Aeropuerto, porque el CSV local de demostración contiene esa estación versionada. La solución no sustituye una auditoría agronómica profesional, pero sí ofrece una base técnica para construir un servicio de recomendación y predicción de riego.</w:t>
+        <w:t>El proyecto se centra en un prototipo funcional. La versión desarrollada permite visualizar un inventario nacional de 920 estaciones AEMET y trabajar con estaciones de España. La validación principal se realiza sobre datos de la estación Sevilla Aeropuerto, porque el CSV local reproducible contiene esa estación versionada. La solución no sustituye una auditoría agronómica profesional, pero sí ofrece una base técnica para construir un servicio de recomendación y predicción de riego.</w:t>
       </w:r>
     </w:p>
     <w:p>
@@ -1795,7 +1795,7 @@
         <w:spacing w:after="120"/>
       </w:pPr>
       <w:r>
-        <w:t>Por tanto, BigQuery queda cerrado como alcance preparado pero no desplegado. En la entrega actual no se afirma que exista una infraestructura cloud funcionando.</w:t>
+        <w:t>Por tanto, BigQuery queda cerrado como alcance preparado pero no desplegado. En la versión implementada no se declara una infraestructura cloud operativa.</w:t>
       </w:r>
     </w:p>
     <w:p>
@@ -2493,7 +2493,7 @@
               <w:rPr>
                 <w:sz w:val="18"/>
               </w:rPr>
-              <w:t>Generación de datos defendibles.</w:t>
+              <w:t>Generación de datos trazables.</w:t>
             </w:r>
           </w:p>
         </w:tc>
@@ -7970,7 +7970,7 @@
               <w:rPr>
                 <w:sz w:val="18"/>
               </w:rPr>
-              <w:t>Proyecto preparado para entrega.</w:t>
+              <w:t>Proyecto documentado, validado y versionado.</w:t>
             </w:r>
           </w:p>
         </w:tc>
@@ -8642,7 +8642,7 @@
         <w:spacing w:after="60"/>
       </w:pPr>
       <w:r>
-        <w:t>Cálculo estable en modo CSV local fijado a Sevilla Aeropuerto, al ser la estación disponible en el dataset versionado de demostración.</w:t>
+        <w:t>Cálculo estable en modo CSV local fijado a Sevilla Aeropuerto, al ser la estación disponible en el dataset versionado.</w:t>
       </w:r>
     </w:p>
     <w:p>
@@ -11717,7 +11717,7 @@
               <w:rPr>
                 <w:sz w:val="18"/>
               </w:rPr>
-              <w:t>Muestra la dosis ML antes de convertirla a litros.</w:t>
+              <w:t>Expresa la dosis estimada por ML antes de convertirla a litros.</w:t>
             </w:r>
           </w:p>
         </w:tc>
@@ -12535,7 +12535,7 @@
         <w:spacing w:after="120"/>
       </w:pPr>
       <w:r>
-        <w:t>Las siguientes capturas corresponden a una ejecución real del prototipo. El escenario utilizado para documentar la prueba es: estación AEMET Sevilla Aeropuerto, periodo del 01/05/2024 al 07/05/2024, cultivo olivar, fase media, superficie de 3.500 m2 y modelo ML activado. La interfaz permite consultar el inventario nacional de 920 estaciones AEMET; en modo CSV local, el cálculo queda fijado a Sevilla Aeropuerto porque es la estación incluida en el dataset de demostración.</w:t>
+        <w:t>Las siguientes capturas corresponden a una ejecución real del prototipo. El escenario utilizado para documentar la prueba es: estación AEMET Sevilla Aeropuerto, periodo del 01/05/2024 al 07/05/2024, cultivo olivar, fase media, superficie de 3.500 m2 y modelo ML activado. La interfaz permite consultar el inventario nacional de 920 estaciones AEMET; en modo CSV local, el cálculo queda fijado a Sevilla Aeropuerto porque es la estación incluida en el dataset versionado.</w:t>
       </w:r>
     </w:p>
     <w:tbl>
@@ -14217,7 +14217,7 @@
         <w:spacing w:after="120"/>
       </w:pPr>
       <w:r>
-        <w:t>La principal fortaleza del trabajo es que combina una base agronómica trazable con una capa de Machine Learning. Esto evita que el modelo sea una caja negra sin justificación y permite explicar de dónde salen los resultados.</w:t>
+        <w:t>La principal fortaleza del trabajo es que combina una base agronómica trazable con una capa de Machine Learning. Esto evita presentar el modelo como un sistema opaco y permite justificar el origen de los resultados.</w:t>
       </w:r>
     </w:p>
     <w:p>
@@ -14439,7 +14439,7 @@
               <w:rPr>
                 <w:sz w:val="18"/>
               </w:rPr>
-              <w:t>El cálculo agronómico ofrece una recomendación defendible en litros, litros por planta y milímetros de riego.</w:t>
+              <w:t>El cálculo agronómico ofrece una recomendación técnicamente justificable en litros, litros por planta y milímetros de riego.</w:t>
             </w:r>
           </w:p>
         </w:tc>
@@ -14905,7 +14905,7 @@
         <w:spacing w:after="120"/>
       </w:pPr>
       <w:r>
-        <w:t>El proyecto demuestra que es posible construir un servicio de recomendación de riego apoyado en datos oficiales, reglas agronómicas y aprendizaje automático. La versión actual es un prototipo funcional y defendible. Su valor principal está en la estructura: cada módulo puede ampliarse sin romper el sistema completo.</w:t>
+        <w:t>El proyecto demuestra que es posible construir un servicio de recomendación de riego apoyado en datos oficiales, reglas agronómicas y aprendizaje automático. La versión actual es un prototipo funcional, trazable y reproducible. Su valor principal está en la estructura: cada módulo puede ampliarse sin romper el sistema completo.</w:t>
       </w:r>
     </w:p>
     <w:p>
@@ -17419,7 +17419,7 @@
               <w:rPr>
                 <w:sz w:val="18"/>
               </w:rPr>
-              <w:t>CSV/Markdown defendibles.</w:t>
+              <w:t>CSV/Markdown trazables.</w:t>
             </w:r>
           </w:p>
         </w:tc>
@@ -17655,7 +17655,7 @@
               <w:rPr>
                 <w:sz w:val="18"/>
               </w:rPr>
-              <w:t>Calidad y entrega</w:t>
+              <w:t>Calidad y documentación</w:t>
             </w:r>
           </w:p>
         </w:tc>

</xml_diff>

<commit_message>
Documentar proceso completo de ML
</commit_message>
<xml_diff>
--- a/docs/memoria_proyecto_intermodular.docx
+++ b/docs/memoria_proyecto_intermodular.docx
@@ -9226,6 +9226,54 @@
                 <w:sz w:val="18"/>
               </w:rPr>
               <w:t>Modelos entrenados localmente.</w:t>
+            </w:r>
+          </w:p>
+        </w:tc>
+      </w:tr>
+      <w:tr>
+        <w:tc>
+          <w:tcPr>
+            <w:tcW w:type="dxa" w:w="4536"/>
+            <w:vAlign w:val="center"/>
+            <w:tcMar>
+              <w:top w:w="80" w:type="dxa"/>
+              <w:start w:w="120" w:type="dxa"/>
+              <w:bottom w:w="80" w:type="dxa"/>
+              <w:end w:w="120" w:type="dxa"/>
+            </w:tcMar>
+          </w:tcPr>
+          <w:p>
+            <w:pPr>
+              <w:spacing w:after="0"/>
+            </w:pPr>
+            <w:r>
+              <w:rPr>
+                <w:sz w:val="18"/>
+              </w:rPr>
+              <w:t>docs/ml_proceso/</w:t>
+            </w:r>
+          </w:p>
+        </w:tc>
+        <w:tc>
+          <w:tcPr>
+            <w:tcW w:type="dxa" w:w="4536"/>
+            <w:vAlign w:val="center"/>
+            <w:tcMar>
+              <w:top w:w="80" w:type="dxa"/>
+              <w:start w:w="120" w:type="dxa"/>
+              <w:bottom w:w="80" w:type="dxa"/>
+              <w:end w:w="120" w:type="dxa"/>
+            </w:tcMar>
+          </w:tcPr>
+          <w:p>
+            <w:pPr>
+              <w:spacing w:after="0"/>
+            </w:pPr>
+            <w:r>
+              <w:rPr>
+                <w:sz w:val="18"/>
+              </w:rPr>
+              <w:t>Evidencias del proceso ML: código, tablas, gráficas y capturas.</w:t>
             </w:r>
           </w:p>
         </w:tc>

</xml_diff>

<commit_message>
Documentar pronostico futuro de riego
</commit_message>
<xml_diff>
--- a/docs/memoria_proyecto_intermodular.docx
+++ b/docs/memoria_proyecto_intermodular.docx
@@ -985,6 +985,14 @@
     </w:p>
     <w:p>
       <w:pPr>
+        <w:spacing w:after="120"/>
+      </w:pPr>
+      <w:r>
+        <w:t>Respecto al pronóstico de la semana siguiente, la arquitectura queda preparada, pero no se presenta como funcionalidad principal cerrada. Para recomendar riego a siete días futuros sería necesario alimentar el modelo con predicciones meteorológicas futuras fiables, especialmente temperatura prevista, lluvia prevista y, cuando sea posible, ET0 estimada. El modelo ML no predice el clima por sí mismo; utiliza variables meteorológicas como entrada para estimar la demanda de riego.</w:t>
+      </w:r>
+    </w:p>
+    <w:p>
+      <w:pPr>
         <w:pStyle w:val="Heading1"/>
       </w:pPr>
       <w:r>
@@ -1837,7 +1845,17 @@
         <w:spacing w:after="120"/>
       </w:pPr>
       <w:r>
-        <w:t>El modelo implementado es una red neuronal multicapa:</w:t>
+        <w:t xml:space="preserve">La arquitectura implementa dos opciones de entrenamiento: una red neuronal Keras/TensorFlow y una alternativa </w:t>
+      </w:r>
+      <w:r>
+        <w:rPr>
+          <w:rFonts w:ascii="Consolas" w:hAnsi="Consolas"/>
+          <w:sz w:val="18"/>
+        </w:rPr>
+        <w:t>linear_ridge</w:t>
+      </w:r>
+      <w:r>
+        <w:t xml:space="preserve"> ligera para demostraciones reproducibles. La variante Keras se estructura como una red neuronal multicapa:</w:t>
       </w:r>
     </w:p>
     <w:p>
@@ -1889,7 +1907,93 @@
         <w:pStyle w:val="Heading2"/>
       </w:pPr>
       <w:r>
-        <w:t>2.8 Visualización con Streamlit</w:t>
+        <w:t>2.8 Pronóstico a siete días: alcance y limitaciones</w:t>
+      </w:r>
+    </w:p>
+    <w:p>
+      <w:pPr>
+        <w:spacing w:after="120"/>
+      </w:pPr>
+      <w:r>
+        <w:t>Una evolución lógica del sistema es convertir la recomendación histórica en una recomendación anticipada para los próximos siete días. Técnicamente, esto es posible si el sistema recibe predicciones meteorológicas futuras y las transforma al mismo formato que los datos históricos utilizados por el motor de cálculo y por el modelo ML.</w:t>
+      </w:r>
+    </w:p>
+    <w:p>
+      <w:pPr>
+        <w:spacing w:after="120"/>
+      </w:pPr>
+      <w:r>
+        <w:t>El flujo objetivo sería:</w:t>
+      </w:r>
+    </w:p>
+    <w:p>
+      <w:pPr/>
+      <w:r>
+        <w:rPr>
+          <w:rFonts w:ascii="Consolas" w:hAnsi="Consolas"/>
+          <w:sz w:val="16"/>
+        </w:rPr>
+        <w:t>predicción meteorológica futura + cultivo + fase + superficie -&gt; recomendación de riego a siete días</w:t>
+      </w:r>
+    </w:p>
+    <w:p>
+      <w:pPr>
+        <w:spacing w:after="120"/>
+      </w:pPr>
+      <w:r>
+        <w:t>La limitación principal es que Machine Learning no sustituye a la predicción meteorológica. Para estimar el riego de la próxima semana, el sistema necesitaría una fuente de pronóstico que proporcione, como mínimo:</w:t>
+      </w:r>
+    </w:p>
+    <w:p>
+      <w:pPr>
+        <w:pStyle w:val="ListBullet"/>
+        <w:spacing w:after="60"/>
+      </w:pPr>
+      <w:r>
+        <w:t>Temperatura máxima y mínima prevista.</w:t>
+      </w:r>
+    </w:p>
+    <w:p>
+      <w:pPr>
+        <w:pStyle w:val="ListBullet"/>
+        <w:spacing w:after="60"/>
+      </w:pPr>
+      <w:r>
+        <w:t>Precipitación prevista o, en su defecto, una estimación justificable de lluvia esperada.</w:t>
+      </w:r>
+    </w:p>
+    <w:p>
+      <w:pPr>
+        <w:pStyle w:val="ListBullet"/>
+        <w:spacing w:after="60"/>
+      </w:pPr>
+      <w:r>
+        <w:t>Horizonte temporal diario.</w:t>
+      </w:r>
+    </w:p>
+    <w:p>
+      <w:pPr>
+        <w:pStyle w:val="ListBullet"/>
+        <w:spacing w:after="60"/>
+      </w:pPr>
+      <w:r>
+        <w:t>Localización asociada a la parcela o municipio.</w:t>
+      </w:r>
+    </w:p>
+    <w:p>
+      <w:pPr>
+        <w:spacing w:after="120"/>
+      </w:pPr>
+      <w:r>
+        <w:t>Si la fuente solo ofrece probabilidad de precipitación y no lluvia en milímetros, el sistema no debe inventar el dato. En ese caso, la salida tendría que mostrarse como recomendación con incertidumbre o como escenario condicionado a lluvia prevista. Por tanto, el prototipo queda preparado para esta ampliación, pero la versión defendida se valida con históricos reales de AEMET y CSV local reproducible.</w:t>
+      </w:r>
+    </w:p>
+    <w:p>
+      <w:pPr>
+        <w:pStyle w:val="Heading2"/>
+      </w:pPr>
+      <w:r>
+        <w:t>2.9 Visualización con Streamlit</w:t>
       </w:r>
     </w:p>
     <w:p>
@@ -1950,7 +2054,7 @@
         <w:pStyle w:val="Heading2"/>
       </w:pPr>
       <w:r>
-        <w:t>2.9 Pruebas unitarias</w:t>
+        <w:t>2.10 Pruebas unitarias</w:t>
       </w:r>
     </w:p>
     <w:p>
@@ -1976,7 +2080,7 @@
         <w:pStyle w:val="Heading2"/>
       </w:pPr>
       <w:r>
-        <w:t>2.10 Ética, datos y uso responsable de IA</w:t>
+        <w:t>2.11 Ética, datos y uso responsable de IA</w:t>
       </w:r>
     </w:p>
     <w:p>
@@ -11785,7 +11889,7 @@
         <w:pStyle w:val="Heading2"/>
       </w:pPr>
       <w:r>
-        <w:t>4.6 Resultado del modelo ML/Keras</w:t>
+        <w:t>4.6 Resultado del modelo ML</w:t>
       </w:r>
     </w:p>
     <w:p>
@@ -11793,7 +11897,45 @@
         <w:spacing w:after="120"/>
       </w:pPr>
       <w:r>
-        <w:t>El modelo Keras se entrenó con un dataset de 168 filas y variables climáticas/agronómicas codificadas. La validación interna obtuvo:</w:t>
+        <w:t xml:space="preserve">La versión demostrativa actual utiliza un modelo </w:t>
+      </w:r>
+      <w:r>
+        <w:rPr>
+          <w:rFonts w:ascii="Consolas" w:hAnsi="Consolas"/>
+          <w:sz w:val="18"/>
+        </w:rPr>
+        <w:t>linear_ridge</w:t>
+      </w:r>
+      <w:r>
+        <w:t xml:space="preserve"> entrenado sobre el CSV semestral de Sevilla Aeropuerto (</w:t>
+      </w:r>
+      <w:r>
+        <w:rPr>
+          <w:rFonts w:ascii="Consolas" w:hAnsi="Consolas"/>
+          <w:sz w:val="18"/>
+        </w:rPr>
+        <w:t>2024-01-01</w:t>
+      </w:r>
+      <w:r>
+        <w:t xml:space="preserve"> a </w:t>
+      </w:r>
+      <w:r>
+        <w:rPr>
+          <w:rFonts w:ascii="Consolas" w:hAnsi="Consolas"/>
+          <w:sz w:val="18"/>
+        </w:rPr>
+        <w:t>2024-06-30</w:t>
+      </w:r>
+      <w:r>
+        <w:t>). Esta decisión aporta estabilidad en la defensa y permite incluir semanas con lluvia real. El proyecto conserva la posibilidad de entrenar una variante Keras/TensorFlow, pero la demo principal utiliza el modelo ligero versionado por su reproducibilidad.</w:t>
+      </w:r>
+    </w:p>
+    <w:p>
+      <w:pPr>
+        <w:spacing w:after="120"/>
+      </w:pPr>
+      <w:r>
+        <w:t>El modelo se entrenó con un dataset de 546 filas y variables climáticas/agronómicas codificadas. La validación interna obtuvo:</w:t>
       </w:r>
     </w:p>
     <w:tbl>
@@ -11903,7 +12045,7 @@
               <w:rPr>
                 <w:sz w:val="18"/>
               </w:rPr>
-              <w:t>0,0289 mm</w:t>
+              <w:t>0,3164 mm</w:t>
             </w:r>
           </w:p>
         </w:tc>
@@ -11951,7 +12093,7 @@
               <w:rPr>
                 <w:sz w:val="18"/>
               </w:rPr>
-              <w:t>0,0381 mm</w:t>
+              <w:t>0,5301 mm</w:t>
             </w:r>
           </w:p>
         </w:tc>
@@ -11999,7 +12141,7 @@
               <w:rPr>
                 <w:sz w:val="18"/>
               </w:rPr>
-              <w:t>0,9975</w:t>
+              <w:t>0,9337</w:t>
             </w:r>
           </w:p>
         </w:tc>
@@ -12047,7 +12189,7 @@
               <w:rPr>
                 <w:sz w:val="18"/>
               </w:rPr>
-              <w:t>33</w:t>
+              <w:t>109</w:t>
             </w:r>
           </w:p>
         </w:tc>
@@ -12234,7 +12376,7 @@
               <w:rPr>
                 <w:sz w:val="18"/>
               </w:rPr>
-              <w:t>97.160,07 L</w:t>
+              <w:t>94.522,69 L</w:t>
             </w:r>
           </w:p>
         </w:tc>
@@ -12305,7 +12447,7 @@
               <w:rPr>
                 <w:sz w:val="18"/>
               </w:rPr>
-              <w:t>13.880,01 L/día</w:t>
+              <w:t>13.503,24 L/día</w:t>
             </w:r>
           </w:p>
         </w:tc>
@@ -12376,7 +12518,7 @@
               <w:rPr>
                 <w:sz w:val="18"/>
               </w:rPr>
-              <w:t>3,97 mm/día</w:t>
+              <w:t>3,86 mm/día</w:t>
             </w:r>
           </w:p>
         </w:tc>
@@ -12447,7 +12589,7 @@
               <w:rPr>
                 <w:sz w:val="18"/>
               </w:rPr>
-              <w:t>31,72 L/planta/día</w:t>
+              <w:t>30,86 L/planta/día</w:t>
             </w:r>
           </w:p>
         </w:tc>
@@ -12459,7 +12601,7 @@
         <w:spacing w:after="120"/>
       </w:pPr>
       <w:r>
-        <w:t>La diferencia es mínima porque el modelo se ha entrenado con etiquetas derivadas del motor agronómico. Este comportamiento es útil para validar la integración técnica de ML, pero el salto a un servicio real requiere incorporar datos reales de campo.</w:t>
+        <w:t>La diferencia se mantiene dentro de un rango razonable para una capa predictiva entrenada con etiquetas derivadas del motor agronómico. Este comportamiento es útil para validar la integración técnica de ML, pero el salto a un servicio real requiere incorporar datos reales de campo.</w:t>
       </w:r>
     </w:p>
     <w:p>
@@ -12467,7 +12609,385 @@
         <w:pStyle w:val="Heading2"/>
       </w:pPr>
       <w:r>
-        <w:t>4.8 Validación técnica</w:t>
+        <w:t>4.8 Escenario de lluvia y preparación para pronóstico</w:t>
+      </w:r>
+    </w:p>
+    <w:p>
+      <w:pPr>
+        <w:spacing w:after="120"/>
+      </w:pPr>
+      <w:r>
+        <w:t>Para demostrar que la lluvia reduce el riego, se añadió al CSV local un periodo real con precipitación: Sevilla Aeropuerto del 27/03/2024 al 02/04/2024. En ese escenario se obtuvo:</w:t>
+      </w:r>
+    </w:p>
+    <w:tbl>
+      <w:tblPr>
+        <w:tblStyle w:val="TableGrid"/>
+        <w:tblW w:type="auto" w:w="0"/>
+        <w:jc w:val="center"/>
+        <w:tblLayout w:type="autofit"/>
+        <w:tblLook w:firstColumn="1" w:firstRow="1" w:lastColumn="0" w:lastRow="0" w:noHBand="0" w:noVBand="1" w:val="04A0"/>
+      </w:tblPr>
+      <w:tblGrid>
+        <w:gridCol w:w="4536"/>
+        <w:gridCol w:w="4536"/>
+      </w:tblGrid>
+      <w:tr>
+        <w:tc>
+          <w:tcPr>
+            <w:tcW w:type="dxa" w:w="4536"/>
+            <w:vAlign w:val="center"/>
+            <w:tcMar>
+              <w:top w:w="80" w:type="dxa"/>
+              <w:start w:w="120" w:type="dxa"/>
+              <w:bottom w:w="80" w:type="dxa"/>
+              <w:end w:w="120" w:type="dxa"/>
+            </w:tcMar>
+            <w:shd w:fill="E8EEF5"/>
+          </w:tcPr>
+          <w:p>
+            <w:pPr>
+              <w:spacing w:after="0"/>
+            </w:pPr>
+            <w:r>
+              <w:rPr>
+                <w:b/>
+                <w:sz w:val="18"/>
+              </w:rPr>
+              <w:t>Indicador</w:t>
+            </w:r>
+          </w:p>
+        </w:tc>
+        <w:tc>
+          <w:tcPr>
+            <w:tcW w:type="dxa" w:w="4536"/>
+            <w:vAlign w:val="center"/>
+            <w:tcMar>
+              <w:top w:w="80" w:type="dxa"/>
+              <w:start w:w="120" w:type="dxa"/>
+              <w:bottom w:w="80" w:type="dxa"/>
+              <w:end w:w="120" w:type="dxa"/>
+            </w:tcMar>
+            <w:shd w:fill="E8EEF5"/>
+          </w:tcPr>
+          <w:p>
+            <w:pPr>
+              <w:spacing w:after="0"/>
+            </w:pPr>
+            <w:r>
+              <w:rPr>
+                <w:b/>
+                <w:sz w:val="18"/>
+              </w:rPr>
+              <w:t>Resultado</w:t>
+            </w:r>
+          </w:p>
+        </w:tc>
+      </w:tr>
+      <w:tr>
+        <w:tc>
+          <w:tcPr>
+            <w:tcW w:type="dxa" w:w="4536"/>
+            <w:vAlign w:val="center"/>
+            <w:tcMar>
+              <w:top w:w="80" w:type="dxa"/>
+              <w:start w:w="120" w:type="dxa"/>
+              <w:bottom w:w="80" w:type="dxa"/>
+              <w:end w:w="120" w:type="dxa"/>
+            </w:tcMar>
+          </w:tcPr>
+          <w:p>
+            <w:pPr>
+              <w:spacing w:after="0"/>
+            </w:pPr>
+            <w:r>
+              <w:rPr>
+                <w:sz w:val="18"/>
+              </w:rPr>
+              <w:t>Lluvia total</w:t>
+            </w:r>
+          </w:p>
+        </w:tc>
+        <w:tc>
+          <w:tcPr>
+            <w:tcW w:type="dxa" w:w="4536"/>
+            <w:vAlign w:val="center"/>
+            <w:tcMar>
+              <w:top w:w="80" w:type="dxa"/>
+              <w:start w:w="120" w:type="dxa"/>
+              <w:bottom w:w="80" w:type="dxa"/>
+              <w:end w:w="120" w:type="dxa"/>
+            </w:tcMar>
+          </w:tcPr>
+          <w:p>
+            <w:pPr>
+              <w:spacing w:after="0"/>
+            </w:pPr>
+            <w:r>
+              <w:rPr>
+                <w:sz w:val="18"/>
+              </w:rPr>
+              <w:t>106,80 mm</w:t>
+            </w:r>
+          </w:p>
+        </w:tc>
+      </w:tr>
+      <w:tr>
+        <w:tc>
+          <w:tcPr>
+            <w:tcW w:type="dxa" w:w="4536"/>
+            <w:vAlign w:val="center"/>
+            <w:tcMar>
+              <w:top w:w="80" w:type="dxa"/>
+              <w:start w:w="120" w:type="dxa"/>
+              <w:bottom w:w="80" w:type="dxa"/>
+              <w:end w:w="120" w:type="dxa"/>
+            </w:tcMar>
+          </w:tcPr>
+          <w:p>
+            <w:pPr>
+              <w:spacing w:after="0"/>
+            </w:pPr>
+            <w:r>
+              <w:rPr>
+                <w:sz w:val="18"/>
+              </w:rPr>
+              <w:t>ET0 media</w:t>
+            </w:r>
+          </w:p>
+        </w:tc>
+        <w:tc>
+          <w:tcPr>
+            <w:tcW w:type="dxa" w:w="4536"/>
+            <w:vAlign w:val="center"/>
+            <w:tcMar>
+              <w:top w:w="80" w:type="dxa"/>
+              <w:start w:w="120" w:type="dxa"/>
+              <w:bottom w:w="80" w:type="dxa"/>
+              <w:end w:w="120" w:type="dxa"/>
+            </w:tcMar>
+          </w:tcPr>
+          <w:p>
+            <w:pPr>
+              <w:spacing w:after="0"/>
+            </w:pPr>
+            <w:r>
+              <w:rPr>
+                <w:sz w:val="18"/>
+              </w:rPr>
+              <w:t>2,72 mm/día</w:t>
+            </w:r>
+          </w:p>
+        </w:tc>
+      </w:tr>
+      <w:tr>
+        <w:tc>
+          <w:tcPr>
+            <w:tcW w:type="dxa" w:w="4536"/>
+            <w:vAlign w:val="center"/>
+            <w:tcMar>
+              <w:top w:w="80" w:type="dxa"/>
+              <w:start w:w="120" w:type="dxa"/>
+              <w:bottom w:w="80" w:type="dxa"/>
+              <w:end w:w="120" w:type="dxa"/>
+            </w:tcMar>
+          </w:tcPr>
+          <w:p>
+            <w:pPr>
+              <w:spacing w:after="0"/>
+            </w:pPr>
+            <w:r>
+              <w:rPr>
+                <w:sz w:val="18"/>
+              </w:rPr>
+              <w:t>ETc media</w:t>
+            </w:r>
+          </w:p>
+        </w:tc>
+        <w:tc>
+          <w:tcPr>
+            <w:tcW w:type="dxa" w:w="4536"/>
+            <w:vAlign w:val="center"/>
+            <w:tcMar>
+              <w:top w:w="80" w:type="dxa"/>
+              <w:start w:w="120" w:type="dxa"/>
+              <w:bottom w:w="80" w:type="dxa"/>
+              <w:end w:w="120" w:type="dxa"/>
+            </w:tcMar>
+          </w:tcPr>
+          <w:p>
+            <w:pPr>
+              <w:spacing w:after="0"/>
+            </w:pPr>
+            <w:r>
+              <w:rPr>
+                <w:sz w:val="18"/>
+              </w:rPr>
+              <w:t>1,91 mm/día</w:t>
+            </w:r>
+          </w:p>
+        </w:tc>
+      </w:tr>
+      <w:tr>
+        <w:tc>
+          <w:tcPr>
+            <w:tcW w:type="dxa" w:w="4536"/>
+            <w:vAlign w:val="center"/>
+            <w:tcMar>
+              <w:top w:w="80" w:type="dxa"/>
+              <w:start w:w="120" w:type="dxa"/>
+              <w:bottom w:w="80" w:type="dxa"/>
+              <w:end w:w="120" w:type="dxa"/>
+            </w:tcMar>
+          </w:tcPr>
+          <w:p>
+            <w:pPr>
+              <w:spacing w:after="0"/>
+            </w:pPr>
+            <w:r>
+              <w:rPr>
+                <w:sz w:val="18"/>
+              </w:rPr>
+              <w:t>Riego total del periodo</w:t>
+            </w:r>
+          </w:p>
+        </w:tc>
+        <w:tc>
+          <w:tcPr>
+            <w:tcW w:type="dxa" w:w="4536"/>
+            <w:vAlign w:val="center"/>
+            <w:tcMar>
+              <w:top w:w="80" w:type="dxa"/>
+              <w:start w:w="120" w:type="dxa"/>
+              <w:bottom w:w="80" w:type="dxa"/>
+              <w:end w:w="120" w:type="dxa"/>
+            </w:tcMar>
+          </w:tcPr>
+          <w:p>
+            <w:pPr>
+              <w:spacing w:after="0"/>
+            </w:pPr>
+            <w:r>
+              <w:rPr>
+                <w:sz w:val="18"/>
+              </w:rPr>
+              <w:t>18.620 L</w:t>
+            </w:r>
+          </w:p>
+        </w:tc>
+      </w:tr>
+      <w:tr>
+        <w:tc>
+          <w:tcPr>
+            <w:tcW w:type="dxa" w:w="4536"/>
+            <w:vAlign w:val="center"/>
+            <w:tcMar>
+              <w:top w:w="80" w:type="dxa"/>
+              <w:start w:w="120" w:type="dxa"/>
+              <w:bottom w:w="80" w:type="dxa"/>
+              <w:end w:w="120" w:type="dxa"/>
+            </w:tcMar>
+          </w:tcPr>
+          <w:p>
+            <w:pPr>
+              <w:spacing w:after="0"/>
+            </w:pPr>
+            <w:r>
+              <w:rPr>
+                <w:sz w:val="18"/>
+              </w:rPr>
+              <w:t>Riego medio diario</w:t>
+            </w:r>
+          </w:p>
+        </w:tc>
+        <w:tc>
+          <w:tcPr>
+            <w:tcW w:type="dxa" w:w="4536"/>
+            <w:vAlign w:val="center"/>
+            <w:tcMar>
+              <w:top w:w="80" w:type="dxa"/>
+              <w:start w:w="120" w:type="dxa"/>
+              <w:bottom w:w="80" w:type="dxa"/>
+              <w:end w:w="120" w:type="dxa"/>
+            </w:tcMar>
+          </w:tcPr>
+          <w:p>
+            <w:pPr>
+              <w:spacing w:after="0"/>
+            </w:pPr>
+            <w:r>
+              <w:rPr>
+                <w:sz w:val="18"/>
+              </w:rPr>
+              <w:t>2.660 L/día</w:t>
+            </w:r>
+          </w:p>
+        </w:tc>
+      </w:tr>
+      <w:tr>
+        <w:tc>
+          <w:tcPr>
+            <w:tcW w:type="dxa" w:w="4536"/>
+            <w:vAlign w:val="center"/>
+            <w:tcMar>
+              <w:top w:w="80" w:type="dxa"/>
+              <w:start w:w="120" w:type="dxa"/>
+              <w:bottom w:w="80" w:type="dxa"/>
+              <w:end w:w="120" w:type="dxa"/>
+            </w:tcMar>
+          </w:tcPr>
+          <w:p>
+            <w:pPr>
+              <w:spacing w:after="0"/>
+            </w:pPr>
+            <w:r>
+              <w:rPr>
+                <w:sz w:val="18"/>
+              </w:rPr>
+              <w:t>Lámina diaria</w:t>
+            </w:r>
+          </w:p>
+        </w:tc>
+        <w:tc>
+          <w:tcPr>
+            <w:tcW w:type="dxa" w:w="4536"/>
+            <w:vAlign w:val="center"/>
+            <w:tcMar>
+              <w:top w:w="80" w:type="dxa"/>
+              <w:start w:w="120" w:type="dxa"/>
+              <w:bottom w:w="80" w:type="dxa"/>
+              <w:end w:w="120" w:type="dxa"/>
+            </w:tcMar>
+          </w:tcPr>
+          <w:p>
+            <w:pPr>
+              <w:spacing w:after="0"/>
+            </w:pPr>
+            <w:r>
+              <w:rPr>
+                <w:sz w:val="18"/>
+              </w:rPr>
+              <w:t>0,76 mm/día</w:t>
+            </w:r>
+          </w:p>
+        </w:tc>
+      </w:tr>
+    </w:tbl>
+    <w:p/>
+    <w:p>
+      <w:pPr>
+        <w:spacing w:after="120"/>
+      </w:pPr>
+      <w:r>
+        <w:t>Durante los días con lluvia suficiente, el riego recomendado queda en 0 L porque la lluvia efectiva cubre la demanda del cultivo. Este mismo mecanismo sería el que permitiría trabajar con predicciones a siete días, siempre que la fuente meteorológica futura proporcione lluvia prevista y temperaturas diarias con calidad suficiente.</w:t>
+      </w:r>
+    </w:p>
+    <w:p>
+      <w:pPr>
+        <w:pStyle w:val="Heading2"/>
+      </w:pPr>
+      <w:r>
+        <w:t>4.9 Validación técnica</w:t>
       </w:r>
     </w:p>
     <w:p>
@@ -12575,7 +13095,7 @@
         <w:pStyle w:val="Heading2"/>
       </w:pPr>
       <w:r>
-        <w:t>4.9 Capturas del sistema</w:t>
+        <w:t>4.10 Capturas del sistema</w:t>
       </w:r>
     </w:p>
     <w:p>
@@ -13457,7 +13977,7 @@
         <w:pStyle w:val="Heading2"/>
       </w:pPr>
       <w:r>
-        <w:t>4.9 Comparación con objetivos iniciales</w:t>
+        <w:t>4.11 Comparación con objetivos iniciales</w:t>
       </w:r>
     </w:p>
     <w:tbl>
@@ -14840,6 +15360,15 @@
         <w:spacing w:after="60"/>
       </w:pPr>
       <w:r>
+        <w:t>Diferenciar recomendación con históricos reales y pronóstico futuro a siete días.</w:t>
+      </w:r>
+    </w:p>
+    <w:p>
+      <w:pPr>
+        <w:pStyle w:val="ListBullet"/>
+        <w:spacing w:after="60"/>
+      </w:pPr>
+      <w:r>
         <w:t>Convertir resultados técnicos en una salida útil para un cliente.</w:t>
       </w:r>
     </w:p>
@@ -14910,7 +15439,16 @@
         <w:spacing w:after="60"/>
       </w:pPr>
       <w:r>
-        <w:t>Incorporar predicción meteorológica futura, no solo datos históricos.</w:t>
+        <w:t>Incorporar un modo de pronóstico a siete días cuando exista una fuente meteorológica futura con temperatura diaria y lluvia prevista en milímetros.</w:t>
+      </w:r>
+    </w:p>
+    <w:p>
+      <w:pPr>
+        <w:pStyle w:val="ListBullet"/>
+        <w:spacing w:after="60"/>
+      </w:pPr>
+      <w:r>
+        <w:t>Mostrar avisos de incertidumbre cuando la predicción futura solo proporcione probabilidad de precipitación.</w:t>
       </w:r>
     </w:p>
     <w:p>

</xml_diff>

<commit_message>
Incorporar ROI y modelo comercial
</commit_message>
<xml_diff>
--- a/docs/memoria_proyecto_intermodular.docx
+++ b/docs/memoria_proyecto_intermodular.docx
@@ -8094,7 +8094,45 @@
         <w:spacing w:after="120"/>
       </w:pPr>
       <w:r>
-        <w:t>No se calcula un ROI monetario cerrado porque faltan datos reales de explotación: consumo histórico de riego tradicional, precio del agua, coste del servicio y ahorro confirmado en campo. Para evitar estimaciones no justificadas, el proyecto deja definido el método de cálculo:</w:t>
+        <w:t>El ROI debe tratarse como una simulación económica, no como un resultado medido en campo. Faltan datos reales de explotación: consumo histórico de riego tradicional, precio real del agua, coste energético, tiempo real dedicado a revisión y ahorro confirmado en parcela. Para evitar conclusiones no justificadas, se separan dos niveles:</w:t>
+      </w:r>
+    </w:p>
+    <w:p>
+      <w:pPr>
+        <w:pStyle w:val="ListBullet"/>
+        <w:spacing w:after="60"/>
+      </w:pPr>
+      <w:r>
+        <w:rPr>
+          <w:b/>
+        </w:rPr>
+        <w:t>ROI del cliente:</w:t>
+      </w:r>
+      <w:r>
+        <w:t xml:space="preserve"> mide si al agricultor le compensa pagar el informe de recomendación.</w:t>
+      </w:r>
+    </w:p>
+    <w:p>
+      <w:pPr>
+        <w:pStyle w:val="ListBullet"/>
+        <w:spacing w:after="60"/>
+      </w:pPr>
+      <w:r>
+        <w:rPr>
+          <w:b/>
+        </w:rPr>
+        <w:t>ROI del proveedor:</w:t>
+      </w:r>
+      <w:r>
+        <w:t xml:space="preserve"> mide si el servicio puede venderse con margen después de revisar datos y preparar la recomendación.</w:t>
+      </w:r>
+    </w:p>
+    <w:p>
+      <w:pPr>
+        <w:spacing w:after="120"/>
+      </w:pPr>
+      <w:r>
+        <w:t>El método general de cálculo es:</w:t>
       </w:r>
     </w:p>
     <w:p>
@@ -8108,9 +8146,13 @@
         <w:br/>
         <w:t>ahorro_agua_m3 = ahorro_agua_L / 1000</w:t>
         <w:br/>
-        <w:t>ahorro_economico = ahorro_agua_m3 * precio_agua_m3</w:t>
+        <w:t>ahorro_directo = ahorro_agua_m3 * coste_agua_energia_m3</w:t>
         <w:br/>
-        <w:t>ROI = ((ahorro_economico - coste_implantacion) / coste_implantacion) * 100</w:t>
+        <w:t>ahorro_tiempo = horas_revision_ahorradas * coste_hora_revision</w:t>
+        <w:br/>
+        <w:t>beneficio_cliente = ahorro_directo + ahorro_tiempo</w:t>
+        <w:br/>
+        <w:t>ROI_cliente = ((beneficio_cliente - precio_servicio) / precio_servicio) * 100</w:t>
       </w:r>
     </w:p>
     <w:p>
@@ -8119,6 +8161,1734 @@
       </w:pPr>
       <w:r>
         <w:t>La aplicación ya ofrece la variable necesaria para alimentar este análisis: litros recomendados por parcela, cultivo y periodo. Con datos reales de consumo previo, el ROI puede calcularse sin modificar el sistema.</w:t>
+      </w:r>
+    </w:p>
+    <w:p>
+      <w:pPr>
+        <w:pStyle w:val="Heading3"/>
+      </w:pPr>
+      <w:r>
+        <w:t>Supuestos comerciales utilizados</w:t>
+      </w:r>
+    </w:p>
+    <w:p>
+      <w:pPr>
+        <w:spacing w:after="120"/>
+      </w:pPr>
+      <w:r>
+        <w:t>Los siguientes importes son supuestos de simulación para explicar el modelo de negocio. Deben sustituirse por facturas reales y tarifas reales del cliente:</w:t>
+      </w:r>
+    </w:p>
+    <w:tbl>
+      <w:tblPr>
+        <w:tblStyle w:val="TableGrid"/>
+        <w:tblW w:type="auto" w:w="0"/>
+        <w:jc w:val="center"/>
+        <w:tblLayout w:type="autofit"/>
+        <w:tblLook w:firstColumn="1" w:firstRow="1" w:lastColumn="0" w:lastRow="0" w:noHBand="0" w:noVBand="1" w:val="04A0"/>
+      </w:tblPr>
+      <w:tblGrid>
+        <w:gridCol w:w="3024"/>
+        <w:gridCol w:w="3024"/>
+        <w:gridCol w:w="3024"/>
+      </w:tblGrid>
+      <w:tr>
+        <w:tc>
+          <w:tcPr>
+            <w:tcW w:type="dxa" w:w="3024"/>
+            <w:vAlign w:val="center"/>
+            <w:tcMar>
+              <w:top w:w="80" w:type="dxa"/>
+              <w:start w:w="120" w:type="dxa"/>
+              <w:bottom w:w="80" w:type="dxa"/>
+              <w:end w:w="120" w:type="dxa"/>
+            </w:tcMar>
+            <w:shd w:fill="E8EEF5"/>
+          </w:tcPr>
+          <w:p>
+            <w:pPr>
+              <w:spacing w:after="0"/>
+            </w:pPr>
+            <w:r>
+              <w:rPr>
+                <w:b/>
+                <w:sz w:val="18"/>
+              </w:rPr>
+              <w:t>Variable</w:t>
+            </w:r>
+          </w:p>
+        </w:tc>
+        <w:tc>
+          <w:tcPr>
+            <w:tcW w:type="dxa" w:w="3024"/>
+            <w:vAlign w:val="center"/>
+            <w:tcMar>
+              <w:top w:w="80" w:type="dxa"/>
+              <w:start w:w="120" w:type="dxa"/>
+              <w:bottom w:w="80" w:type="dxa"/>
+              <w:end w:w="120" w:type="dxa"/>
+            </w:tcMar>
+            <w:shd w:fill="E8EEF5"/>
+          </w:tcPr>
+          <w:p>
+            <w:pPr>
+              <w:spacing w:after="0"/>
+            </w:pPr>
+            <w:r>
+              <w:rPr>
+                <w:b/>
+                <w:sz w:val="18"/>
+              </w:rPr>
+              <w:t>Valor usado</w:t>
+            </w:r>
+          </w:p>
+        </w:tc>
+        <w:tc>
+          <w:tcPr>
+            <w:tcW w:type="dxa" w:w="3024"/>
+            <w:vAlign w:val="center"/>
+            <w:tcMar>
+              <w:top w:w="80" w:type="dxa"/>
+              <w:start w:w="120" w:type="dxa"/>
+              <w:bottom w:w="80" w:type="dxa"/>
+              <w:end w:w="120" w:type="dxa"/>
+            </w:tcMar>
+            <w:shd w:fill="E8EEF5"/>
+          </w:tcPr>
+          <w:p>
+            <w:pPr>
+              <w:spacing w:after="0"/>
+            </w:pPr>
+            <w:r>
+              <w:rPr>
+                <w:b/>
+                <w:sz w:val="18"/>
+              </w:rPr>
+              <w:t>Justificación</w:t>
+            </w:r>
+          </w:p>
+        </w:tc>
+      </w:tr>
+      <w:tr>
+        <w:tc>
+          <w:tcPr>
+            <w:tcW w:type="dxa" w:w="3024"/>
+            <w:vAlign w:val="center"/>
+            <w:tcMar>
+              <w:top w:w="80" w:type="dxa"/>
+              <w:start w:w="120" w:type="dxa"/>
+              <w:bottom w:w="80" w:type="dxa"/>
+              <w:end w:w="120" w:type="dxa"/>
+            </w:tcMar>
+          </w:tcPr>
+          <w:p>
+            <w:pPr>
+              <w:spacing w:after="0"/>
+            </w:pPr>
+            <w:r>
+              <w:rPr>
+                <w:sz w:val="18"/>
+              </w:rPr>
+              <w:t>Exceso de riego tradicional</w:t>
+            </w:r>
+          </w:p>
+        </w:tc>
+        <w:tc>
+          <w:tcPr>
+            <w:tcW w:type="dxa" w:w="3024"/>
+            <w:vAlign w:val="center"/>
+            <w:tcMar>
+              <w:top w:w="80" w:type="dxa"/>
+              <w:start w:w="120" w:type="dxa"/>
+              <w:bottom w:w="80" w:type="dxa"/>
+              <w:end w:w="120" w:type="dxa"/>
+            </w:tcMar>
+          </w:tcPr>
+          <w:p>
+            <w:pPr>
+              <w:spacing w:after="0"/>
+            </w:pPr>
+            <w:r>
+              <w:rPr>
+                <w:sz w:val="18"/>
+              </w:rPr>
+              <w:t>15 % sobre la recomendación</w:t>
+            </w:r>
+          </w:p>
+        </w:tc>
+        <w:tc>
+          <w:tcPr>
+            <w:tcW w:type="dxa" w:w="3024"/>
+            <w:vAlign w:val="center"/>
+            <w:tcMar>
+              <w:top w:w="80" w:type="dxa"/>
+              <w:start w:w="120" w:type="dxa"/>
+              <w:bottom w:w="80" w:type="dxa"/>
+              <w:end w:w="120" w:type="dxa"/>
+            </w:tcMar>
+          </w:tcPr>
+          <w:p>
+            <w:pPr>
+              <w:spacing w:after="0"/>
+            </w:pPr>
+            <w:r>
+              <w:rPr>
+                <w:sz w:val="18"/>
+              </w:rPr>
+              <w:t>Escenario prudente para simular riego tradicional no optimizado.</w:t>
+            </w:r>
+          </w:p>
+        </w:tc>
+      </w:tr>
+      <w:tr>
+        <w:tc>
+          <w:tcPr>
+            <w:tcW w:type="dxa" w:w="3024"/>
+            <w:vAlign w:val="center"/>
+            <w:tcMar>
+              <w:top w:w="80" w:type="dxa"/>
+              <w:start w:w="120" w:type="dxa"/>
+              <w:bottom w:w="80" w:type="dxa"/>
+              <w:end w:w="120" w:type="dxa"/>
+            </w:tcMar>
+          </w:tcPr>
+          <w:p>
+            <w:pPr>
+              <w:spacing w:after="0"/>
+            </w:pPr>
+            <w:r>
+              <w:rPr>
+                <w:sz w:val="18"/>
+              </w:rPr>
+              <w:t>Coste conjunto agua + energía</w:t>
+            </w:r>
+          </w:p>
+        </w:tc>
+        <w:tc>
+          <w:tcPr>
+            <w:tcW w:type="dxa" w:w="3024"/>
+            <w:vAlign w:val="center"/>
+            <w:tcMar>
+              <w:top w:w="80" w:type="dxa"/>
+              <w:start w:w="120" w:type="dxa"/>
+              <w:bottom w:w="80" w:type="dxa"/>
+              <w:end w:w="120" w:type="dxa"/>
+            </w:tcMar>
+          </w:tcPr>
+          <w:p>
+            <w:pPr>
+              <w:spacing w:after="0"/>
+            </w:pPr>
+            <w:r>
+              <w:rPr>
+                <w:sz w:val="18"/>
+              </w:rPr>
+              <w:t>0,40 EUR/m3</w:t>
+            </w:r>
+          </w:p>
+        </w:tc>
+        <w:tc>
+          <w:tcPr>
+            <w:tcW w:type="dxa" w:w="3024"/>
+            <w:vAlign w:val="center"/>
+            <w:tcMar>
+              <w:top w:w="80" w:type="dxa"/>
+              <w:start w:w="120" w:type="dxa"/>
+              <w:bottom w:w="80" w:type="dxa"/>
+              <w:end w:w="120" w:type="dxa"/>
+            </w:tcMar>
+          </w:tcPr>
+          <w:p>
+            <w:pPr>
+              <w:spacing w:after="0"/>
+            </w:pPr>
+            <w:r>
+              <w:rPr>
+                <w:sz w:val="18"/>
+              </w:rPr>
+              <w:t>Supuesto operativo para valorar el ahorro directo.</w:t>
+            </w:r>
+          </w:p>
+        </w:tc>
+      </w:tr>
+      <w:tr>
+        <w:tc>
+          <w:tcPr>
+            <w:tcW w:type="dxa" w:w="3024"/>
+            <w:vAlign w:val="center"/>
+            <w:tcMar>
+              <w:top w:w="80" w:type="dxa"/>
+              <w:start w:w="120" w:type="dxa"/>
+              <w:bottom w:w="80" w:type="dxa"/>
+              <w:end w:w="120" w:type="dxa"/>
+            </w:tcMar>
+          </w:tcPr>
+          <w:p>
+            <w:pPr>
+              <w:spacing w:after="0"/>
+            </w:pPr>
+            <w:r>
+              <w:rPr>
+                <w:sz w:val="18"/>
+              </w:rPr>
+              <w:t>Tiempo de revisión ahorrado al cliente</w:t>
+            </w:r>
+          </w:p>
+        </w:tc>
+        <w:tc>
+          <w:tcPr>
+            <w:tcW w:type="dxa" w:w="3024"/>
+            <w:vAlign w:val="center"/>
+            <w:tcMar>
+              <w:top w:w="80" w:type="dxa"/>
+              <w:start w:w="120" w:type="dxa"/>
+              <w:bottom w:w="80" w:type="dxa"/>
+              <w:end w:w="120" w:type="dxa"/>
+            </w:tcMar>
+          </w:tcPr>
+          <w:p>
+            <w:pPr>
+              <w:spacing w:after="0"/>
+            </w:pPr>
+            <w:r>
+              <w:rPr>
+                <w:sz w:val="18"/>
+              </w:rPr>
+              <w:t>1 h/semana</w:t>
+            </w:r>
+          </w:p>
+        </w:tc>
+        <w:tc>
+          <w:tcPr>
+            <w:tcW w:type="dxa" w:w="3024"/>
+            <w:vAlign w:val="center"/>
+            <w:tcMar>
+              <w:top w:w="80" w:type="dxa"/>
+              <w:start w:w="120" w:type="dxa"/>
+              <w:bottom w:w="80" w:type="dxa"/>
+              <w:end w:w="120" w:type="dxa"/>
+            </w:tcMar>
+          </w:tcPr>
+          <w:p>
+            <w:pPr>
+              <w:spacing w:after="0"/>
+            </w:pPr>
+            <w:r>
+              <w:rPr>
+                <w:sz w:val="18"/>
+              </w:rPr>
+              <w:t>Tiempo dedicado a revisar clima, lluvia y decisión de riego.</w:t>
+            </w:r>
+          </w:p>
+        </w:tc>
+      </w:tr>
+      <w:tr>
+        <w:tc>
+          <w:tcPr>
+            <w:tcW w:type="dxa" w:w="3024"/>
+            <w:vAlign w:val="center"/>
+            <w:tcMar>
+              <w:top w:w="80" w:type="dxa"/>
+              <w:start w:w="120" w:type="dxa"/>
+              <w:bottom w:w="80" w:type="dxa"/>
+              <w:end w:w="120" w:type="dxa"/>
+            </w:tcMar>
+          </w:tcPr>
+          <w:p>
+            <w:pPr>
+              <w:spacing w:after="0"/>
+            </w:pPr>
+            <w:r>
+              <w:rPr>
+                <w:sz w:val="18"/>
+              </w:rPr>
+              <w:t>Valor de la hora de revisión</w:t>
+            </w:r>
+          </w:p>
+        </w:tc>
+        <w:tc>
+          <w:tcPr>
+            <w:tcW w:type="dxa" w:w="3024"/>
+            <w:vAlign w:val="center"/>
+            <w:tcMar>
+              <w:top w:w="80" w:type="dxa"/>
+              <w:start w:w="120" w:type="dxa"/>
+              <w:bottom w:w="80" w:type="dxa"/>
+              <w:end w:w="120" w:type="dxa"/>
+            </w:tcMar>
+          </w:tcPr>
+          <w:p>
+            <w:pPr>
+              <w:spacing w:after="0"/>
+            </w:pPr>
+            <w:r>
+              <w:rPr>
+                <w:sz w:val="18"/>
+              </w:rPr>
+              <w:t>15 EUR/h</w:t>
+            </w:r>
+          </w:p>
+        </w:tc>
+        <w:tc>
+          <w:tcPr>
+            <w:tcW w:type="dxa" w:w="3024"/>
+            <w:vAlign w:val="center"/>
+            <w:tcMar>
+              <w:top w:w="80" w:type="dxa"/>
+              <w:start w:w="120" w:type="dxa"/>
+              <w:bottom w:w="80" w:type="dxa"/>
+              <w:end w:w="120" w:type="dxa"/>
+            </w:tcMar>
+          </w:tcPr>
+          <w:p>
+            <w:pPr>
+              <w:spacing w:after="0"/>
+            </w:pPr>
+            <w:r>
+              <w:rPr>
+                <w:sz w:val="18"/>
+              </w:rPr>
+              <w:t>Referencia interna coherente con el presupuesto del proyecto.</w:t>
+            </w:r>
+          </w:p>
+        </w:tc>
+      </w:tr>
+      <w:tr>
+        <w:tc>
+          <w:tcPr>
+            <w:tcW w:type="dxa" w:w="3024"/>
+            <w:vAlign w:val="center"/>
+            <w:tcMar>
+              <w:top w:w="80" w:type="dxa"/>
+              <w:start w:w="120" w:type="dxa"/>
+              <w:bottom w:w="80" w:type="dxa"/>
+              <w:end w:w="120" w:type="dxa"/>
+            </w:tcMar>
+          </w:tcPr>
+          <w:p>
+            <w:pPr>
+              <w:spacing w:after="0"/>
+            </w:pPr>
+            <w:r>
+              <w:rPr>
+                <w:sz w:val="18"/>
+              </w:rPr>
+              <w:t>Precio del informe semanal</w:t>
+            </w:r>
+          </w:p>
+        </w:tc>
+        <w:tc>
+          <w:tcPr>
+            <w:tcW w:type="dxa" w:w="3024"/>
+            <w:vAlign w:val="center"/>
+            <w:tcMar>
+              <w:top w:w="80" w:type="dxa"/>
+              <w:start w:w="120" w:type="dxa"/>
+              <w:bottom w:w="80" w:type="dxa"/>
+              <w:end w:w="120" w:type="dxa"/>
+            </w:tcMar>
+          </w:tcPr>
+          <w:p>
+            <w:pPr>
+              <w:spacing w:after="0"/>
+            </w:pPr>
+            <w:r>
+              <w:rPr>
+                <w:sz w:val="18"/>
+              </w:rPr>
+              <w:t>15 EUR/informe</w:t>
+            </w:r>
+          </w:p>
+        </w:tc>
+        <w:tc>
+          <w:tcPr>
+            <w:tcW w:type="dxa" w:w="3024"/>
+            <w:vAlign w:val="center"/>
+            <w:tcMar>
+              <w:top w:w="80" w:type="dxa"/>
+              <w:start w:w="120" w:type="dxa"/>
+              <w:bottom w:w="80" w:type="dxa"/>
+              <w:end w:w="120" w:type="dxa"/>
+            </w:tcMar>
+          </w:tcPr>
+          <w:p>
+            <w:pPr>
+              <w:spacing w:after="0"/>
+            </w:pPr>
+            <w:r>
+              <w:rPr>
+                <w:sz w:val="18"/>
+              </w:rPr>
+              <w:t>Venta final: mensaje o informe con la recomendación de riego del periodo.</w:t>
+            </w:r>
+          </w:p>
+        </w:tc>
+      </w:tr>
+      <w:tr>
+        <w:tc>
+          <w:tcPr>
+            <w:tcW w:type="dxa" w:w="3024"/>
+            <w:vAlign w:val="center"/>
+            <w:tcMar>
+              <w:top w:w="80" w:type="dxa"/>
+              <w:start w:w="120" w:type="dxa"/>
+              <w:bottom w:w="80" w:type="dxa"/>
+              <w:end w:w="120" w:type="dxa"/>
+            </w:tcMar>
+          </w:tcPr>
+          <w:p>
+            <w:pPr>
+              <w:spacing w:after="0"/>
+            </w:pPr>
+            <w:r>
+              <w:rPr>
+                <w:sz w:val="18"/>
+              </w:rPr>
+              <w:t>Pack mensual</w:t>
+            </w:r>
+          </w:p>
+        </w:tc>
+        <w:tc>
+          <w:tcPr>
+            <w:tcW w:type="dxa" w:w="3024"/>
+            <w:vAlign w:val="center"/>
+            <w:tcMar>
+              <w:top w:w="80" w:type="dxa"/>
+              <w:start w:w="120" w:type="dxa"/>
+              <w:bottom w:w="80" w:type="dxa"/>
+              <w:end w:w="120" w:type="dxa"/>
+            </w:tcMar>
+          </w:tcPr>
+          <w:p>
+            <w:pPr>
+              <w:spacing w:after="0"/>
+            </w:pPr>
+            <w:r>
+              <w:rPr>
+                <w:sz w:val="18"/>
+              </w:rPr>
+              <w:t>49 EUR/mes</w:t>
+            </w:r>
+          </w:p>
+        </w:tc>
+        <w:tc>
+          <w:tcPr>
+            <w:tcW w:type="dxa" w:w="3024"/>
+            <w:vAlign w:val="center"/>
+            <w:tcMar>
+              <w:top w:w="80" w:type="dxa"/>
+              <w:start w:w="120" w:type="dxa"/>
+              <w:bottom w:w="80" w:type="dxa"/>
+              <w:end w:w="120" w:type="dxa"/>
+            </w:tcMar>
+          </w:tcPr>
+          <w:p>
+            <w:pPr>
+              <w:spacing w:after="0"/>
+            </w:pPr>
+            <w:r>
+              <w:rPr>
+                <w:sz w:val="18"/>
+              </w:rPr>
+              <w:t>Cuatro recomendaciones semanales con precio agrupado.</w:t>
+            </w:r>
+          </w:p>
+        </w:tc>
+      </w:tr>
+      <w:tr>
+        <w:tc>
+          <w:tcPr>
+            <w:tcW w:type="dxa" w:w="3024"/>
+            <w:vAlign w:val="center"/>
+            <w:tcMar>
+              <w:top w:w="80" w:type="dxa"/>
+              <w:start w:w="120" w:type="dxa"/>
+              <w:bottom w:w="80" w:type="dxa"/>
+              <w:end w:w="120" w:type="dxa"/>
+            </w:tcMar>
+          </w:tcPr>
+          <w:p>
+            <w:pPr>
+              <w:spacing w:after="0"/>
+            </w:pPr>
+            <w:r>
+              <w:rPr>
+                <w:sz w:val="18"/>
+              </w:rPr>
+              <w:t>Coste interno del proveedor</w:t>
+            </w:r>
+          </w:p>
+        </w:tc>
+        <w:tc>
+          <w:tcPr>
+            <w:tcW w:type="dxa" w:w="3024"/>
+            <w:vAlign w:val="center"/>
+            <w:tcMar>
+              <w:top w:w="80" w:type="dxa"/>
+              <w:start w:w="120" w:type="dxa"/>
+              <w:bottom w:w="80" w:type="dxa"/>
+              <w:end w:w="120" w:type="dxa"/>
+            </w:tcMar>
+          </w:tcPr>
+          <w:p>
+            <w:pPr>
+              <w:spacing w:after="0"/>
+            </w:pPr>
+            <w:r>
+              <w:rPr>
+                <w:sz w:val="18"/>
+              </w:rPr>
+              <w:t>9 EUR/informe</w:t>
+            </w:r>
+          </w:p>
+        </w:tc>
+        <w:tc>
+          <w:tcPr>
+            <w:tcW w:type="dxa" w:w="3024"/>
+            <w:vAlign w:val="center"/>
+            <w:tcMar>
+              <w:top w:w="80" w:type="dxa"/>
+              <w:start w:w="120" w:type="dxa"/>
+              <w:bottom w:w="80" w:type="dxa"/>
+              <w:end w:w="120" w:type="dxa"/>
+            </w:tcMar>
+          </w:tcPr>
+          <w:p>
+            <w:pPr>
+              <w:spacing w:after="0"/>
+            </w:pPr>
+            <w:r>
+              <w:rPr>
+                <w:sz w:val="18"/>
+              </w:rPr>
+              <w:t>30 min de revisión técnica a 15 EUR/h + 1,50 EUR de gestión/API.</w:t>
+            </w:r>
+          </w:p>
+        </w:tc>
+      </w:tr>
+    </w:tbl>
+    <w:p/>
+    <w:p>
+      <w:pPr>
+        <w:pStyle w:val="Heading3"/>
+      </w:pPr>
+      <w:r>
+        <w:t>Simulación de ROI para el cliente</w:t>
+      </w:r>
+    </w:p>
+    <w:p>
+      <w:pPr>
+        <w:spacing w:after="120"/>
+      </w:pPr>
+      <w:r>
+        <w:t>Con la parcela de demostración de 3.500 m2, el sistema recomienda 97.156 L para la semana del 01/05/2024 al 07/05/2024. Si el método tradicional aplicara un 15 % más de agua, el ahorro sería:</w:t>
+      </w:r>
+    </w:p>
+    <w:tbl>
+      <w:tblPr>
+        <w:tblStyle w:val="TableGrid"/>
+        <w:tblW w:type="auto" w:w="0"/>
+        <w:jc w:val="center"/>
+        <w:tblLayout w:type="autofit"/>
+        <w:tblLook w:firstColumn="1" w:firstRow="1" w:lastColumn="0" w:lastRow="0" w:noHBand="0" w:noVBand="1" w:val="04A0"/>
+      </w:tblPr>
+      <w:tblGrid>
+        <w:gridCol w:w="3024"/>
+        <w:gridCol w:w="3024"/>
+        <w:gridCol w:w="3024"/>
+      </w:tblGrid>
+      <w:tr>
+        <w:tc>
+          <w:tcPr>
+            <w:tcW w:type="dxa" w:w="3024"/>
+            <w:vAlign w:val="center"/>
+            <w:tcMar>
+              <w:top w:w="80" w:type="dxa"/>
+              <w:start w:w="120" w:type="dxa"/>
+              <w:bottom w:w="80" w:type="dxa"/>
+              <w:end w:w="120" w:type="dxa"/>
+            </w:tcMar>
+            <w:shd w:fill="E8EEF5"/>
+          </w:tcPr>
+          <w:p>
+            <w:pPr>
+              <w:spacing w:after="0"/>
+            </w:pPr>
+            <w:r>
+              <w:rPr>
+                <w:b/>
+                <w:sz w:val="18"/>
+              </w:rPr>
+              <w:t>Concepto</w:t>
+            </w:r>
+          </w:p>
+        </w:tc>
+        <w:tc>
+          <w:tcPr>
+            <w:tcW w:type="dxa" w:w="3024"/>
+            <w:vAlign w:val="center"/>
+            <w:tcMar>
+              <w:top w:w="80" w:type="dxa"/>
+              <w:start w:w="120" w:type="dxa"/>
+              <w:bottom w:w="80" w:type="dxa"/>
+              <w:end w:w="120" w:type="dxa"/>
+            </w:tcMar>
+            <w:shd w:fill="E8EEF5"/>
+          </w:tcPr>
+          <w:p>
+            <w:pPr>
+              <w:spacing w:after="0"/>
+            </w:pPr>
+            <w:r>
+              <w:rPr>
+                <w:b/>
+                <w:sz w:val="18"/>
+              </w:rPr>
+              <w:t>Cálculo</w:t>
+            </w:r>
+          </w:p>
+        </w:tc>
+        <w:tc>
+          <w:tcPr>
+            <w:tcW w:type="dxa" w:w="3024"/>
+            <w:vAlign w:val="center"/>
+            <w:tcMar>
+              <w:top w:w="80" w:type="dxa"/>
+              <w:start w:w="120" w:type="dxa"/>
+              <w:bottom w:w="80" w:type="dxa"/>
+              <w:end w:w="120" w:type="dxa"/>
+            </w:tcMar>
+            <w:shd w:fill="E8EEF5"/>
+          </w:tcPr>
+          <w:p>
+            <w:pPr>
+              <w:spacing w:after="0"/>
+            </w:pPr>
+            <w:r>
+              <w:rPr>
+                <w:b/>
+                <w:sz w:val="18"/>
+              </w:rPr>
+              <w:t>Resultado</w:t>
+            </w:r>
+          </w:p>
+        </w:tc>
+      </w:tr>
+      <w:tr>
+        <w:tc>
+          <w:tcPr>
+            <w:tcW w:type="dxa" w:w="3024"/>
+            <w:vAlign w:val="center"/>
+            <w:tcMar>
+              <w:top w:w="80" w:type="dxa"/>
+              <w:start w:w="120" w:type="dxa"/>
+              <w:bottom w:w="80" w:type="dxa"/>
+              <w:end w:w="120" w:type="dxa"/>
+            </w:tcMar>
+          </w:tcPr>
+          <w:p>
+            <w:pPr>
+              <w:spacing w:after="0"/>
+            </w:pPr>
+            <w:r>
+              <w:rPr>
+                <w:sz w:val="18"/>
+              </w:rPr>
+              <w:t>Riego recomendado</w:t>
+            </w:r>
+          </w:p>
+        </w:tc>
+        <w:tc>
+          <w:tcPr>
+            <w:tcW w:type="dxa" w:w="3024"/>
+            <w:vAlign w:val="center"/>
+            <w:tcMar>
+              <w:top w:w="80" w:type="dxa"/>
+              <w:start w:w="120" w:type="dxa"/>
+              <w:bottom w:w="80" w:type="dxa"/>
+              <w:end w:w="120" w:type="dxa"/>
+            </w:tcMar>
+          </w:tcPr>
+          <w:p>
+            <w:pPr>
+              <w:spacing w:after="0"/>
+            </w:pPr>
+            <w:r>
+              <w:rPr>
+                <w:sz w:val="18"/>
+              </w:rPr>
+            </w:r>
+          </w:p>
+        </w:tc>
+        <w:tc>
+          <w:tcPr>
+            <w:tcW w:type="dxa" w:w="3024"/>
+            <w:vAlign w:val="center"/>
+            <w:tcMar>
+              <w:top w:w="80" w:type="dxa"/>
+              <w:start w:w="120" w:type="dxa"/>
+              <w:bottom w:w="80" w:type="dxa"/>
+              <w:end w:w="120" w:type="dxa"/>
+            </w:tcMar>
+          </w:tcPr>
+          <w:p>
+            <w:pPr>
+              <w:spacing w:after="0"/>
+            </w:pPr>
+            <w:r>
+              <w:rPr>
+                <w:sz w:val="18"/>
+              </w:rPr>
+              <w:t>97,16 m3</w:t>
+            </w:r>
+          </w:p>
+        </w:tc>
+      </w:tr>
+      <w:tr>
+        <w:tc>
+          <w:tcPr>
+            <w:tcW w:type="dxa" w:w="3024"/>
+            <w:vAlign w:val="center"/>
+            <w:tcMar>
+              <w:top w:w="80" w:type="dxa"/>
+              <w:start w:w="120" w:type="dxa"/>
+              <w:bottom w:w="80" w:type="dxa"/>
+              <w:end w:w="120" w:type="dxa"/>
+            </w:tcMar>
+          </w:tcPr>
+          <w:p>
+            <w:pPr>
+              <w:spacing w:after="0"/>
+            </w:pPr>
+            <w:r>
+              <w:rPr>
+                <w:sz w:val="18"/>
+              </w:rPr>
+              <w:t>Riego tradicional simulado</w:t>
+            </w:r>
+          </w:p>
+        </w:tc>
+        <w:tc>
+          <w:tcPr>
+            <w:tcW w:type="dxa" w:w="3024"/>
+            <w:vAlign w:val="center"/>
+            <w:tcMar>
+              <w:top w:w="80" w:type="dxa"/>
+              <w:start w:w="120" w:type="dxa"/>
+              <w:bottom w:w="80" w:type="dxa"/>
+              <w:end w:w="120" w:type="dxa"/>
+            </w:tcMar>
+          </w:tcPr>
+          <w:p>
+            <w:pPr>
+              <w:spacing w:after="0"/>
+            </w:pPr>
+            <w:r>
+              <w:rPr>
+                <w:sz w:val="18"/>
+              </w:rPr>
+              <w:t>97,16 m3 * 1,15</w:t>
+            </w:r>
+          </w:p>
+        </w:tc>
+        <w:tc>
+          <w:tcPr>
+            <w:tcW w:type="dxa" w:w="3024"/>
+            <w:vAlign w:val="center"/>
+            <w:tcMar>
+              <w:top w:w="80" w:type="dxa"/>
+              <w:start w:w="120" w:type="dxa"/>
+              <w:bottom w:w="80" w:type="dxa"/>
+              <w:end w:w="120" w:type="dxa"/>
+            </w:tcMar>
+          </w:tcPr>
+          <w:p>
+            <w:pPr>
+              <w:spacing w:after="0"/>
+            </w:pPr>
+            <w:r>
+              <w:rPr>
+                <w:sz w:val="18"/>
+              </w:rPr>
+              <w:t>111,73 m3</w:t>
+            </w:r>
+          </w:p>
+        </w:tc>
+      </w:tr>
+      <w:tr>
+        <w:tc>
+          <w:tcPr>
+            <w:tcW w:type="dxa" w:w="3024"/>
+            <w:vAlign w:val="center"/>
+            <w:tcMar>
+              <w:top w:w="80" w:type="dxa"/>
+              <w:start w:w="120" w:type="dxa"/>
+              <w:bottom w:w="80" w:type="dxa"/>
+              <w:end w:w="120" w:type="dxa"/>
+            </w:tcMar>
+          </w:tcPr>
+          <w:p>
+            <w:pPr>
+              <w:spacing w:after="0"/>
+            </w:pPr>
+            <w:r>
+              <w:rPr>
+                <w:sz w:val="18"/>
+              </w:rPr>
+              <w:t>Ahorro de agua</w:t>
+            </w:r>
+          </w:p>
+        </w:tc>
+        <w:tc>
+          <w:tcPr>
+            <w:tcW w:type="dxa" w:w="3024"/>
+            <w:vAlign w:val="center"/>
+            <w:tcMar>
+              <w:top w:w="80" w:type="dxa"/>
+              <w:start w:w="120" w:type="dxa"/>
+              <w:bottom w:w="80" w:type="dxa"/>
+              <w:end w:w="120" w:type="dxa"/>
+            </w:tcMar>
+          </w:tcPr>
+          <w:p>
+            <w:pPr>
+              <w:spacing w:after="0"/>
+            </w:pPr>
+            <w:r>
+              <w:rPr>
+                <w:sz w:val="18"/>
+              </w:rPr>
+              <w:t>111,73 - 97,16</w:t>
+            </w:r>
+          </w:p>
+        </w:tc>
+        <w:tc>
+          <w:tcPr>
+            <w:tcW w:type="dxa" w:w="3024"/>
+            <w:vAlign w:val="center"/>
+            <w:tcMar>
+              <w:top w:w="80" w:type="dxa"/>
+              <w:start w:w="120" w:type="dxa"/>
+              <w:bottom w:w="80" w:type="dxa"/>
+              <w:end w:w="120" w:type="dxa"/>
+            </w:tcMar>
+          </w:tcPr>
+          <w:p>
+            <w:pPr>
+              <w:spacing w:after="0"/>
+            </w:pPr>
+            <w:r>
+              <w:rPr>
+                <w:sz w:val="18"/>
+              </w:rPr>
+              <w:t>14,57 m3</w:t>
+            </w:r>
+          </w:p>
+        </w:tc>
+      </w:tr>
+      <w:tr>
+        <w:tc>
+          <w:tcPr>
+            <w:tcW w:type="dxa" w:w="3024"/>
+            <w:vAlign w:val="center"/>
+            <w:tcMar>
+              <w:top w:w="80" w:type="dxa"/>
+              <w:start w:w="120" w:type="dxa"/>
+              <w:bottom w:w="80" w:type="dxa"/>
+              <w:end w:w="120" w:type="dxa"/>
+            </w:tcMar>
+          </w:tcPr>
+          <w:p>
+            <w:pPr>
+              <w:spacing w:after="0"/>
+            </w:pPr>
+            <w:r>
+              <w:rPr>
+                <w:sz w:val="18"/>
+              </w:rPr>
+              <w:t>Ahorro directo</w:t>
+            </w:r>
+          </w:p>
+        </w:tc>
+        <w:tc>
+          <w:tcPr>
+            <w:tcW w:type="dxa" w:w="3024"/>
+            <w:vAlign w:val="center"/>
+            <w:tcMar>
+              <w:top w:w="80" w:type="dxa"/>
+              <w:start w:w="120" w:type="dxa"/>
+              <w:bottom w:w="80" w:type="dxa"/>
+              <w:end w:w="120" w:type="dxa"/>
+            </w:tcMar>
+          </w:tcPr>
+          <w:p>
+            <w:pPr>
+              <w:spacing w:after="0"/>
+            </w:pPr>
+            <w:r>
+              <w:rPr>
+                <w:sz w:val="18"/>
+              </w:rPr>
+              <w:t>14,57 m3 * 0,40 EUR/m3</w:t>
+            </w:r>
+          </w:p>
+        </w:tc>
+        <w:tc>
+          <w:tcPr>
+            <w:tcW w:type="dxa" w:w="3024"/>
+            <w:vAlign w:val="center"/>
+            <w:tcMar>
+              <w:top w:w="80" w:type="dxa"/>
+              <w:start w:w="120" w:type="dxa"/>
+              <w:bottom w:w="80" w:type="dxa"/>
+              <w:end w:w="120" w:type="dxa"/>
+            </w:tcMar>
+          </w:tcPr>
+          <w:p>
+            <w:pPr>
+              <w:spacing w:after="0"/>
+            </w:pPr>
+            <w:r>
+              <w:rPr>
+                <w:sz w:val="18"/>
+              </w:rPr>
+              <w:t>5,83 EUR</w:t>
+            </w:r>
+          </w:p>
+        </w:tc>
+      </w:tr>
+      <w:tr>
+        <w:tc>
+          <w:tcPr>
+            <w:tcW w:type="dxa" w:w="3024"/>
+            <w:vAlign w:val="center"/>
+            <w:tcMar>
+              <w:top w:w="80" w:type="dxa"/>
+              <w:start w:w="120" w:type="dxa"/>
+              <w:bottom w:w="80" w:type="dxa"/>
+              <w:end w:w="120" w:type="dxa"/>
+            </w:tcMar>
+          </w:tcPr>
+          <w:p>
+            <w:pPr>
+              <w:spacing w:after="0"/>
+            </w:pPr>
+            <w:r>
+              <w:rPr>
+                <w:sz w:val="18"/>
+              </w:rPr>
+              <w:t>Ahorro de revisión</w:t>
+            </w:r>
+          </w:p>
+        </w:tc>
+        <w:tc>
+          <w:tcPr>
+            <w:tcW w:type="dxa" w:w="3024"/>
+            <w:vAlign w:val="center"/>
+            <w:tcMar>
+              <w:top w:w="80" w:type="dxa"/>
+              <w:start w:w="120" w:type="dxa"/>
+              <w:bottom w:w="80" w:type="dxa"/>
+              <w:end w:w="120" w:type="dxa"/>
+            </w:tcMar>
+          </w:tcPr>
+          <w:p>
+            <w:pPr>
+              <w:spacing w:after="0"/>
+            </w:pPr>
+            <w:r>
+              <w:rPr>
+                <w:sz w:val="18"/>
+              </w:rPr>
+              <w:t>1 h * 15 EUR/h</w:t>
+            </w:r>
+          </w:p>
+        </w:tc>
+        <w:tc>
+          <w:tcPr>
+            <w:tcW w:type="dxa" w:w="3024"/>
+            <w:vAlign w:val="center"/>
+            <w:tcMar>
+              <w:top w:w="80" w:type="dxa"/>
+              <w:start w:w="120" w:type="dxa"/>
+              <w:bottom w:w="80" w:type="dxa"/>
+              <w:end w:w="120" w:type="dxa"/>
+            </w:tcMar>
+          </w:tcPr>
+          <w:p>
+            <w:pPr>
+              <w:spacing w:after="0"/>
+            </w:pPr>
+            <w:r>
+              <w:rPr>
+                <w:sz w:val="18"/>
+              </w:rPr>
+              <w:t>15,00 EUR</w:t>
+            </w:r>
+          </w:p>
+        </w:tc>
+      </w:tr>
+      <w:tr>
+        <w:tc>
+          <w:tcPr>
+            <w:tcW w:type="dxa" w:w="3024"/>
+            <w:vAlign w:val="center"/>
+            <w:tcMar>
+              <w:top w:w="80" w:type="dxa"/>
+              <w:start w:w="120" w:type="dxa"/>
+              <w:bottom w:w="80" w:type="dxa"/>
+              <w:end w:w="120" w:type="dxa"/>
+            </w:tcMar>
+          </w:tcPr>
+          <w:p>
+            <w:pPr>
+              <w:spacing w:after="0"/>
+            </w:pPr>
+            <w:r>
+              <w:rPr>
+                <w:sz w:val="18"/>
+              </w:rPr>
+              <w:t>Beneficio semanal estimado</w:t>
+            </w:r>
+          </w:p>
+        </w:tc>
+        <w:tc>
+          <w:tcPr>
+            <w:tcW w:type="dxa" w:w="3024"/>
+            <w:vAlign w:val="center"/>
+            <w:tcMar>
+              <w:top w:w="80" w:type="dxa"/>
+              <w:start w:w="120" w:type="dxa"/>
+              <w:bottom w:w="80" w:type="dxa"/>
+              <w:end w:w="120" w:type="dxa"/>
+            </w:tcMar>
+          </w:tcPr>
+          <w:p>
+            <w:pPr>
+              <w:spacing w:after="0"/>
+            </w:pPr>
+            <w:r>
+              <w:rPr>
+                <w:sz w:val="18"/>
+              </w:rPr>
+              <w:t>5,83 + 15,00</w:t>
+            </w:r>
+          </w:p>
+        </w:tc>
+        <w:tc>
+          <w:tcPr>
+            <w:tcW w:type="dxa" w:w="3024"/>
+            <w:vAlign w:val="center"/>
+            <w:tcMar>
+              <w:top w:w="80" w:type="dxa"/>
+              <w:start w:w="120" w:type="dxa"/>
+              <w:bottom w:w="80" w:type="dxa"/>
+              <w:end w:w="120" w:type="dxa"/>
+            </w:tcMar>
+          </w:tcPr>
+          <w:p>
+            <w:pPr>
+              <w:spacing w:after="0"/>
+            </w:pPr>
+            <w:r>
+              <w:rPr>
+                <w:sz w:val="18"/>
+              </w:rPr>
+              <w:t>20,83 EUR</w:t>
+            </w:r>
+          </w:p>
+        </w:tc>
+      </w:tr>
+      <w:tr>
+        <w:tc>
+          <w:tcPr>
+            <w:tcW w:type="dxa" w:w="3024"/>
+            <w:vAlign w:val="center"/>
+            <w:tcMar>
+              <w:top w:w="80" w:type="dxa"/>
+              <w:start w:w="120" w:type="dxa"/>
+              <w:bottom w:w="80" w:type="dxa"/>
+              <w:end w:w="120" w:type="dxa"/>
+            </w:tcMar>
+          </w:tcPr>
+          <w:p>
+            <w:pPr>
+              <w:spacing w:after="0"/>
+            </w:pPr>
+            <w:r>
+              <w:rPr>
+                <w:sz w:val="18"/>
+              </w:rPr>
+              <w:t>Precio informe semanal</w:t>
+            </w:r>
+          </w:p>
+        </w:tc>
+        <w:tc>
+          <w:tcPr>
+            <w:tcW w:type="dxa" w:w="3024"/>
+            <w:vAlign w:val="center"/>
+            <w:tcMar>
+              <w:top w:w="80" w:type="dxa"/>
+              <w:start w:w="120" w:type="dxa"/>
+              <w:bottom w:w="80" w:type="dxa"/>
+              <w:end w:w="120" w:type="dxa"/>
+            </w:tcMar>
+          </w:tcPr>
+          <w:p>
+            <w:pPr>
+              <w:spacing w:after="0"/>
+            </w:pPr>
+            <w:r>
+              <w:rPr>
+                <w:sz w:val="18"/>
+              </w:rPr>
+            </w:r>
+          </w:p>
+        </w:tc>
+        <w:tc>
+          <w:tcPr>
+            <w:tcW w:type="dxa" w:w="3024"/>
+            <w:vAlign w:val="center"/>
+            <w:tcMar>
+              <w:top w:w="80" w:type="dxa"/>
+              <w:start w:w="120" w:type="dxa"/>
+              <w:bottom w:w="80" w:type="dxa"/>
+              <w:end w:w="120" w:type="dxa"/>
+            </w:tcMar>
+          </w:tcPr>
+          <w:p>
+            <w:pPr>
+              <w:spacing w:after="0"/>
+            </w:pPr>
+            <w:r>
+              <w:rPr>
+                <w:sz w:val="18"/>
+              </w:rPr>
+              <w:t>15,00 EUR</w:t>
+            </w:r>
+          </w:p>
+        </w:tc>
+      </w:tr>
+      <w:tr>
+        <w:tc>
+          <w:tcPr>
+            <w:tcW w:type="dxa" w:w="3024"/>
+            <w:vAlign w:val="center"/>
+            <w:tcMar>
+              <w:top w:w="80" w:type="dxa"/>
+              <w:start w:w="120" w:type="dxa"/>
+              <w:bottom w:w="80" w:type="dxa"/>
+              <w:end w:w="120" w:type="dxa"/>
+            </w:tcMar>
+          </w:tcPr>
+          <w:p>
+            <w:pPr>
+              <w:spacing w:after="0"/>
+            </w:pPr>
+            <w:r>
+              <w:rPr>
+                <w:sz w:val="18"/>
+              </w:rPr>
+              <w:t>ROI cliente semanal</w:t>
+            </w:r>
+          </w:p>
+        </w:tc>
+        <w:tc>
+          <w:tcPr>
+            <w:tcW w:type="dxa" w:w="3024"/>
+            <w:vAlign w:val="center"/>
+            <w:tcMar>
+              <w:top w:w="80" w:type="dxa"/>
+              <w:start w:w="120" w:type="dxa"/>
+              <w:bottom w:w="80" w:type="dxa"/>
+              <w:end w:w="120" w:type="dxa"/>
+            </w:tcMar>
+          </w:tcPr>
+          <w:p>
+            <w:pPr>
+              <w:spacing w:after="0"/>
+            </w:pPr>
+            <w:r>
+              <w:rPr>
+                <w:sz w:val="18"/>
+              </w:rPr>
+              <w:t>(20,83 - 15,00) / 15,00</w:t>
+            </w:r>
+          </w:p>
+        </w:tc>
+        <w:tc>
+          <w:tcPr>
+            <w:tcW w:type="dxa" w:w="3024"/>
+            <w:vAlign w:val="center"/>
+            <w:tcMar>
+              <w:top w:w="80" w:type="dxa"/>
+              <w:start w:w="120" w:type="dxa"/>
+              <w:bottom w:w="80" w:type="dxa"/>
+              <w:end w:w="120" w:type="dxa"/>
+            </w:tcMar>
+          </w:tcPr>
+          <w:p>
+            <w:pPr>
+              <w:spacing w:after="0"/>
+            </w:pPr>
+            <w:r>
+              <w:rPr>
+                <w:sz w:val="18"/>
+              </w:rPr>
+              <w:t>38,9 %</w:t>
+            </w:r>
+          </w:p>
+        </w:tc>
+      </w:tr>
+    </w:tbl>
+    <w:p/>
+    <w:p>
+      <w:pPr>
+        <w:spacing w:after="120"/>
+      </w:pPr>
+      <w:r>
+        <w:t>En modalidad mensual, con cuatro informes y precio de 49 EUR/mes, el beneficio estimado sería 83,32 EUR y el ROI mensual aproximado sería:</w:t>
+      </w:r>
+    </w:p>
+    <w:p>
+      <w:pPr/>
+      <w:r>
+        <w:rPr>
+          <w:rFonts w:ascii="Consolas" w:hAnsi="Consolas"/>
+          <w:sz w:val="16"/>
+        </w:rPr>
+        <w:t>ROI_mensual = ((83,32 - 49,00) / 49,00) * 100 = 70,0 %</w:t>
+      </w:r>
+    </w:p>
+    <w:p>
+      <w:pPr>
+        <w:spacing w:after="120"/>
+      </w:pPr>
+      <w:r>
+        <w:t>Para parcelas mayores, el ahorro directo aumenta porque los litros ahorrados crecen con la superficie. En una hectárea con el mismo escenario climático y de cultivo, el ahorro por agua y energía sería mayor y el ROI del cliente mejoraría.</w:t>
+      </w:r>
+    </w:p>
+    <w:p>
+      <w:pPr>
+        <w:pStyle w:val="Heading3"/>
+      </w:pPr>
+      <w:r>
+        <w:t>Simulación de margen para el proveedor</w:t>
+      </w:r>
+    </w:p>
+    <w:p>
+      <w:pPr>
+        <w:spacing w:after="120"/>
+      </w:pPr>
+      <w:r>
+        <w:t>El servicio se plantea como una venta recurrente de recomendación, no como instalación hidráulica. El entregable sería un informe, correo o mensaje al cliente con:</w:t>
+      </w:r>
+    </w:p>
+    <w:p>
+      <w:pPr>
+        <w:pStyle w:val="ListBullet"/>
+        <w:spacing w:after="60"/>
+      </w:pPr>
+      <w:r>
+        <w:t>Litros totales recomendados.</w:t>
+      </w:r>
+    </w:p>
+    <w:p>
+      <w:pPr>
+        <w:pStyle w:val="ListBullet"/>
+        <w:spacing w:after="60"/>
+      </w:pPr>
+      <w:r>
+        <w:t>Litros medios diarios.</w:t>
+      </w:r>
+    </w:p>
+    <w:p>
+      <w:pPr>
+        <w:pStyle w:val="ListBullet"/>
+        <w:spacing w:after="60"/>
+      </w:pPr>
+      <w:r>
+        <w:t>Litros por planta.</w:t>
+      </w:r>
+    </w:p>
+    <w:p>
+      <w:pPr>
+        <w:pStyle w:val="ListBullet"/>
+        <w:spacing w:after="60"/>
+      </w:pPr>
+      <w:r>
+        <w:t>Lluvia prevista o registrada.</w:t>
+      </w:r>
+    </w:p>
+    <w:p>
+      <w:pPr>
+        <w:pStyle w:val="ListBullet"/>
+        <w:spacing w:after="60"/>
+      </w:pPr>
+      <w:r>
+        <w:t>Observación técnica y advertencia de incertidumbre si procede.</w:t>
+      </w:r>
+    </w:p>
+    <w:tbl>
+      <w:tblPr>
+        <w:tblStyle w:val="TableGrid"/>
+        <w:tblW w:type="auto" w:w="0"/>
+        <w:jc w:val="center"/>
+        <w:tblLayout w:type="autofit"/>
+        <w:tblLook w:firstColumn="1" w:firstRow="1" w:lastColumn="0" w:lastRow="0" w:noHBand="0" w:noVBand="1" w:val="04A0"/>
+      </w:tblPr>
+      <w:tblGrid>
+        <w:gridCol w:w="4536"/>
+        <w:gridCol w:w="4536"/>
+      </w:tblGrid>
+      <w:tr>
+        <w:tc>
+          <w:tcPr>
+            <w:tcW w:type="dxa" w:w="4536"/>
+            <w:vAlign w:val="center"/>
+            <w:tcMar>
+              <w:top w:w="80" w:type="dxa"/>
+              <w:start w:w="120" w:type="dxa"/>
+              <w:bottom w:w="80" w:type="dxa"/>
+              <w:end w:w="120" w:type="dxa"/>
+            </w:tcMar>
+            <w:shd w:fill="E8EEF5"/>
+          </w:tcPr>
+          <w:p>
+            <w:pPr>
+              <w:spacing w:after="0"/>
+            </w:pPr>
+            <w:r>
+              <w:rPr>
+                <w:b/>
+                <w:sz w:val="18"/>
+              </w:rPr>
+              <w:t>Concepto</w:t>
+            </w:r>
+          </w:p>
+        </w:tc>
+        <w:tc>
+          <w:tcPr>
+            <w:tcW w:type="dxa" w:w="4536"/>
+            <w:vAlign w:val="center"/>
+            <w:tcMar>
+              <w:top w:w="80" w:type="dxa"/>
+              <w:start w:w="120" w:type="dxa"/>
+              <w:bottom w:w="80" w:type="dxa"/>
+              <w:end w:w="120" w:type="dxa"/>
+            </w:tcMar>
+            <w:shd w:fill="E8EEF5"/>
+          </w:tcPr>
+          <w:p>
+            <w:pPr>
+              <w:spacing w:after="0"/>
+            </w:pPr>
+            <w:r>
+              <w:rPr>
+                <w:b/>
+                <w:sz w:val="18"/>
+              </w:rPr>
+              <w:t>Valor</w:t>
+            </w:r>
+          </w:p>
+        </w:tc>
+      </w:tr>
+      <w:tr>
+        <w:tc>
+          <w:tcPr>
+            <w:tcW w:type="dxa" w:w="4536"/>
+            <w:vAlign w:val="center"/>
+            <w:tcMar>
+              <w:top w:w="80" w:type="dxa"/>
+              <w:start w:w="120" w:type="dxa"/>
+              <w:bottom w:w="80" w:type="dxa"/>
+              <w:end w:w="120" w:type="dxa"/>
+            </w:tcMar>
+          </w:tcPr>
+          <w:p>
+            <w:pPr>
+              <w:spacing w:after="0"/>
+            </w:pPr>
+            <w:r>
+              <w:rPr>
+                <w:sz w:val="18"/>
+              </w:rPr>
+              <w:t>Precio venta informe semanal</w:t>
+            </w:r>
+          </w:p>
+        </w:tc>
+        <w:tc>
+          <w:tcPr>
+            <w:tcW w:type="dxa" w:w="4536"/>
+            <w:vAlign w:val="center"/>
+            <w:tcMar>
+              <w:top w:w="80" w:type="dxa"/>
+              <w:start w:w="120" w:type="dxa"/>
+              <w:bottom w:w="80" w:type="dxa"/>
+              <w:end w:w="120" w:type="dxa"/>
+            </w:tcMar>
+          </w:tcPr>
+          <w:p>
+            <w:pPr>
+              <w:spacing w:after="0"/>
+            </w:pPr>
+            <w:r>
+              <w:rPr>
+                <w:sz w:val="18"/>
+              </w:rPr>
+              <w:t>15,00 EUR</w:t>
+            </w:r>
+          </w:p>
+        </w:tc>
+      </w:tr>
+      <w:tr>
+        <w:tc>
+          <w:tcPr>
+            <w:tcW w:type="dxa" w:w="4536"/>
+            <w:vAlign w:val="center"/>
+            <w:tcMar>
+              <w:top w:w="80" w:type="dxa"/>
+              <w:start w:w="120" w:type="dxa"/>
+              <w:bottom w:w="80" w:type="dxa"/>
+              <w:end w:w="120" w:type="dxa"/>
+            </w:tcMar>
+          </w:tcPr>
+          <w:p>
+            <w:pPr>
+              <w:spacing w:after="0"/>
+            </w:pPr>
+            <w:r>
+              <w:rPr>
+                <w:sz w:val="18"/>
+              </w:rPr>
+              <w:t>Coste revisión técnica</w:t>
+            </w:r>
+          </w:p>
+        </w:tc>
+        <w:tc>
+          <w:tcPr>
+            <w:tcW w:type="dxa" w:w="4536"/>
+            <w:vAlign w:val="center"/>
+            <w:tcMar>
+              <w:top w:w="80" w:type="dxa"/>
+              <w:start w:w="120" w:type="dxa"/>
+              <w:bottom w:w="80" w:type="dxa"/>
+              <w:end w:w="120" w:type="dxa"/>
+            </w:tcMar>
+          </w:tcPr>
+          <w:p>
+            <w:pPr>
+              <w:spacing w:after="0"/>
+            </w:pPr>
+            <w:r>
+              <w:rPr>
+                <w:sz w:val="18"/>
+              </w:rPr>
+              <w:t>7,50 EUR</w:t>
+            </w:r>
+          </w:p>
+        </w:tc>
+      </w:tr>
+      <w:tr>
+        <w:tc>
+          <w:tcPr>
+            <w:tcW w:type="dxa" w:w="4536"/>
+            <w:vAlign w:val="center"/>
+            <w:tcMar>
+              <w:top w:w="80" w:type="dxa"/>
+              <w:start w:w="120" w:type="dxa"/>
+              <w:bottom w:w="80" w:type="dxa"/>
+              <w:end w:w="120" w:type="dxa"/>
+            </w:tcMar>
+          </w:tcPr>
+          <w:p>
+            <w:pPr>
+              <w:spacing w:after="0"/>
+            </w:pPr>
+            <w:r>
+              <w:rPr>
+                <w:sz w:val="18"/>
+              </w:rPr>
+              <w:t>Coste gestión/API</w:t>
+            </w:r>
+          </w:p>
+        </w:tc>
+        <w:tc>
+          <w:tcPr>
+            <w:tcW w:type="dxa" w:w="4536"/>
+            <w:vAlign w:val="center"/>
+            <w:tcMar>
+              <w:top w:w="80" w:type="dxa"/>
+              <w:start w:w="120" w:type="dxa"/>
+              <w:bottom w:w="80" w:type="dxa"/>
+              <w:end w:w="120" w:type="dxa"/>
+            </w:tcMar>
+          </w:tcPr>
+          <w:p>
+            <w:pPr>
+              <w:spacing w:after="0"/>
+            </w:pPr>
+            <w:r>
+              <w:rPr>
+                <w:sz w:val="18"/>
+              </w:rPr>
+              <w:t>1,50 EUR</w:t>
+            </w:r>
+          </w:p>
+        </w:tc>
+      </w:tr>
+      <w:tr>
+        <w:tc>
+          <w:tcPr>
+            <w:tcW w:type="dxa" w:w="4536"/>
+            <w:vAlign w:val="center"/>
+            <w:tcMar>
+              <w:top w:w="80" w:type="dxa"/>
+              <w:start w:w="120" w:type="dxa"/>
+              <w:bottom w:w="80" w:type="dxa"/>
+              <w:end w:w="120" w:type="dxa"/>
+            </w:tcMar>
+          </w:tcPr>
+          <w:p>
+            <w:pPr>
+              <w:spacing w:after="0"/>
+            </w:pPr>
+            <w:r>
+              <w:rPr>
+                <w:sz w:val="18"/>
+              </w:rPr>
+              <w:t>Coste total interno</w:t>
+            </w:r>
+          </w:p>
+        </w:tc>
+        <w:tc>
+          <w:tcPr>
+            <w:tcW w:type="dxa" w:w="4536"/>
+            <w:vAlign w:val="center"/>
+            <w:tcMar>
+              <w:top w:w="80" w:type="dxa"/>
+              <w:start w:w="120" w:type="dxa"/>
+              <w:bottom w:w="80" w:type="dxa"/>
+              <w:end w:w="120" w:type="dxa"/>
+            </w:tcMar>
+          </w:tcPr>
+          <w:p>
+            <w:pPr>
+              <w:spacing w:after="0"/>
+            </w:pPr>
+            <w:r>
+              <w:rPr>
+                <w:sz w:val="18"/>
+              </w:rPr>
+              <w:t>9,00 EUR</w:t>
+            </w:r>
+          </w:p>
+        </w:tc>
+      </w:tr>
+      <w:tr>
+        <w:tc>
+          <w:tcPr>
+            <w:tcW w:type="dxa" w:w="4536"/>
+            <w:vAlign w:val="center"/>
+            <w:tcMar>
+              <w:top w:w="80" w:type="dxa"/>
+              <w:start w:w="120" w:type="dxa"/>
+              <w:bottom w:w="80" w:type="dxa"/>
+              <w:end w:w="120" w:type="dxa"/>
+            </w:tcMar>
+          </w:tcPr>
+          <w:p>
+            <w:pPr>
+              <w:spacing w:after="0"/>
+            </w:pPr>
+            <w:r>
+              <w:rPr>
+                <w:sz w:val="18"/>
+              </w:rPr>
+              <w:t>Margen bruto por informe</w:t>
+            </w:r>
+          </w:p>
+        </w:tc>
+        <w:tc>
+          <w:tcPr>
+            <w:tcW w:type="dxa" w:w="4536"/>
+            <w:vAlign w:val="center"/>
+            <w:tcMar>
+              <w:top w:w="80" w:type="dxa"/>
+              <w:start w:w="120" w:type="dxa"/>
+              <w:bottom w:w="80" w:type="dxa"/>
+              <w:end w:w="120" w:type="dxa"/>
+            </w:tcMar>
+          </w:tcPr>
+          <w:p>
+            <w:pPr>
+              <w:spacing w:after="0"/>
+            </w:pPr>
+            <w:r>
+              <w:rPr>
+                <w:sz w:val="18"/>
+              </w:rPr>
+              <w:t>6,00 EUR</w:t>
+            </w:r>
+          </w:p>
+        </w:tc>
+      </w:tr>
+      <w:tr>
+        <w:tc>
+          <w:tcPr>
+            <w:tcW w:type="dxa" w:w="4536"/>
+            <w:vAlign w:val="center"/>
+            <w:tcMar>
+              <w:top w:w="80" w:type="dxa"/>
+              <w:start w:w="120" w:type="dxa"/>
+              <w:bottom w:w="80" w:type="dxa"/>
+              <w:end w:w="120" w:type="dxa"/>
+            </w:tcMar>
+          </w:tcPr>
+          <w:p>
+            <w:pPr>
+              <w:spacing w:after="0"/>
+            </w:pPr>
+            <w:r>
+              <w:rPr>
+                <w:sz w:val="18"/>
+              </w:rPr>
+              <w:t>ROI proveedor por informe</w:t>
+            </w:r>
+          </w:p>
+        </w:tc>
+        <w:tc>
+          <w:tcPr>
+            <w:tcW w:type="dxa" w:w="4536"/>
+            <w:vAlign w:val="center"/>
+            <w:tcMar>
+              <w:top w:w="80" w:type="dxa"/>
+              <w:start w:w="120" w:type="dxa"/>
+              <w:bottom w:w="80" w:type="dxa"/>
+              <w:end w:w="120" w:type="dxa"/>
+            </w:tcMar>
+          </w:tcPr>
+          <w:p>
+            <w:pPr>
+              <w:spacing w:after="0"/>
+            </w:pPr>
+            <w:r>
+              <w:rPr>
+                <w:sz w:val="18"/>
+              </w:rPr>
+              <w:t>66,7 %</w:t>
+            </w:r>
+          </w:p>
+        </w:tc>
+      </w:tr>
+    </w:tbl>
+    <w:p/>
+    <w:p>
+      <w:pPr>
+        <w:spacing w:after="120"/>
+      </w:pPr>
+      <w:r>
+        <w:t>La lectura correcta es que el ROI es positivo bajo estos supuestos, pero no debe presentarse como ahorro real confirmado. El proyecto demuestra cómo calcularlo y qué datos harían falta para validarlo: consumo histórico, facturas de agua/energía, tiempo real de revisión y comparación con campañas agrícolas reales.</w:t>
       </w:r>
     </w:p>
     <w:p>
@@ -8359,7 +10129,7 @@
               <w:rPr>
                 <w:sz w:val="18"/>
               </w:rPr>
-              <w:t>Equipo informático propio</w:t>
+              <w:t>Revisión técnica por informe de cliente</w:t>
             </w:r>
           </w:p>
         </w:tc>
@@ -8382,7 +10152,7 @@
               <w:rPr>
                 <w:sz w:val="18"/>
               </w:rPr>
-              <w:t>1</w:t>
+              <w:t>0,5 h</w:t>
             </w:r>
           </w:p>
         </w:tc>
@@ -8405,7 +10175,7 @@
               <w:rPr>
                 <w:sz w:val="18"/>
               </w:rPr>
-              <w:t>0 EUR</w:t>
+              <w:t>15 EUR/h</w:t>
             </w:r>
           </w:p>
         </w:tc>
@@ -8428,7 +10198,7 @@
               <w:rPr>
                 <w:sz w:val="18"/>
               </w:rPr>
-              <w:t>0 EUR</w:t>
+              <w:t>7,50 EUR</w:t>
             </w:r>
           </w:p>
         </w:tc>
@@ -8453,7 +10223,7 @@
               <w:rPr>
                 <w:sz w:val="18"/>
               </w:rPr>
-              <w:t>Software libre utilizado</w:t>
+              <w:t>Gestión/API por informe</w:t>
             </w:r>
           </w:p>
         </w:tc>
@@ -8499,7 +10269,7 @@
               <w:rPr>
                 <w:sz w:val="18"/>
               </w:rPr>
-              <w:t>0 EUR</w:t>
+              <w:t>1,50 EUR</w:t>
             </w:r>
           </w:p>
         </w:tc>
@@ -8522,7 +10292,7 @@
               <w:rPr>
                 <w:sz w:val="18"/>
               </w:rPr>
-              <w:t>0 EUR</w:t>
+              <w:t>1,50 EUR</w:t>
             </w:r>
           </w:p>
         </w:tc>
@@ -8547,7 +10317,7 @@
               <w:rPr>
                 <w:sz w:val="18"/>
               </w:rPr>
-              <w:t>Total estimado</w:t>
+              <w:t>Equipo informático propio</w:t>
             </w:r>
           </w:p>
         </w:tc>
@@ -8570,6 +10340,7 @@
               <w:rPr>
                 <w:sz w:val="18"/>
               </w:rPr>
+              <w:t>1</w:t>
             </w:r>
           </w:p>
         </w:tc>
@@ -8592,6 +10363,7 @@
               <w:rPr>
                 <w:sz w:val="18"/>
               </w:rPr>
+              <w:t>0 EUR</w:t>
             </w:r>
           </w:p>
         </w:tc>
@@ -8614,7 +10386,285 @@
               <w:rPr>
                 <w:sz w:val="18"/>
               </w:rPr>
+              <w:t>0 EUR</w:t>
+            </w:r>
+          </w:p>
+        </w:tc>
+      </w:tr>
+      <w:tr>
+        <w:tc>
+          <w:tcPr>
+            <w:tcW w:type="dxa" w:w="2268"/>
+            <w:vAlign w:val="center"/>
+            <w:tcMar>
+              <w:top w:w="80" w:type="dxa"/>
+              <w:start w:w="120" w:type="dxa"/>
+              <w:bottom w:w="80" w:type="dxa"/>
+              <w:end w:w="120" w:type="dxa"/>
+            </w:tcMar>
+          </w:tcPr>
+          <w:p>
+            <w:pPr>
+              <w:spacing w:after="0"/>
+            </w:pPr>
+            <w:r>
+              <w:rPr>
+                <w:sz w:val="18"/>
+              </w:rPr>
+              <w:t>Software libre utilizado</w:t>
+            </w:r>
+          </w:p>
+        </w:tc>
+        <w:tc>
+          <w:tcPr>
+            <w:tcW w:type="dxa" w:w="2268"/>
+            <w:vAlign w:val="center"/>
+            <w:tcMar>
+              <w:top w:w="80" w:type="dxa"/>
+              <w:start w:w="120" w:type="dxa"/>
+              <w:bottom w:w="80" w:type="dxa"/>
+              <w:end w:w="120" w:type="dxa"/>
+            </w:tcMar>
+          </w:tcPr>
+          <w:p>
+            <w:pPr>
+              <w:spacing w:after="0"/>
+            </w:pPr>
+            <w:r>
+              <w:rPr>
+                <w:sz w:val="18"/>
+              </w:rPr>
+              <w:t>1</w:t>
+            </w:r>
+          </w:p>
+        </w:tc>
+        <w:tc>
+          <w:tcPr>
+            <w:tcW w:type="dxa" w:w="2268"/>
+            <w:vAlign w:val="center"/>
+            <w:tcMar>
+              <w:top w:w="80" w:type="dxa"/>
+              <w:start w:w="120" w:type="dxa"/>
+              <w:bottom w:w="80" w:type="dxa"/>
+              <w:end w:w="120" w:type="dxa"/>
+            </w:tcMar>
+          </w:tcPr>
+          <w:p>
+            <w:pPr>
+              <w:spacing w:after="0"/>
+            </w:pPr>
+            <w:r>
+              <w:rPr>
+                <w:sz w:val="18"/>
+              </w:rPr>
+              <w:t>0 EUR</w:t>
+            </w:r>
+          </w:p>
+        </w:tc>
+        <w:tc>
+          <w:tcPr>
+            <w:tcW w:type="dxa" w:w="2268"/>
+            <w:vAlign w:val="center"/>
+            <w:tcMar>
+              <w:top w:w="80" w:type="dxa"/>
+              <w:start w:w="120" w:type="dxa"/>
+              <w:bottom w:w="80" w:type="dxa"/>
+              <w:end w:w="120" w:type="dxa"/>
+            </w:tcMar>
+          </w:tcPr>
+          <w:p>
+            <w:pPr>
+              <w:spacing w:after="0"/>
+            </w:pPr>
+            <w:r>
+              <w:rPr>
+                <w:sz w:val="18"/>
+              </w:rPr>
+              <w:t>0 EUR</w:t>
+            </w:r>
+          </w:p>
+        </w:tc>
+      </w:tr>
+      <w:tr>
+        <w:tc>
+          <w:tcPr>
+            <w:tcW w:type="dxa" w:w="2268"/>
+            <w:vAlign w:val="center"/>
+            <w:tcMar>
+              <w:top w:w="80" w:type="dxa"/>
+              <w:start w:w="120" w:type="dxa"/>
+              <w:bottom w:w="80" w:type="dxa"/>
+              <w:end w:w="120" w:type="dxa"/>
+            </w:tcMar>
+          </w:tcPr>
+          <w:p>
+            <w:pPr>
+              <w:spacing w:after="0"/>
+            </w:pPr>
+            <w:r>
+              <w:rPr>
+                <w:sz w:val="18"/>
+              </w:rPr>
+              <w:t>Total prototipo</w:t>
+            </w:r>
+          </w:p>
+        </w:tc>
+        <w:tc>
+          <w:tcPr>
+            <w:tcW w:type="dxa" w:w="2268"/>
+            <w:vAlign w:val="center"/>
+            <w:tcMar>
+              <w:top w:w="80" w:type="dxa"/>
+              <w:start w:w="120" w:type="dxa"/>
+              <w:bottom w:w="80" w:type="dxa"/>
+              <w:end w:w="120" w:type="dxa"/>
+            </w:tcMar>
+          </w:tcPr>
+          <w:p>
+            <w:pPr>
+              <w:spacing w:after="0"/>
+            </w:pPr>
+            <w:r>
+              <w:rPr>
+                <w:sz w:val="18"/>
+              </w:rPr>
+            </w:r>
+          </w:p>
+        </w:tc>
+        <w:tc>
+          <w:tcPr>
+            <w:tcW w:type="dxa" w:w="2268"/>
+            <w:vAlign w:val="center"/>
+            <w:tcMar>
+              <w:top w:w="80" w:type="dxa"/>
+              <w:start w:w="120" w:type="dxa"/>
+              <w:bottom w:w="80" w:type="dxa"/>
+              <w:end w:w="120" w:type="dxa"/>
+            </w:tcMar>
+          </w:tcPr>
+          <w:p>
+            <w:pPr>
+              <w:spacing w:after="0"/>
+            </w:pPr>
+            <w:r>
+              <w:rPr>
+                <w:sz w:val="18"/>
+              </w:rPr>
+            </w:r>
+          </w:p>
+        </w:tc>
+        <w:tc>
+          <w:tcPr>
+            <w:tcW w:type="dxa" w:w="2268"/>
+            <w:vAlign w:val="center"/>
+            <w:tcMar>
+              <w:top w:w="80" w:type="dxa"/>
+              <w:start w:w="120" w:type="dxa"/>
+              <w:bottom w:w="80" w:type="dxa"/>
+              <w:end w:w="120" w:type="dxa"/>
+            </w:tcMar>
+          </w:tcPr>
+          <w:p>
+            <w:pPr>
+              <w:spacing w:after="0"/>
+            </w:pPr>
+            <w:r>
+              <w:rPr>
+                <w:sz w:val="18"/>
+              </w:rPr>
               <w:t>1.200 EUR</w:t>
+            </w:r>
+          </w:p>
+        </w:tc>
+      </w:tr>
+      <w:tr>
+        <w:tc>
+          <w:tcPr>
+            <w:tcW w:type="dxa" w:w="2268"/>
+            <w:vAlign w:val="center"/>
+            <w:tcMar>
+              <w:top w:w="80" w:type="dxa"/>
+              <w:start w:w="120" w:type="dxa"/>
+              <w:bottom w:w="80" w:type="dxa"/>
+              <w:end w:w="120" w:type="dxa"/>
+            </w:tcMar>
+          </w:tcPr>
+          <w:p>
+            <w:pPr>
+              <w:spacing w:after="0"/>
+            </w:pPr>
+            <w:r>
+              <w:rPr>
+                <w:sz w:val="18"/>
+              </w:rPr>
+              <w:t>Coste operativo por informe</w:t>
+            </w:r>
+          </w:p>
+        </w:tc>
+        <w:tc>
+          <w:tcPr>
+            <w:tcW w:type="dxa" w:w="2268"/>
+            <w:vAlign w:val="center"/>
+            <w:tcMar>
+              <w:top w:w="80" w:type="dxa"/>
+              <w:start w:w="120" w:type="dxa"/>
+              <w:bottom w:w="80" w:type="dxa"/>
+              <w:end w:w="120" w:type="dxa"/>
+            </w:tcMar>
+          </w:tcPr>
+          <w:p>
+            <w:pPr>
+              <w:spacing w:after="0"/>
+            </w:pPr>
+            <w:r>
+              <w:rPr>
+                <w:sz w:val="18"/>
+              </w:rPr>
+            </w:r>
+          </w:p>
+        </w:tc>
+        <w:tc>
+          <w:tcPr>
+            <w:tcW w:type="dxa" w:w="2268"/>
+            <w:vAlign w:val="center"/>
+            <w:tcMar>
+              <w:top w:w="80" w:type="dxa"/>
+              <w:start w:w="120" w:type="dxa"/>
+              <w:bottom w:w="80" w:type="dxa"/>
+              <w:end w:w="120" w:type="dxa"/>
+            </w:tcMar>
+          </w:tcPr>
+          <w:p>
+            <w:pPr>
+              <w:spacing w:after="0"/>
+            </w:pPr>
+            <w:r>
+              <w:rPr>
+                <w:sz w:val="18"/>
+              </w:rPr>
+            </w:r>
+          </w:p>
+        </w:tc>
+        <w:tc>
+          <w:tcPr>
+            <w:tcW w:type="dxa" w:w="2268"/>
+            <w:vAlign w:val="center"/>
+            <w:tcMar>
+              <w:top w:w="80" w:type="dxa"/>
+              <w:start w:w="120" w:type="dxa"/>
+              <w:bottom w:w="80" w:type="dxa"/>
+              <w:end w:w="120" w:type="dxa"/>
+            </w:tcMar>
+          </w:tcPr>
+          <w:p>
+            <w:pPr>
+              <w:spacing w:after="0"/>
+            </w:pPr>
+            <w:r>
+              <w:rPr>
+                <w:sz w:val="18"/>
+              </w:rPr>
+              <w:t>9,00 EUR</w:t>
             </w:r>
           </w:p>
         </w:tc>
@@ -8626,7 +10676,7 @@
         <w:spacing w:after="120"/>
       </w:pPr>
       <w:r>
-        <w:t>El presupuesto corresponde al prototipo software desarrollado. No se incluyen sensores IoT ni costes cloud porque no forman parte del entregable implementado.</w:t>
+        <w:t>El presupuesto principal corresponde al prototipo software desarrollado. El coste operativo por informe se añade para explicar cómo podría venderse el servicio al cliente. No se incluyen sensores IoT ni costes cloud porque no forman parte del entregable implementado.</w:t>
       </w:r>
     </w:p>
     <w:p>
@@ -15387,7 +17437,7 @@
         <w:spacing w:after="60"/>
       </w:pPr>
       <w:r>
-        <w:t>Plantear el ROI sin inventar datos económicos no medidos.</w:t>
+        <w:t>Plantear el ROI como simulación con supuestos explícitos, sin presentarlo como ahorro real medido.</w:t>
       </w:r>
     </w:p>
     <w:p>

</xml_diff>

<commit_message>
Limpiar metadatos y redaccion documental
</commit_message>
<xml_diff>
--- a/docs/memoria_proyecto_intermodular.docx
+++ b/docs/memoria_proyecto_intermodular.docx
@@ -980,7 +980,7 @@
         <w:spacing w:after="120"/>
       </w:pPr>
       <w:r>
-        <w:t>La principal limitación actual es que el modelo de Machine Learning se ha entrenado con datos históricos y etiquetas generadas a partir del cálculo agronómico. Para una operación comercial real, el siguiente paso sería calibrar el sistema con datos reales de riego aplicado, producción y validación de campo.</w:t>
+        <w:t>La principal limitación actual es que el modelo de Machine Learning se ha entrenado con datos históricos y etiquetas calculadas a partir del criterio agronómico. Para una operación comercial real, el siguiente paso sería calibrar el sistema con datos reales de riego aplicado, producción y validación de campo.</w:t>
       </w:r>
     </w:p>
     <w:p>
@@ -11331,7 +11331,7 @@
               <w:rPr>
                 <w:sz w:val="18"/>
               </w:rPr>
-              <w:t>Resultados generados localmente.</w:t>
+              <w:t>Resultados locales de ejecución.</w:t>
             </w:r>
           </w:p>
         </w:tc>
@@ -14251,7 +14251,7 @@
         <w:spacing w:after="120"/>
       </w:pPr>
       <w:r>
-        <w:t>El modelo supera el umbral del 85 % si se interpreta la precisión como R2 en un problema de regresión. No obstante, este dato debe presentarse con rigor: el modelo aprende a reproducir el cálculo agronómico sobre el dataset generado, no una verdad de campo medida.</w:t>
+        <w:t>El modelo supera el umbral del 85 % si se interpreta la precisión como R2 en un problema de regresión. No obstante, este dato debe presentarse con rigor: el modelo aprende a reproducir el cálculo agronómico sobre el dataset construido, no una verdad de campo medida.</w:t>
       </w:r>
     </w:p>
     <w:p>

</xml_diff>